<commit_message>
Paper C MSJ: interrogative title chosen with the skill checklist, APA-style short table/figure titles with concise notes, keywords and abstract updated
Co-Authored-By: Claude Opus 5.5 <noreply@anthropic.com>
Claude-Session: https://claude.ai/code/session_011zPDaCYE4jmmpoRvPu4SUX
</commit_message>
<xml_diff>
--- a/paper2/final/MSJ/Manuscript_MSJ.docx
+++ b/paper2/final/MSJ/Manuscript_MSJ.docx
@@ -74,7 +74,7 @@
                 <w:szCs w:val="42"/>
                 <w:lang w:val="hr-HR" w:eastAsia="en-US" w:bidi="ar-SA"/>
               </w:rPr>
-              <w:t xml:space="preserve">Closing at the limit: price limits, overnight gaps and next-day returns on the Ho Chi Minh Stock Exchange</w:t>
+              <w:t xml:space="preserve">Do price limits delay price discovery? Overnight gaps after limit closes in Vietnam</w:t>
             </w:r>
           </w:p>
           <w:p>
@@ -844,7 +844,7 @@
                 <wp:positionV relativeFrom="paragraph">
                   <wp:posOffset>45085</wp:posOffset>
                 </wp:positionV>
-                <wp:extent cx="6477000" cy="3187700"/>
+                <wp:extent cx="6477000" cy="3289300"/>
                 <wp:effectExtent l="0" t="0" r="12700" b="12700"/>
                 <wp:wrapTopAndBottom/>
                 <wp:docPr id="23" name="Caixa de texto 23"/>
@@ -856,7 +856,7 @@
                       <wps:spPr>
                         <a:xfrm>
                           <a:off x="0" y="0"/>
-                          <a:ext cx="6477000" cy="3187700"/>
+                          <a:ext cx="6477000" cy="3289300"/>
                         </a:xfrm>
                         <a:prstGeom prst="rect">
                           <a:avLst/>
@@ -922,7 +922,7 @@
                                 <w:szCs w:val="20"/>
                                 <w:lang w:val="en-US"/>
                               </w:rPr>
-                              <w:t xml:space="preserve"> Daily price limits aim to cool markets but can delay price discovery. Few studies trace prices after limit closes in emerging markets, and among the studies identified by our search, none tests the limit against other candidate signals. For 347 stocks on the Ho Chi Minh Stock Exchange from August 2024 to September 2026, we run 26 tests under false discovery rate control: four price limit event tests and 22 price- and volume-based characteristics. About 2.0% of stock-days close at the upper limit and 1.4% at the lower limit. We split the next-day abnormal return into an overnight gap and an intraday return, compare limit closes with stocks that moved almost as far, and cluster standard errors by date, week, and stock. All four limit tests survived; none of the 22 lower-powered characteristic tests survived. After a ceiling close, the next-day abnormal return of 1.7% is an overnight gap of 2.2% less an intraday reversal of 0.5%, and the gap exceeds that after rises of 5% to 6.5% by 2.7 percentage points, and by 3.1 points when those stocks also closed at their daily high. After a floor close the overnight gap is −1.0%, and the size of the floor effect depends on the benchmark. The ceiling gap is positive and significant in each of the 8 calendar quarters and is present before the move of the exchange to a new trading platform in May 2025. A buyer at the next opening loses 0.7% against the market by the fifth closing. The pattern is consistent with delayed price discovery, but also with news, attention, and opening-auction overshooting; without news or order-book data, we cannot separate them.</w:t>
+                              <w:t xml:space="preserve"> Daily price limits aim to cool markets but can delay price discovery. Few studies trace prices after limit closes in emerging markets, and among the studies identified by our search, none tests the limit against other candidate signals. For 347 stocks on the Ho Chi Minh Stock Exchange from August 2024 to September 2026, we run 26 tests under false discovery rate control: four price limit event tests and 22 price- and volume-based characteristics. About 2.0% of stock-days close at the upper limit and 1.4% at the lower limit. We split the next-day abnormal return into an overnight gap and an intraday return and compare limit closes with stocks that moved almost as far. All four limit tests survived; none of the 22 lower-powered characteristic tests survived. After a ceiling close, the next-day abnormal return of 1.7% is an overnight gap of 2.2% less an intraday reversal of 0.5%, and the gap exceeds that after rises of 5% to 6.5% by 2.7 percentage points, and by 3.1 points when those stocks also closed at their daily high. After a floor close the overnight gap is −1.0%, and the size of the floor effect depends on the benchmark. The ceiling gap is positive and significant in each of the 8 calendar quarters and is present before the move of the exchange to a new trading platform in May 2025. A buyer at the next opening loses 0.7% against the market by the fifth closing. The pattern is consistent with delayed price discovery, but also with news, attention, and opening-auction overshooting; without news or order-book data, we cannot separate them. Most of the next-day effect arises in the opening auction, linking price-limit design to auction design.</w:t>
                             </w:r>
                           </w:p>
                           <w:p>
@@ -981,7 +981,7 @@
                                 <w:szCs w:val="20"/>
                                 <w:lang w:val="hr-HR"/>
                               </w:rPr>
-                              <w:t xml:space="preserve"> Market microstructure, Multiple testing, False discovery rate, Call auction, Emerging markets, Vietnam.</w:t>
+                              <w:t xml:space="preserve"> Market microstructure, Multiple testing, False discovery rate, Call auction, Emerging markets, Ho Chi Minh Stock Exchange.</w:t>
                             </w:r>
                           </w:p>
                         </w:txbxContent>
@@ -1010,7 +1010,7 @@
                 <v:stroke joinstyle="miter"/>
                 <v:path gradientshapeok="t" o:connecttype="rect"/>
               </v:shapetype>
-              <v:shape id="Caixa de texto 23" o:spid="_x0000_s1026" type="#_x0000_t202" style="position:absolute;margin-left:0;margin-top:3.55pt;width:510pt;height:251pt;z-index:251658240;visibility:visible;mso-wrap-style:square;mso-width-percent:0;mso-height-percent:0;mso-wrap-distance-left:9pt;mso-wrap-distance-top:0;mso-wrap-distance-right:9pt;mso-wrap-distance-bottom:0;mso-position-horizontal:left;mso-position-horizontal-relative:margin;mso-position-vertical:absolute;mso-position-vertical-relative:text;mso-width-percent:0;mso-height-percent:0;mso-width-relative:margin;mso-height-relative:margin;v-text-anchor:top" o:gfxdata="UEsDBBQABgAIAAAAIQC2gziS/gAAAOEBAAATAAAAW0NvbnRlbnRfVHlwZXNdLnhtbJSRQU7DMBBF 90jcwfIWJU67QAgl6YK0S0CoHGBkTxKLZGx5TGhvj5O2G0SRWNoz/78nu9wcxkFMGNg6quQqL6RA 0s5Y6ir5vt9lD1JwBDIwOMJKHpHlpr69KfdHjyxSmriSfYz+USnWPY7AufNIadK6MEJMx9ApD/oD OlTrorhX2lFEilmcO2RdNtjC5xDF9pCuTyYBB5bi6bQ4syoJ3g9WQ0ymaiLzg5KdCXlKLjvcW893 SUOqXwnz5DrgnHtJTxOsQfEKIT7DmDSUCaxw7Rqn8787ZsmRM9e2VmPeBN4uqYvTtW7jvijg9N/y JsXecLq0q+WD6m8AAAD//wMAUEsDBBQABgAIAAAAIQA4/SH/1gAAAJQBAAALAAAAX3JlbHMvLnJl bHOkkMFqwzAMhu+DvYPRfXGawxijTi+j0GvpHsDYimMaW0Yy2fr2M4PBMnrbUb/Q94l/f/hMi1qR JVI2sOt6UJgd+ZiDgffL8ekFlFSbvV0oo4EbChzGx4f9GRdb25HMsYhqlCwG5lrLq9biZkxWOiqY 22YiTra2kYMu1l1tQD30/bPm3wwYN0x18gb45AdQl1tp5j/sFB2T0FQ7R0nTNEV3j6o9feQzro1i OWA14Fm+Q8a1a8+Bvu/d/dMb2JY5uiPbhG/ktn4cqGU/er3pcvwCAAD//wMAUEsDBBQABgAIAAAA IQDIsxWdmwIAAM4FAAAOAAAAZHJzL2Uyb0RvYy54bWysVFtv0zAUfkfiP1h+Z0kvuxAtncrGENLY Jja0Z9exWwvHx9huk/LrOXaSthvwMMRLcnzu5zuX84u21mQjnFdgSjo6yikRhkOlzLKk3x6v351R 4gMzFdNgREm3wtOL2ds3540txBhWoCvhCDoxvmhsSVch2CLLPF+JmvkjsMKgUIKrWcCnW2aVYw16 r3U2zvOTrAFXWQdceI/cq05IZ8m/lIKHOym9CESXFHML6evSdxG/2eycFUvH7ErxPg32D1nUTBkM unN1xQIja6d+c1Ur7sCDDEcc6gykVFykGrCaUf6imocVsyLVguB4u4PJ/z+3/HbzYO8dCe0HaLGB EZDG+sIjM9bTSlfHP2ZKUI4QbnewiTYQjsyT6elpnqOIo2w8mkxO8IF+sr25dT58ElCTSJTUYV8S XGxz40OnOqjEaB60qq6V1ukRZ0Fcakc2DLvIOBcmjJO5XtdfoOr4OA1dWFYgG7vesc8GNmaTpip6 Srk9C6INabCSyXGeHD+Tebdc7MKfTUbH+ce+vAM1dK9NTFekqevL2kOZqLDVIupo81VIoqqE6F9r TM1IflE7aklE5DWGvf4+q9cYd3UMkcGEnXGtDLgOpuetqb4PKctOH3E+qDuSoV20/YgtoNri5Dno ltJbfq1wOm6YD/fM4RbiROFlCXf4kRqwPdBTlKzA/fwTP+rjcqCUkga3uqT+x5o5QYn+bHBt3o+m 03gG0mN6fDrGhzuULA4lZl1fAo7cCG+Y5YmM+kEPpHRQP+EBmseoKGKGY+yShoG8DN2twQPGxXye lHDxLQs35sHy6Dp2J87+Y/vEnO0XJOBu3cKw/6x4sSedbrQ0MF8HkCotUQS4Q7UHHo9GGvX+wMWr dPhOWvszPPsFAAD//wMAUEsDBBQABgAIAAAAIQDWYp9Z3wAAAAwBAAAPAAAAZHJzL2Rvd25yZXYu eG1sTI/bSsNAEIbvBd9hGcE7u0lbbEkzKVHxShCtPsA2OznY7GzIbtv49p1e6c3A8PMfvnw7uV6d aAydZ4R0loAirrztuEH4/np9WIMK0bA1vWdC+KUA2+L2JjeZ9Wf+pNMuNkpCOGQGoY1xyLQOVUvO hJkfiEWr/ehMlHdstB3NWcJdr+dJ8qid6VgaWjPQc0vVYXd0CD+trXV4eivL6n2ecr368OtDiXh/ N71s5JQbUJGm+OeAK4Psh0KG7f2RbVA9gtBEhFUK6iom0ghqj7BYLlLQRa7/QxQXAAAA//8DAFBL AQItABQABgAIAAAAIQC2gziS/gAAAOEBAAATAAAAAAAAAAAAAAAAAAAAAABbQ29udGVudF9UeXBl c10ueG1sUEsBAi0AFAAGAAgAAAAhADj9If/WAAAAlAEAAAsAAAAAAAAAAAAAAAAALwEAAF9yZWxz Ly5yZWxzUEsBAi0AFAAGAAgAAAAhAMizFZ2bAgAAzgUAAA4AAAAAAAAAAAAAAAAALgIAAGRycy9l Mm9Eb2MueG1sUEsBAi0AFAAGAAgAAAAhANZin1nfAAAADAEAAA8AAAAAAAAAAAAAAAAA9QQAAGRy cy9kb3ducmV2LnhtbFBLBQYAAAAABAAEAPMAAAABBgAAAAA= " fillcolor="#f2dbdb [661]" strokecolor="#83150e" strokeweight=".5pt">
+              <v:shape id="Caixa de texto 23" o:spid="_x0000_s1026" type="#_x0000_t202" style="position:absolute;margin-left:0;margin-top:3.55pt;width:510pt;height:259pt;z-index:251658240;visibility:visible;mso-wrap-style:square;mso-width-percent:0;mso-height-percent:0;mso-wrap-distance-left:9pt;mso-wrap-distance-top:0;mso-wrap-distance-right:9pt;mso-wrap-distance-bottom:0;mso-position-horizontal:left;mso-position-horizontal-relative:margin;mso-position-vertical:absolute;mso-position-vertical-relative:text;mso-width-percent:0;mso-height-percent:0;mso-width-relative:margin;mso-height-relative:margin;v-text-anchor:top" o:gfxdata="UEsDBBQABgAIAAAAIQC2gziS/gAAAOEBAAATAAAAW0NvbnRlbnRfVHlwZXNdLnhtbJSRQU7DMBBF 90jcwfIWJU67QAgl6YK0S0CoHGBkTxKLZGx5TGhvj5O2G0SRWNoz/78nu9wcxkFMGNg6quQqL6RA 0s5Y6ir5vt9lD1JwBDIwOMJKHpHlpr69KfdHjyxSmriSfYz+USnWPY7AufNIadK6MEJMx9ApD/oD OlTrorhX2lFEilmcO2RdNtjC5xDF9pCuTyYBB5bi6bQ4syoJ3g9WQ0ymaiLzg5KdCXlKLjvcW893 SUOqXwnz5DrgnHtJTxOsQfEKIT7DmDSUCaxw7Rqn8787ZsmRM9e2VmPeBN4uqYvTtW7jvijg9N/y JsXecLq0q+WD6m8AAAD//wMAUEsDBBQABgAIAAAAIQA4/SH/1gAAAJQBAAALAAAAX3JlbHMvLnJl bHOkkMFqwzAMhu+DvYPRfXGawxijTi+j0GvpHsDYimMaW0Yy2fr2M4PBMnrbUb/Q94l/f/hMi1qR JVI2sOt6UJgd+ZiDgffL8ekFlFSbvV0oo4EbChzGx4f9GRdb25HMsYhqlCwG5lrLq9biZkxWOiqY 22YiTra2kYMu1l1tQD30/bPm3wwYN0x18gb45AdQl1tp5j/sFB2T0FQ7R0nTNEV3j6o9feQzro1i OWA14Fm+Q8a1a8+Bvu/d/dMb2JY5uiPbhG/ktn4cqGU/er3pcvwCAAD//wMAUEsDBBQABgAIAAAA IQDIsxWdmwIAAM4FAAAOAAAAZHJzL2Uyb0RvYy54bWysVFtv0zAUfkfiP1h+Z0kvuxAtncrGENLY Jja0Z9exWwvHx9huk/LrOXaSthvwMMRLcnzu5zuX84u21mQjnFdgSjo6yikRhkOlzLKk3x6v351R 4gMzFdNgREm3wtOL2ds3540txBhWoCvhCDoxvmhsSVch2CLLPF+JmvkjsMKgUIKrWcCnW2aVYw16 r3U2zvOTrAFXWQdceI/cq05IZ8m/lIKHOym9CESXFHML6evSdxG/2eycFUvH7ErxPg32D1nUTBkM unN1xQIja6d+c1Ur7sCDDEcc6gykVFykGrCaUf6imocVsyLVguB4u4PJ/z+3/HbzYO8dCe0HaLGB EZDG+sIjM9bTSlfHP2ZKUI4QbnewiTYQjsyT6elpnqOIo2w8mkxO8IF+sr25dT58ElCTSJTUYV8S XGxz40OnOqjEaB60qq6V1ukRZ0Fcakc2DLvIOBcmjJO5XtdfoOr4OA1dWFYgG7vesc8GNmaTpip6 Srk9C6INabCSyXGeHD+Tebdc7MKfTUbH+ce+vAM1dK9NTFekqevL2kOZqLDVIupo81VIoqqE6F9r TM1IflE7aklE5DWGvf4+q9cYd3UMkcGEnXGtDLgOpuetqb4PKctOH3E+qDuSoV20/YgtoNri5Dno ltJbfq1wOm6YD/fM4RbiROFlCXf4kRqwPdBTlKzA/fwTP+rjcqCUkga3uqT+x5o5QYn+bHBt3o+m 03gG0mN6fDrGhzuULA4lZl1fAo7cCG+Y5YmM+kEPpHRQP+EBmseoKGKGY+yShoG8DN2twQPGxXye lHDxLQs35sHy6Dp2J87+Y/vEnO0XJOBu3cKw/6x4sSedbrQ0MF8HkCotUQS4Q7UHHo9GGvX+wMWr dPhOWvszPPsFAAD//wMAUEsDBBQABgAIAAAAIQDWYp9Z3wAAAAwBAAAPAAAAZHJzL2Rvd25yZXYu eG1sTI/bSsNAEIbvBd9hGcE7u0lbbEkzKVHxShCtPsA2OznY7GzIbtv49p1e6c3A8PMfvnw7uV6d aAydZ4R0loAirrztuEH4/np9WIMK0bA1vWdC+KUA2+L2JjeZ9Wf+pNMuNkpCOGQGoY1xyLQOVUvO hJkfiEWr/ehMlHdstB3NWcJdr+dJ8qid6VgaWjPQc0vVYXd0CD+trXV4eivL6n2ecr368OtDiXh/ N71s5JQbUJGm+OeAK4Psh0KG7f2RbVA9gtBEhFUK6iom0ghqj7BYLlLQRa7/QxQXAAAA//8DAFBL AQItABQABgAIAAAAIQC2gziS/gAAAOEBAAATAAAAAAAAAAAAAAAAAAAAAABbQ29udGVudF9UeXBl c10ueG1sUEsBAi0AFAAGAAgAAAAhADj9If/WAAAAlAEAAAsAAAAAAAAAAAAAAAAALwEAAF9yZWxz Ly5yZWxzUEsBAi0AFAAGAAgAAAAhAMizFZ2bAgAAzgUAAA4AAAAAAAAAAAAAAAAALgIAAGRycy9l Mm9Eb2MueG1sUEsBAi0AFAAGAAgAAAAhANZin1nfAAAADAEAAA8AAAAAAAAAAAAAAAAA9QQAAGRy cy9kb3ducmV2LnhtbFBLBQYAAAAABAAEAPMAAAABBgAAAAA= " fillcolor="#f2dbdb [661]" strokecolor="#83150e" strokeweight=".5pt">
                 <v:textbox>
                   <w:txbxContent>
                     <w:p>
@@ -1045,7 +1045,7 @@
                           <w:szCs w:val="20"/>
                           <w:lang w:val="en-US"/>
                         </w:rPr>
-                        <w:t xml:space="preserve"> Daily price limits aim to cool markets but can delay price discovery. Few studies trace prices after limit closes in emerging markets, and among the studies identified by our search, none tests the limit against other candidate signals. For 347 stocks on the Ho Chi Minh Stock Exchange from August 2024 to September 2026, we run 26 tests under false discovery rate control: four price limit event tests and 22 price- and volume-based characteristics. About 2.0% of stock-days close at the upper limit and 1.4% at the lower limit. We split the next-day abnormal return into an overnight gap and an intraday return, compare limit closes with stocks that moved almost as far, and cluster standard errors by date, week, and stock. All four limit tests survived; none of the 22 lower-powered characteristic tests survived. After a ceiling close, the next-day abnormal return of 1.7% is an overnight gap of 2.2% less an intraday reversal of 0.5%, and the gap exceeds that after rises of 5% to 6.5% by 2.7 percentage points, and by 3.1 points when those stocks also closed at their daily high. After a floor close the overnight gap is −1.0%, and the size of the floor effect depends on the benchmark. The ceiling gap is positive and significant in each of the 8 calendar quarters and is present before the move of the exchange to a new trading platform in May 2025. A buyer at the next opening loses 0.7% against the market by the fifth closing. The pattern is consistent with delayed price discovery, but also with news, attention, and opening-auction overshooting; without news or order-book data, we cannot separate them.</w:t>
+                        <w:t xml:space="preserve"> Daily price limits aim to cool markets but can delay price discovery. Few studies trace prices after limit closes in emerging markets, and among the studies identified by our search, none tests the limit against other candidate signals. For 347 stocks on the Ho Chi Minh Stock Exchange from August 2024 to September 2026, we run 26 tests under false discovery rate control: four price limit event tests and 22 price- and volume-based characteristics. About 2.0% of stock-days close at the upper limit and 1.4% at the lower limit. We split the next-day abnormal return into an overnight gap and an intraday return and compare limit closes with stocks that moved almost as far. All four limit tests survived; none of the 22 lower-powered characteristic tests survived. After a ceiling close, the next-day abnormal return of 1.7% is an overnight gap of 2.2% less an intraday reversal of 0.5%, and the gap exceeds that after rises of 5% to 6.5% by 2.7 percentage points, and by 3.1 points when those stocks also closed at their daily high. After a floor close the overnight gap is −1.0%, and the size of the floor effect depends on the benchmark. The ceiling gap is positive and significant in each of the 8 calendar quarters and is present before the move of the exchange to a new trading platform in May 2025. A buyer at the next opening loses 0.7% against the market by the fifth closing. The pattern is consistent with delayed price discovery, but also with news, attention, and opening-auction overshooting; without news or order-book data, we cannot separate them. Most of the next-day effect arises in the opening auction, linking price-limit design to auction design.</w:t>
                       </w:r>
                     </w:p>
                     <w:p>
@@ -1104,7 +1104,7 @@
                           <w:szCs w:val="20"/>
                           <w:lang w:val="hr-HR"/>
                         </w:rPr>
-                        <w:t xml:space="preserve"> Market microstructure, Multiple testing, False discovery rate, Call auction, Emerging markets, Vietnam.</w:t>
+                        <w:t xml:space="preserve"> Market microstructure, Multiple testing, False discovery rate, Call auction, Emerging markets, Ho Chi Minh Stock Exchange.</w:t>
                       </w:r>
                     </w:p>
                   </w:txbxContent>
@@ -17144,7 +17144,7 @@
           <w:bdr w:val="nil"/>
           <w:lang w:val="hr-HR" w:eastAsia="es-MX"/>
         </w:rPr>
-        <w:t xml:space="preserve"> </w:t>
+        <w:t xml:space="preserve"> Fama–MacBeth</w:t>
       </w:r>
       <w:r>
         <w:rPr>
@@ -17178,87 +17178,7 @@
           <w:bdr w:val="nil"/>
           <w:lang w:val="hr-HR" w:eastAsia="es-MX"/>
         </w:rPr>
-        <w:t xml:space="preserve">-statistics of the Fama and MacBeth regressions for the 22 characteristics in the full sample, the discovery half (first 39 weeks), and the confirmation half, ordered by absolute full-sample</w:t>
-      </w:r>
-      <w:r>
-        <w:rPr>
-          <w:rFonts w:asciiTheme="minorHAnsi" w:eastAsia="Georgia" w:hAnsiTheme="minorHAnsi" w:cstheme="minorHAnsi"/>
-          <w:color w:val="000000"/>
-          <w:sz w:val="18"/>
-          <w:szCs w:val="18"/>
-          <w:bdr w:val="nil"/>
-          <w:lang w:val="hr-HR" w:eastAsia="es-MX"/>
-        </w:rPr>
-        <w:t xml:space="preserve"> </w:t>
-      </w:r>
-      <w:r>
-        <w:rPr>
-          <w:rFonts w:asciiTheme="minorHAnsi" w:eastAsia="Georgia" w:hAnsiTheme="minorHAnsi" w:cstheme="minorHAnsi"/>
-          <w:i/>
-          <w:color w:val="000000"/>
-          <w:sz w:val="18"/>
-          <w:szCs w:val="18"/>
-          <w:bdr w:val="nil"/>
-          <w:lang w:val="hr-HR" w:eastAsia="es-MX"/>
-        </w:rPr>
-        <w:t xml:space="preserve">t</w:t>
-      </w:r>
-      <w:r>
-        <w:rPr>
-          <w:rFonts w:asciiTheme="minorHAnsi" w:eastAsia="Georgia" w:hAnsiTheme="minorHAnsi" w:cstheme="minorHAnsi"/>
-          <w:color w:val="000000"/>
-          <w:sz w:val="18"/>
-          <w:szCs w:val="18"/>
-          <w:bdr w:val="nil"/>
-          <w:lang w:val="hr-HR" w:eastAsia="es-MX"/>
-        </w:rPr>
-        <w:t xml:space="preserve">. Supplementary Material S1 defines the labels. Dashed lines mark |</w:t>
-      </w:r>
-      <w:r>
-        <w:rPr>
-          <w:rFonts w:asciiTheme="minorHAnsi" w:eastAsia="Georgia" w:hAnsiTheme="minorHAnsi" w:cstheme="minorHAnsi"/>
-          <w:i/>
-          <w:color w:val="000000"/>
-          <w:sz w:val="18"/>
-          <w:szCs w:val="18"/>
-          <w:bdr w:val="nil"/>
-          <w:lang w:val="hr-HR" w:eastAsia="es-MX"/>
-        </w:rPr>
-        <w:t xml:space="preserve">t</w:t>
-      </w:r>
-      <w:r>
-        <w:rPr>
-          <w:rFonts w:asciiTheme="minorHAnsi" w:eastAsia="Georgia" w:hAnsiTheme="minorHAnsi" w:cstheme="minorHAnsi"/>
-          <w:color w:val="000000"/>
-          <w:sz w:val="18"/>
-          <w:szCs w:val="18"/>
-          <w:bdr w:val="nil"/>
-          <w:lang w:val="hr-HR" w:eastAsia="es-MX"/>
-        </w:rPr>
-        <w:t xml:space="preserve">| = 1.96 and dotted lines |</w:t>
-      </w:r>
-      <w:r>
-        <w:rPr>
-          <w:rFonts w:asciiTheme="minorHAnsi" w:eastAsia="Georgia" w:hAnsiTheme="minorHAnsi" w:cstheme="minorHAnsi"/>
-          <w:i/>
-          <w:color w:val="000000"/>
-          <w:sz w:val="18"/>
-          <w:szCs w:val="18"/>
-          <w:bdr w:val="nil"/>
-          <w:lang w:val="hr-HR" w:eastAsia="es-MX"/>
-        </w:rPr>
-        <w:t xml:space="preserve">t</w:t>
-      </w:r>
-      <w:r>
-        <w:rPr>
-          <w:rFonts w:asciiTheme="minorHAnsi" w:eastAsia="Georgia" w:hAnsiTheme="minorHAnsi" w:cstheme="minorHAnsi"/>
-          <w:color w:val="000000"/>
-          <w:sz w:val="18"/>
-          <w:szCs w:val="18"/>
-          <w:bdr w:val="nil"/>
-          <w:lang w:val="hr-HR" w:eastAsia="es-MX"/>
-        </w:rPr>
-        <w:t xml:space="preserve">| = 3.</w:t>
+        <w:t xml:space="preserve">-statistics of the 22 characteristics</w:t>
       </w:r>
     </w:p>
     <w:p>
@@ -17280,6 +17200,161 @@
           <w:lang w:val="hr-HR" w:eastAsia="es-MX"/>
         </w:rPr>
       </w:pPr>
+    </w:p>
+    <w:p>
+      <w:pPr>
+        <w:autoSpaceDE w:val="0"/>
+        <w:autoSpaceDN w:val="0"/>
+        <w:adjustRightInd w:val="0"/>
+        <w:spacing w:after="0"/>
+        <w:jc w:val="both"/>
+        <w:rPr>
+          <w:rFonts w:asciiTheme="minorHAnsi" w:eastAsia="Georgia" w:hAnsiTheme="minorHAnsi" w:cstheme="minorHAnsi"/>
+          <w:bCs/>
+          <w:color w:val="000000"/>
+          <w:sz w:val="18"/>
+          <w:szCs w:val="18"/>
+          <w:u w:color="000000"/>
+          <w:bdr w:val="nil"/>
+          <w:lang w:val="hr-HR" w:eastAsia="es-MX"/>
+        </w:rPr>
+      </w:pPr>
+      <w:r>
+        <w:rPr>
+          <w:rFonts w:asciiTheme="minorHAnsi" w:eastAsia="Georgia" w:hAnsiTheme="minorHAnsi" w:cstheme="minorHAnsi"/>
+          <w:color w:val="000000"/>
+          <w:sz w:val="18"/>
+          <w:szCs w:val="18"/>
+          <w:bdr w:val="nil"/>
+          <w:lang w:val="hr-HR" w:eastAsia="es-MX"/>
+        </w:rPr>
+        <w:t xml:space="preserve"/>
+      </w:r>
+      <w:r>
+        <w:rPr>
+          <w:rFonts w:asciiTheme="minorHAnsi" w:eastAsia="Georgia" w:hAnsiTheme="minorHAnsi" w:cstheme="minorHAnsi"/>
+          <w:color w:val="000000"/>
+          <w:sz w:val="18"/>
+          <w:szCs w:val="18"/>
+          <w:bdr w:val="nil"/>
+          <w:lang w:val="hr-HR" w:eastAsia="es-MX"/>
+        </w:rPr>
+        <w:t xml:space="preserve"> </w:t>
+      </w:r>
+      <w:r>
+        <w:rPr>
+          <w:rFonts w:asciiTheme="minorHAnsi" w:eastAsia="Georgia" w:hAnsiTheme="minorHAnsi" w:cstheme="minorHAnsi"/>
+          <w:i/>
+          <w:color w:val="000000"/>
+          <w:sz w:val="18"/>
+          <w:szCs w:val="18"/>
+          <w:bdr w:val="nil"/>
+          <w:lang w:val="hr-HR" w:eastAsia="es-MX"/>
+        </w:rPr>
+        <w:t xml:space="preserve">Note.</w:t>
+      </w:r>
+      <w:r>
+        <w:rPr>
+          <w:rFonts w:asciiTheme="minorHAnsi" w:eastAsia="Georgia" w:hAnsiTheme="minorHAnsi" w:cstheme="minorHAnsi"/>
+          <w:color w:val="000000"/>
+          <w:sz w:val="18"/>
+          <w:szCs w:val="18"/>
+          <w:bdr w:val="nil"/>
+          <w:lang w:val="hr-HR" w:eastAsia="es-MX"/>
+        </w:rPr>
+        <w:t xml:space="preserve"> </w:t>
+      </w:r>
+      <w:r>
+        <w:rPr>
+          <w:rFonts w:asciiTheme="minorHAnsi" w:eastAsia="Georgia" w:hAnsiTheme="minorHAnsi" w:cstheme="minorHAnsi"/>
+          <w:color w:val="000000"/>
+          <w:sz w:val="18"/>
+          <w:szCs w:val="18"/>
+          <w:bdr w:val="nil"/>
+          <w:lang w:val="hr-HR" w:eastAsia="es-MX"/>
+        </w:rPr>
+        <w:t xml:space="preserve">Full sample, discovery half (first 39 weeks), and confirmation half, ordered by absolute full-sample</w:t>
+      </w:r>
+      <w:r>
+        <w:rPr>
+          <w:rFonts w:asciiTheme="minorHAnsi" w:eastAsia="Georgia" w:hAnsiTheme="minorHAnsi" w:cstheme="minorHAnsi"/>
+          <w:color w:val="000000"/>
+          <w:sz w:val="18"/>
+          <w:szCs w:val="18"/>
+          <w:bdr w:val="nil"/>
+          <w:lang w:val="hr-HR" w:eastAsia="es-MX"/>
+        </w:rPr>
+        <w:t xml:space="preserve"> </w:t>
+      </w:r>
+      <w:r>
+        <w:rPr>
+          <w:rFonts w:asciiTheme="minorHAnsi" w:eastAsia="Georgia" w:hAnsiTheme="minorHAnsi" w:cstheme="minorHAnsi"/>
+          <w:i/>
+          <w:color w:val="000000"/>
+          <w:sz w:val="18"/>
+          <w:szCs w:val="18"/>
+          <w:bdr w:val="nil"/>
+          <w:lang w:val="hr-HR" w:eastAsia="es-MX"/>
+        </w:rPr>
+        <w:t xml:space="preserve">t</w:t>
+      </w:r>
+      <w:r>
+        <w:rPr>
+          <w:rFonts w:asciiTheme="minorHAnsi" w:eastAsia="Georgia" w:hAnsiTheme="minorHAnsi" w:cstheme="minorHAnsi"/>
+          <w:color w:val="000000"/>
+          <w:sz w:val="18"/>
+          <w:szCs w:val="18"/>
+          <w:bdr w:val="nil"/>
+          <w:lang w:val="hr-HR" w:eastAsia="es-MX"/>
+        </w:rPr>
+        <w:t xml:space="preserve">. Dashed lines mark |</w:t>
+      </w:r>
+      <w:r>
+        <w:rPr>
+          <w:rFonts w:asciiTheme="minorHAnsi" w:eastAsia="Georgia" w:hAnsiTheme="minorHAnsi" w:cstheme="minorHAnsi"/>
+          <w:i/>
+          <w:color w:val="000000"/>
+          <w:sz w:val="18"/>
+          <w:szCs w:val="18"/>
+          <w:bdr w:val="nil"/>
+          <w:lang w:val="hr-HR" w:eastAsia="es-MX"/>
+        </w:rPr>
+        <w:t xml:space="preserve">t</w:t>
+      </w:r>
+      <w:r>
+        <w:rPr>
+          <w:rFonts w:asciiTheme="minorHAnsi" w:eastAsia="Georgia" w:hAnsiTheme="minorHAnsi" w:cstheme="minorHAnsi"/>
+          <w:color w:val="000000"/>
+          <w:sz w:val="18"/>
+          <w:szCs w:val="18"/>
+          <w:bdr w:val="nil"/>
+          <w:lang w:val="hr-HR" w:eastAsia="es-MX"/>
+        </w:rPr>
+        <w:t xml:space="preserve">| = 1.96 and dotted lines |</w:t>
+      </w:r>
+      <w:r>
+        <w:rPr>
+          <w:rFonts w:asciiTheme="minorHAnsi" w:eastAsia="Georgia" w:hAnsiTheme="minorHAnsi" w:cstheme="minorHAnsi"/>
+          <w:i/>
+          <w:color w:val="000000"/>
+          <w:sz w:val="18"/>
+          <w:szCs w:val="18"/>
+          <w:bdr w:val="nil"/>
+          <w:lang w:val="hr-HR" w:eastAsia="es-MX"/>
+        </w:rPr>
+        <w:t xml:space="preserve">t</w:t>
+      </w:r>
+      <w:r>
+        <w:rPr>
+          <w:rFonts w:asciiTheme="minorHAnsi" w:eastAsia="Georgia" w:hAnsiTheme="minorHAnsi" w:cstheme="minorHAnsi"/>
+          <w:color w:val="000000"/>
+          <w:sz w:val="18"/>
+          <w:szCs w:val="18"/>
+          <w:bdr w:val="nil"/>
+          <w:lang w:val="hr-HR" w:eastAsia="es-MX"/>
+        </w:rPr>
+        <w:t xml:space="preserve">| = 3. Supplementary Material S1 defines the labels.</w:t>
+      </w:r>
     </w:p>
     <w:p>
       <w:pPr>
@@ -17375,7 +17450,7 @@
           <w:bdr w:val="nil"/>
           <w:lang w:val="hr-HR" w:eastAsia="es-MX"/>
         </w:rPr>
-        <w:t xml:space="preserve"> Next-day abnormal return (overnight gap, intraday, and close-to-close) by the size of the day-</w:t>
+        <w:t xml:space="preserve"> Next-day abnormal return by the size of the day-</w:t>
       </w:r>
       <w:r>
         <w:rPr>
@@ -17409,41 +17484,7 @@
           <w:bdr w:val="nil"/>
           <w:lang w:val="hr-HR" w:eastAsia="es-MX"/>
         </w:rPr>
-        <w:t xml:space="preserve">move. Circles are 1-percentage-point bins inside the band, triangles are ceiling and floor events, and squares are other moves of 6.5% to 10% in absolute value. Bars show 95% confidence intervals clustered by date (normal reference, no small-sample factor). Market weights are lagged to day</w:t>
-      </w:r>
-      <w:r>
-        <w:rPr>
-          <w:rFonts w:asciiTheme="minorHAnsi" w:eastAsia="Georgia" w:hAnsiTheme="minorHAnsi" w:cstheme="minorHAnsi"/>
-          <w:color w:val="000000"/>
-          <w:sz w:val="18"/>
-          <w:szCs w:val="18"/>
-          <w:bdr w:val="nil"/>
-          <w:lang w:val="hr-HR" w:eastAsia="es-MX"/>
-        </w:rPr>
-        <w:t xml:space="preserve"> </w:t>
-      </w:r>
-      <w:r>
-        <w:rPr>
-          <w:rFonts w:asciiTheme="minorHAnsi" w:eastAsia="Georgia" w:hAnsiTheme="minorHAnsi" w:cstheme="minorHAnsi"/>
-          <w:i/>
-          <w:color w:val="000000"/>
-          <w:sz w:val="18"/>
-          <w:szCs w:val="18"/>
-          <w:bdr w:val="nil"/>
-          <w:lang w:val="hr-HR" w:eastAsia="es-MX"/>
-        </w:rPr>
-        <w:t xml:space="preserve">d</w:t>
-      </w:r>
-      <w:r>
-        <w:rPr>
-          <w:rFonts w:asciiTheme="minorHAnsi" w:eastAsia="Georgia" w:hAnsiTheme="minorHAnsi" w:cstheme="minorHAnsi"/>
-          <w:color w:val="000000"/>
-          <w:sz w:val="18"/>
-          <w:szCs w:val="18"/>
-          <w:bdr w:val="nil"/>
-          <w:lang w:val="hr-HR" w:eastAsia="es-MX"/>
-        </w:rPr>
-        <w:t xml:space="preserve">; the figure uses event days up to the second-to-last trading day.</w:t>
+        <w:t xml:space="preserve">move</w:t>
       </w:r>
     </w:p>
     <w:p>
@@ -17465,6 +17506,115 @@
           <w:lang w:val="hr-HR" w:eastAsia="es-MX"/>
         </w:rPr>
       </w:pPr>
+    </w:p>
+    <w:p>
+      <w:pPr>
+        <w:autoSpaceDE w:val="0"/>
+        <w:autoSpaceDN w:val="0"/>
+        <w:adjustRightInd w:val="0"/>
+        <w:spacing w:after="0"/>
+        <w:jc w:val="both"/>
+        <w:rPr>
+          <w:rFonts w:asciiTheme="minorHAnsi" w:eastAsia="Georgia" w:hAnsiTheme="minorHAnsi" w:cstheme="minorHAnsi"/>
+          <w:bCs/>
+          <w:color w:val="000000"/>
+          <w:sz w:val="18"/>
+          <w:szCs w:val="18"/>
+          <w:u w:color="000000"/>
+          <w:bdr w:val="nil"/>
+          <w:lang w:val="hr-HR" w:eastAsia="es-MX"/>
+        </w:rPr>
+      </w:pPr>
+      <w:r>
+        <w:rPr>
+          <w:rFonts w:asciiTheme="minorHAnsi" w:eastAsia="Georgia" w:hAnsiTheme="minorHAnsi" w:cstheme="minorHAnsi"/>
+          <w:color w:val="000000"/>
+          <w:sz w:val="18"/>
+          <w:szCs w:val="18"/>
+          <w:bdr w:val="nil"/>
+          <w:lang w:val="hr-HR" w:eastAsia="es-MX"/>
+        </w:rPr>
+        <w:t xml:space="preserve"/>
+      </w:r>
+      <w:r>
+        <w:rPr>
+          <w:rFonts w:asciiTheme="minorHAnsi" w:eastAsia="Georgia" w:hAnsiTheme="minorHAnsi" w:cstheme="minorHAnsi"/>
+          <w:color w:val="000000"/>
+          <w:sz w:val="18"/>
+          <w:szCs w:val="18"/>
+          <w:bdr w:val="nil"/>
+          <w:lang w:val="hr-HR" w:eastAsia="es-MX"/>
+        </w:rPr>
+        <w:t xml:space="preserve"> </w:t>
+      </w:r>
+      <w:r>
+        <w:rPr>
+          <w:rFonts w:asciiTheme="minorHAnsi" w:eastAsia="Georgia" w:hAnsiTheme="minorHAnsi" w:cstheme="minorHAnsi"/>
+          <w:i/>
+          <w:color w:val="000000"/>
+          <w:sz w:val="18"/>
+          <w:szCs w:val="18"/>
+          <w:bdr w:val="nil"/>
+          <w:lang w:val="hr-HR" w:eastAsia="es-MX"/>
+        </w:rPr>
+        <w:t xml:space="preserve">Note.</w:t>
+      </w:r>
+      <w:r>
+        <w:rPr>
+          <w:rFonts w:asciiTheme="minorHAnsi" w:eastAsia="Georgia" w:hAnsiTheme="minorHAnsi" w:cstheme="minorHAnsi"/>
+          <w:color w:val="000000"/>
+          <w:sz w:val="18"/>
+          <w:szCs w:val="18"/>
+          <w:bdr w:val="nil"/>
+          <w:lang w:val="hr-HR" w:eastAsia="es-MX"/>
+        </w:rPr>
+        <w:t xml:space="preserve"> </w:t>
+      </w:r>
+      <w:r>
+        <w:rPr>
+          <w:rFonts w:asciiTheme="minorHAnsi" w:eastAsia="Georgia" w:hAnsiTheme="minorHAnsi" w:cstheme="minorHAnsi"/>
+          <w:color w:val="000000"/>
+          <w:sz w:val="18"/>
+          <w:szCs w:val="18"/>
+          <w:bdr w:val="nil"/>
+          <w:lang w:val="hr-HR" w:eastAsia="es-MX"/>
+        </w:rPr>
+        <w:t xml:space="preserve">Circles are 1-point bins inside the band, triangles are ceiling and floor events, and squares are other moves of 6.5% to 10%. Bars are 95% confidence intervals clustered by date. Market weights are lagged to day</w:t>
+      </w:r>
+      <w:r>
+        <w:rPr>
+          <w:rFonts w:asciiTheme="minorHAnsi" w:eastAsia="Georgia" w:hAnsiTheme="minorHAnsi" w:cstheme="minorHAnsi"/>
+          <w:color w:val="000000"/>
+          <w:sz w:val="18"/>
+          <w:szCs w:val="18"/>
+          <w:bdr w:val="nil"/>
+          <w:lang w:val="hr-HR" w:eastAsia="es-MX"/>
+        </w:rPr>
+        <w:t xml:space="preserve"> </w:t>
+      </w:r>
+      <w:r>
+        <w:rPr>
+          <w:rFonts w:asciiTheme="minorHAnsi" w:eastAsia="Georgia" w:hAnsiTheme="minorHAnsi" w:cstheme="minorHAnsi"/>
+          <w:i/>
+          <w:color w:val="000000"/>
+          <w:sz w:val="18"/>
+          <w:szCs w:val="18"/>
+          <w:bdr w:val="nil"/>
+          <w:lang w:val="hr-HR" w:eastAsia="es-MX"/>
+        </w:rPr>
+        <w:t xml:space="preserve">d</w:t>
+      </w:r>
+      <w:r>
+        <w:rPr>
+          <w:rFonts w:asciiTheme="minorHAnsi" w:eastAsia="Georgia" w:hAnsiTheme="minorHAnsi" w:cstheme="minorHAnsi"/>
+          <w:color w:val="000000"/>
+          <w:sz w:val="18"/>
+          <w:szCs w:val="18"/>
+          <w:bdr w:val="nil"/>
+          <w:lang w:val="hr-HR" w:eastAsia="es-MX"/>
+        </w:rPr>
+        <w:t xml:space="preserve">.</w:t>
+      </w:r>
     </w:p>
     <w:p>
       <w:pPr>
@@ -17528,7 +17678,7 @@
           <w:bdr w:val="nil"/>
           <w:lang w:val="hr-HR" w:eastAsia="es-MX"/>
         </w:rPr>
-        <w:t xml:space="preserve"> Market-adjusted returns (percent) after ceiling and floor closes.</w:t>
+        <w:t xml:space="preserve"> Market-adjusted returns after ceiling and floor closes</w:t>
       </w:r>
     </w:p>
     <w:tbl>
@@ -19078,7 +19228,7 @@
           <w:bdr w:val="nil"/>
           <w:lang w:val="hr-HR" w:eastAsia="es-MX"/>
         </w:rPr>
-        <w:t xml:space="preserve">t</w:t>
+        <w:t xml:space="preserve">Note.</w:t>
       </w:r>
       <w:r>
         <w:rPr>
@@ -19100,7 +19250,7 @@
           <w:bdr w:val="nil"/>
           <w:lang w:val="hr-HR" w:eastAsia="es-MX"/>
         </w:rPr>
-        <w:t xml:space="preserve">(date),</w:t>
+        <w:t xml:space="preserve">Mean returns in percent.</w:t>
       </w:r>
       <w:r>
         <w:rPr>
@@ -19145,7 +19295,7 @@
           <w:bdr w:val="nil"/>
           <w:lang w:val="hr-HR" w:eastAsia="es-MX"/>
         </w:rPr>
-        <w:t xml:space="preserve">(week), and</w:t>
+        <w:t xml:space="preserve">(date),</w:t>
       </w:r>
       <w:r>
         <w:rPr>
@@ -19190,7 +19340,7 @@
           <w:bdr w:val="nil"/>
           <w:lang w:val="hr-HR" w:eastAsia="es-MX"/>
         </w:rPr>
-        <w:t xml:space="preserve">(10-day) cluster by event date, calendar week, and 10-day block, with the factor</w:t>
+        <w:t xml:space="preserve">(week), and</w:t>
       </w:r>
       <w:r>
         <w:rPr>
@@ -19213,7 +19363,7 @@
           <w:bdr w:val="nil"/>
           <w:lang w:val="hr-HR" w:eastAsia="es-MX"/>
         </w:rPr>
-        <w:t xml:space="preserve">G</w:t>
+        <w:t xml:space="preserve">t</w:t>
       </w:r>
       <w:r>
         <w:rPr>
@@ -19224,19 +19374,18 @@
           <w:bdr w:val="nil"/>
           <w:lang w:val="hr-HR" w:eastAsia="es-MX"/>
         </w:rPr>
-        <w:t xml:space="preserve">/(</w:t>
-      </w:r>
-      <w:r>
-        <w:rPr>
-          <w:rFonts w:asciiTheme="minorHAnsi" w:eastAsia="Georgia" w:hAnsiTheme="minorHAnsi" w:cstheme="minorHAnsi"/>
-          <w:i/>
+        <w:t xml:space="preserve"> </w:t>
+      </w:r>
+      <w:r>
+        <w:rPr>
+          <w:rFonts w:asciiTheme="minorHAnsi" w:eastAsia="Georgia" w:hAnsiTheme="minorHAnsi" w:cstheme="minorHAnsi"/>
           <w:color w:val="000000"/>
           <w:sz w:val="18"/>
           <w:szCs w:val="18"/>
           <w:bdr w:val="nil"/>
           <w:lang w:val="hr-HR" w:eastAsia="es-MX"/>
         </w:rPr>
-        <w:t xml:space="preserve">G</w:t>
+        <w:t xml:space="preserve">(10-day) cluster by event date, calendar week, and 10-day block, with the factor</w:t>
       </w:r>
       <w:r>
         <w:rPr>
@@ -19252,13 +19401,14 @@
       <w:r>
         <w:rPr>
           <w:rFonts w:asciiTheme="minorHAnsi" w:eastAsia="Georgia" w:hAnsiTheme="minorHAnsi" w:cstheme="minorHAnsi"/>
+          <w:i/>
           <w:color w:val="000000"/>
           <w:sz w:val="18"/>
           <w:szCs w:val="18"/>
           <w:bdr w:val="nil"/>
           <w:lang w:val="hr-HR" w:eastAsia="es-MX"/>
         </w:rPr>
-        <w:t xml:space="preserve">− 1) for</w:t>
+        <w:t xml:space="preserve">G</w:t>
       </w:r>
       <w:r>
         <w:rPr>
@@ -19269,7 +19419,7 @@
           <w:bdr w:val="nil"/>
           <w:lang w:val="hr-HR" w:eastAsia="es-MX"/>
         </w:rPr>
-        <w:t xml:space="preserve"> </w:t>
+        <w:t xml:space="preserve">/(</w:t>
       </w:r>
       <w:r>
         <w:rPr>
@@ -19303,7 +19453,7 @@
           <w:bdr w:val="nil"/>
           <w:lang w:val="hr-HR" w:eastAsia="es-MX"/>
         </w:rPr>
-        <w:t xml:space="preserve">clusters and a</w:t>
+        <w:t xml:space="preserve">&lt;U+2212&gt; 1) and a</w:t>
       </w:r>
       <w:r>
         <w:rPr>
@@ -19393,7 +19543,7 @@
           <w:bdr w:val="nil"/>
           <w:lang w:val="hr-HR" w:eastAsia="es-MX"/>
         </w:rPr>
-        <w:t xml:space="preserve">− 1 degrees of freedom.</w:t>
+        <w:t xml:space="preserve">&lt;U+2212&gt; 1 degrees of freedom;</w:t>
       </w:r>
       <w:r>
         <w:rPr>
@@ -19438,75 +19588,7 @@
           <w:bdr w:val="nil"/>
           <w:lang w:val="hr-HR" w:eastAsia="es-MX"/>
         </w:rPr>
-        <w:t xml:space="preserve">(halves) gives week-clustered statistics for the first and second half of event dates. Events require complete returns for days</w:t>
-      </w:r>
-      <w:r>
-        <w:rPr>
-          <w:rFonts w:asciiTheme="minorHAnsi" w:eastAsia="Georgia" w:hAnsiTheme="minorHAnsi" w:cstheme="minorHAnsi"/>
-          <w:color w:val="000000"/>
-          <w:sz w:val="18"/>
-          <w:szCs w:val="18"/>
-          <w:bdr w:val="nil"/>
-          <w:lang w:val="hr-HR" w:eastAsia="es-MX"/>
-        </w:rPr>
-        <w:t xml:space="preserve"> </w:t>
-      </w:r>
-      <w:r>
-        <w:rPr>
-          <w:rFonts w:asciiTheme="minorHAnsi" w:eastAsia="Georgia" w:hAnsiTheme="minorHAnsi" w:cstheme="minorHAnsi"/>
-          <w:i/>
-          <w:color w:val="000000"/>
-          <w:sz w:val="18"/>
-          <w:szCs w:val="18"/>
-          <w:bdr w:val="nil"/>
-          <w:lang w:val="hr-HR" w:eastAsia="es-MX"/>
-        </w:rPr>
-        <w:t xml:space="preserve">d</w:t>
-      </w:r>
-      <w:r>
-        <w:rPr>
-          <w:rFonts w:asciiTheme="minorHAnsi" w:eastAsia="Georgia" w:hAnsiTheme="minorHAnsi" w:cstheme="minorHAnsi"/>
-          <w:color w:val="000000"/>
-          <w:sz w:val="18"/>
-          <w:szCs w:val="18"/>
-          <w:bdr w:val="nil"/>
-          <w:lang w:val="hr-HR" w:eastAsia="es-MX"/>
-        </w:rPr>
-        <w:t xml:space="preserve">+1 to</w:t>
-      </w:r>
-      <w:r>
-        <w:rPr>
-          <w:rFonts w:asciiTheme="minorHAnsi" w:eastAsia="Georgia" w:hAnsiTheme="minorHAnsi" w:cstheme="minorHAnsi"/>
-          <w:color w:val="000000"/>
-          <w:sz w:val="18"/>
-          <w:szCs w:val="18"/>
-          <w:bdr w:val="nil"/>
-          <w:lang w:val="hr-HR" w:eastAsia="es-MX"/>
-        </w:rPr>
-        <w:t xml:space="preserve"> </w:t>
-      </w:r>
-      <w:r>
-        <w:rPr>
-          <w:rFonts w:asciiTheme="minorHAnsi" w:eastAsia="Georgia" w:hAnsiTheme="minorHAnsi" w:cstheme="minorHAnsi"/>
-          <w:i/>
-          <w:color w:val="000000"/>
-          <w:sz w:val="18"/>
-          <w:szCs w:val="18"/>
-          <w:bdr w:val="nil"/>
-          <w:lang w:val="hr-HR" w:eastAsia="es-MX"/>
-        </w:rPr>
-        <w:t xml:space="preserve">d</w:t>
-      </w:r>
-      <w:r>
-        <w:rPr>
-          <w:rFonts w:asciiTheme="minorHAnsi" w:eastAsia="Georgia" w:hAnsiTheme="minorHAnsi" w:cstheme="minorHAnsi"/>
-          <w:color w:val="000000"/>
-          <w:sz w:val="18"/>
-          <w:szCs w:val="18"/>
-          <w:bdr w:val="nil"/>
-          <w:lang w:val="hr-HR" w:eastAsia="es-MX"/>
-        </w:rPr>
-        <w:t xml:space="preserve">+5.</w:t>
+        <w:t xml:space="preserve">(halves) is week-clustered for the first and second half of event dates.</w:t>
       </w:r>
     </w:p>
     <w:p>
@@ -19571,41 +19653,7 @@
           <w:bdr w:val="nil"/>
           <w:lang w:val="hr-HR" w:eastAsia="es-MX"/>
         </w:rPr>
-        <w:t xml:space="preserve"> Next-day abnormal returns (percent) by component and sample, with two-way-clustered</w:t>
-      </w:r>
-      <w:r>
-        <w:rPr>
-          <w:rFonts w:asciiTheme="minorHAnsi" w:eastAsia="Georgia" w:hAnsiTheme="minorHAnsi" w:cstheme="minorHAnsi"/>
-          <w:color w:val="000000"/>
-          <w:sz w:val="18"/>
-          <w:szCs w:val="18"/>
-          <w:bdr w:val="nil"/>
-          <w:lang w:val="hr-HR" w:eastAsia="es-MX"/>
-        </w:rPr>
-        <w:t xml:space="preserve"> </w:t>
-      </w:r>
-      <w:r>
-        <w:rPr>
-          <w:rFonts w:asciiTheme="minorHAnsi" w:eastAsia="Georgia" w:hAnsiTheme="minorHAnsi" w:cstheme="minorHAnsi"/>
-          <w:i/>
-          <w:color w:val="000000"/>
-          <w:sz w:val="18"/>
-          <w:szCs w:val="18"/>
-          <w:bdr w:val="nil"/>
-          <w:lang w:val="hr-HR" w:eastAsia="es-MX"/>
-        </w:rPr>
-        <w:t xml:space="preserve">t</w:t>
-      </w:r>
-      <w:r>
-        <w:rPr>
-          <w:rFonts w:asciiTheme="minorHAnsi" w:eastAsia="Georgia" w:hAnsiTheme="minorHAnsi" w:cstheme="minorHAnsi"/>
-          <w:color w:val="000000"/>
-          <w:sz w:val="18"/>
-          <w:szCs w:val="18"/>
-          <w:bdr w:val="nil"/>
-          <w:lang w:val="hr-HR" w:eastAsia="es-MX"/>
-        </w:rPr>
-        <w:t xml:space="preserve">-statistics in parentheses.</w:t>
+        <w:t xml:space="preserve"> Decomposition of the next-day abnormal return</w:t>
       </w:r>
     </w:p>
     <w:tbl>
@@ -22100,7 +22148,7 @@
           <w:bdr w:val="nil"/>
           <w:lang w:val="hr-HR" w:eastAsia="es-MX"/>
         </w:rPr>
-        <w:t xml:space="preserve">Benchmarks are the dollar-volume-weighted market (weights lagged to day</w:t>
+        <w:t xml:space="preserve"/>
       </w:r>
       <w:r>
         <w:rPr>
@@ -22123,7 +22171,7 @@
           <w:bdr w:val="nil"/>
           <w:lang w:val="hr-HR" w:eastAsia="es-MX"/>
         </w:rPr>
-        <w:t xml:space="preserve">d</w:t>
+        <w:t xml:space="preserve">Note.</w:t>
       </w:r>
       <w:r>
         <w:rPr>
@@ -22134,7 +22182,7 @@
           <w:bdr w:val="nil"/>
           <w:lang w:val="hr-HR" w:eastAsia="es-MX"/>
         </w:rPr>
-        <w:t xml:space="preserve">) or same-date control stocks in the same liquidity tercile (Section 2.2). Open to day</w:t>
+        <w:t xml:space="preserve"> </w:t>
       </w:r>
       <w:r>
         <w:rPr>
@@ -22145,42 +22193,41 @@
           <w:bdr w:val="nil"/>
           <w:lang w:val="hr-HR" w:eastAsia="es-MX"/>
         </w:rPr>
-        <w:t xml:space="preserve"> </w:t>
-      </w:r>
-      <w:r>
-        <w:rPr>
-          <w:rFonts w:asciiTheme="minorHAnsi" w:eastAsia="Georgia" w:hAnsiTheme="minorHAnsi" w:cstheme="minorHAnsi"/>
-          <w:i/>
+        <w:t xml:space="preserve">Percent; two-way-clustered</w:t>
+      </w:r>
+      <w:r>
+        <w:rPr>
+          <w:rFonts w:asciiTheme="minorHAnsi" w:eastAsia="Georgia" w:hAnsiTheme="minorHAnsi" w:cstheme="minorHAnsi"/>
           <w:color w:val="000000"/>
           <w:sz w:val="18"/>
           <w:szCs w:val="18"/>
           <w:bdr w:val="nil"/>
           <w:lang w:val="hr-HR" w:eastAsia="es-MX"/>
         </w:rPr>
-        <w:t xml:space="preserve">d</w:t>
-      </w:r>
-      <w:r>
-        <w:rPr>
-          <w:rFonts w:asciiTheme="minorHAnsi" w:eastAsia="Georgia" w:hAnsiTheme="minorHAnsi" w:cstheme="minorHAnsi"/>
+        <w:t xml:space="preserve"> </w:t>
+      </w:r>
+      <w:r>
+        <w:rPr>
+          <w:rFonts w:asciiTheme="minorHAnsi" w:eastAsia="Georgia" w:hAnsiTheme="minorHAnsi" w:cstheme="minorHAnsi"/>
+          <w:i/>
           <w:color w:val="000000"/>
           <w:sz w:val="18"/>
           <w:szCs w:val="18"/>
           <w:bdr w:val="nil"/>
           <w:lang w:val="hr-HR" w:eastAsia="es-MX"/>
         </w:rPr>
-        <w:t xml:space="preserve">+5 runs from the day-</w:t>
-      </w:r>
-      <w:r>
-        <w:rPr>
-          <w:rFonts w:asciiTheme="minorHAnsi" w:eastAsia="Georgia" w:hAnsiTheme="minorHAnsi" w:cstheme="minorHAnsi"/>
-          <w:i/>
+        <w:t xml:space="preserve">t</w:t>
+      </w:r>
+      <w:r>
+        <w:rPr>
+          <w:rFonts w:asciiTheme="minorHAnsi" w:eastAsia="Georgia" w:hAnsiTheme="minorHAnsi" w:cstheme="minorHAnsi"/>
           <w:color w:val="000000"/>
           <w:sz w:val="18"/>
           <w:szCs w:val="18"/>
           <w:bdr w:val="nil"/>
           <w:lang w:val="hr-HR" w:eastAsia="es-MX"/>
         </w:rPr>
-        <w:t xml:space="preserve">d</w:t>
+        <w:t xml:space="preserve">-statistics in parentheses. Benchmarks are the volume-weighted market (weights lagged to day</w:t>
       </w:r>
       <w:r>
         <w:rPr>
@@ -22191,7 +22238,7 @@
           <w:bdr w:val="nil"/>
           <w:lang w:val="hr-HR" w:eastAsia="es-MX"/>
         </w:rPr>
-        <w:t xml:space="preserve">+1 open to the day-</w:t>
+        <w:t xml:space="preserve"> </w:t>
       </w:r>
       <w:r>
         <w:rPr>
@@ -22214,7 +22261,7 @@
           <w:bdr w:val="nil"/>
           <w:lang w:val="hr-HR" w:eastAsia="es-MX"/>
         </w:rPr>
-        <w:t xml:space="preserve">+5 close. Crash days have a market return (Equation (2)) below −2%. Close-to-close need not equal the sum of the components because returns compound. Events are the stock-days that meet the event definition and have the stated return.</w:t>
+        <w:t xml:space="preserve">) or same-date controls in the same liquidity tercile. Crash days have a market return below &lt;U+2212&gt;2%. Components compound, so they need not sum.</w:t>
       </w:r>
     </w:p>
     <w:p>
@@ -22279,41 +22326,7 @@
           <w:bdr w:val="nil"/>
           <w:lang w:val="hr-HR" w:eastAsia="es-MX"/>
         </w:rPr>
-        <w:t xml:space="preserve"> Differences in next-day abnormal returns (percentage points) between limit closes and same-direction moves of 3–5% or 5–6.5% that did not close at the limit, with date-clustered</w:t>
-      </w:r>
-      <w:r>
-        <w:rPr>
-          <w:rFonts w:asciiTheme="minorHAnsi" w:eastAsia="Georgia" w:hAnsiTheme="minorHAnsi" w:cstheme="minorHAnsi"/>
-          <w:color w:val="000000"/>
-          <w:sz w:val="18"/>
-          <w:szCs w:val="18"/>
-          <w:bdr w:val="nil"/>
-          <w:lang w:val="hr-HR" w:eastAsia="es-MX"/>
-        </w:rPr>
-        <w:t xml:space="preserve"> </w:t>
-      </w:r>
-      <w:r>
-        <w:rPr>
-          <w:rFonts w:asciiTheme="minorHAnsi" w:eastAsia="Georgia" w:hAnsiTheme="minorHAnsi" w:cstheme="minorHAnsi"/>
-          <w:i/>
-          <w:color w:val="000000"/>
-          <w:sz w:val="18"/>
-          <w:szCs w:val="18"/>
-          <w:bdr w:val="nil"/>
-          <w:lang w:val="hr-HR" w:eastAsia="es-MX"/>
-        </w:rPr>
-        <w:t xml:space="preserve">t</w:t>
-      </w:r>
-      <w:r>
-        <w:rPr>
-          <w:rFonts w:asciiTheme="minorHAnsi" w:eastAsia="Georgia" w:hAnsiTheme="minorHAnsi" w:cstheme="minorHAnsi"/>
-          <w:color w:val="000000"/>
-          <w:sz w:val="18"/>
-          <w:szCs w:val="18"/>
-          <w:bdr w:val="nil"/>
-          <w:lang w:val="hr-HR" w:eastAsia="es-MX"/>
-        </w:rPr>
-        <w:t xml:space="preserve">-statistics in parentheses.</w:t>
+        <w:t xml:space="preserve"> Limit closes versus near-limit moves</w:t>
       </w:r>
     </w:p>
     <w:tbl>
@@ -23588,7 +23601,86 @@
           <w:bdr w:val="nil"/>
           <w:lang w:val="hr-HR" w:eastAsia="es-MX"/>
         </w:rPr>
-        <w:t xml:space="preserve">Returns are market-adjusted with lagged weights.</w:t>
+        <w:t xml:space="preserve"/>
+      </w:r>
+      <w:r>
+        <w:rPr>
+          <w:rFonts w:asciiTheme="minorHAnsi" w:eastAsia="Georgia" w:hAnsiTheme="minorHAnsi" w:cstheme="minorHAnsi"/>
+          <w:color w:val="000000"/>
+          <w:sz w:val="18"/>
+          <w:szCs w:val="18"/>
+          <w:bdr w:val="nil"/>
+          <w:lang w:val="hr-HR" w:eastAsia="es-MX"/>
+        </w:rPr>
+        <w:t xml:space="preserve"> </w:t>
+      </w:r>
+      <w:r>
+        <w:rPr>
+          <w:rFonts w:asciiTheme="minorHAnsi" w:eastAsia="Georgia" w:hAnsiTheme="minorHAnsi" w:cstheme="minorHAnsi"/>
+          <w:i/>
+          <w:color w:val="000000"/>
+          <w:sz w:val="18"/>
+          <w:szCs w:val="18"/>
+          <w:bdr w:val="nil"/>
+          <w:lang w:val="hr-HR" w:eastAsia="es-MX"/>
+        </w:rPr>
+        <w:t xml:space="preserve">Note.</w:t>
+      </w:r>
+      <w:r>
+        <w:rPr>
+          <w:rFonts w:asciiTheme="minorHAnsi" w:eastAsia="Georgia" w:hAnsiTheme="minorHAnsi" w:cstheme="minorHAnsi"/>
+          <w:color w:val="000000"/>
+          <w:sz w:val="18"/>
+          <w:szCs w:val="18"/>
+          <w:bdr w:val="nil"/>
+          <w:lang w:val="hr-HR" w:eastAsia="es-MX"/>
+        </w:rPr>
+        <w:t xml:space="preserve"> </w:t>
+      </w:r>
+      <w:r>
+        <w:rPr>
+          <w:rFonts w:asciiTheme="minorHAnsi" w:eastAsia="Georgia" w:hAnsiTheme="minorHAnsi" w:cstheme="minorHAnsi"/>
+          <w:color w:val="000000"/>
+          <w:sz w:val="18"/>
+          <w:szCs w:val="18"/>
+          <w:bdr w:val="nil"/>
+          <w:lang w:val="hr-HR" w:eastAsia="es-MX"/>
+        </w:rPr>
+        <w:t xml:space="preserve">Differences in percentage points from same-direction moves of 3&lt;U+2013&gt;5% or 5&lt;U+2013&gt;6.5% that did not close at the limit; market-adjusted returns; date-clustered</w:t>
+      </w:r>
+      <w:r>
+        <w:rPr>
+          <w:rFonts w:asciiTheme="minorHAnsi" w:eastAsia="Georgia" w:hAnsiTheme="minorHAnsi" w:cstheme="minorHAnsi"/>
+          <w:color w:val="000000"/>
+          <w:sz w:val="18"/>
+          <w:szCs w:val="18"/>
+          <w:bdr w:val="nil"/>
+          <w:lang w:val="hr-HR" w:eastAsia="es-MX"/>
+        </w:rPr>
+        <w:t xml:space="preserve"> </w:t>
+      </w:r>
+      <w:r>
+        <w:rPr>
+          <w:rFonts w:asciiTheme="minorHAnsi" w:eastAsia="Georgia" w:hAnsiTheme="minorHAnsi" w:cstheme="minorHAnsi"/>
+          <w:i/>
+          <w:color w:val="000000"/>
+          <w:sz w:val="18"/>
+          <w:szCs w:val="18"/>
+          <w:bdr w:val="nil"/>
+          <w:lang w:val="hr-HR" w:eastAsia="es-MX"/>
+        </w:rPr>
+        <w:t xml:space="preserve">t</w:t>
+      </w:r>
+      <w:r>
+        <w:rPr>
+          <w:rFonts w:asciiTheme="minorHAnsi" w:eastAsia="Georgia" w:hAnsiTheme="minorHAnsi" w:cstheme="minorHAnsi"/>
+          <w:color w:val="000000"/>
+          <w:sz w:val="18"/>
+          <w:szCs w:val="18"/>
+          <w:bdr w:val="nil"/>
+          <w:lang w:val="hr-HR" w:eastAsia="es-MX"/>
+        </w:rPr>
+        <w:t xml:space="preserve">-statistics in parentheses.</w:t>
       </w:r>
     </w:p>
     <w:p>
@@ -23653,41 +23745,7 @@
           <w:bdr w:val="nil"/>
           <w:lang w:val="hr-HR" w:eastAsia="es-MX"/>
         </w:rPr>
-        <w:t xml:space="preserve"> Next-day abnormal returns (percent) before and after the move to the KRX platform on 5 May 2025, with two-way-clustered</w:t>
-      </w:r>
-      <w:r>
-        <w:rPr>
-          <w:rFonts w:asciiTheme="minorHAnsi" w:eastAsia="Georgia" w:hAnsiTheme="minorHAnsi" w:cstheme="minorHAnsi"/>
-          <w:color w:val="000000"/>
-          <w:sz w:val="18"/>
-          <w:szCs w:val="18"/>
-          <w:bdr w:val="nil"/>
-          <w:lang w:val="hr-HR" w:eastAsia="es-MX"/>
-        </w:rPr>
-        <w:t xml:space="preserve"> </w:t>
-      </w:r>
-      <w:r>
-        <w:rPr>
-          <w:rFonts w:asciiTheme="minorHAnsi" w:eastAsia="Georgia" w:hAnsiTheme="minorHAnsi" w:cstheme="minorHAnsi"/>
-          <w:i/>
-          <w:color w:val="000000"/>
-          <w:sz w:val="18"/>
-          <w:szCs w:val="18"/>
-          <w:bdr w:val="nil"/>
-          <w:lang w:val="hr-HR" w:eastAsia="es-MX"/>
-        </w:rPr>
-        <w:t xml:space="preserve">t</w:t>
-      </w:r>
-      <w:r>
-        <w:rPr>
-          <w:rFonts w:asciiTheme="minorHAnsi" w:eastAsia="Georgia" w:hAnsiTheme="minorHAnsi" w:cstheme="minorHAnsi"/>
-          <w:color w:val="000000"/>
-          <w:sz w:val="18"/>
-          <w:szCs w:val="18"/>
-          <w:bdr w:val="nil"/>
-          <w:lang w:val="hr-HR" w:eastAsia="es-MX"/>
-        </w:rPr>
-        <w:t xml:space="preserve">-statistics in parentheses.</w:t>
+        <w:t xml:space="preserve"> Returns before and after the KRX platform change of 5 May 2025</w:t>
       </w:r>
     </w:p>
     <w:tbl>
@@ -24988,7 +25046,86 @@
           <w:bdr w:val="nil"/>
           <w:lang w:val="hr-HR" w:eastAsia="es-MX"/>
         </w:rPr>
-        <w:t xml:space="preserve">The split uses the date of the opening that defines the gap; the difference</w:t>
+        <w:t xml:space="preserve"/>
+      </w:r>
+      <w:r>
+        <w:rPr>
+          <w:rFonts w:asciiTheme="minorHAnsi" w:eastAsia="Georgia" w:hAnsiTheme="minorHAnsi" w:cstheme="minorHAnsi"/>
+          <w:color w:val="000000"/>
+          <w:sz w:val="18"/>
+          <w:szCs w:val="18"/>
+          <w:bdr w:val="nil"/>
+          <w:lang w:val="hr-HR" w:eastAsia="es-MX"/>
+        </w:rPr>
+        <w:t xml:space="preserve"> </w:t>
+      </w:r>
+      <w:r>
+        <w:rPr>
+          <w:rFonts w:asciiTheme="minorHAnsi" w:eastAsia="Georgia" w:hAnsiTheme="minorHAnsi" w:cstheme="minorHAnsi"/>
+          <w:i/>
+          <w:color w:val="000000"/>
+          <w:sz w:val="18"/>
+          <w:szCs w:val="18"/>
+          <w:bdr w:val="nil"/>
+          <w:lang w:val="hr-HR" w:eastAsia="es-MX"/>
+        </w:rPr>
+        <w:t xml:space="preserve">Note.</w:t>
+      </w:r>
+      <w:r>
+        <w:rPr>
+          <w:rFonts w:asciiTheme="minorHAnsi" w:eastAsia="Georgia" w:hAnsiTheme="minorHAnsi" w:cstheme="minorHAnsi"/>
+          <w:color w:val="000000"/>
+          <w:sz w:val="18"/>
+          <w:szCs w:val="18"/>
+          <w:bdr w:val="nil"/>
+          <w:lang w:val="hr-HR" w:eastAsia="es-MX"/>
+        </w:rPr>
+        <w:t xml:space="preserve"> </w:t>
+      </w:r>
+      <w:r>
+        <w:rPr>
+          <w:rFonts w:asciiTheme="minorHAnsi" w:eastAsia="Georgia" w:hAnsiTheme="minorHAnsi" w:cstheme="minorHAnsi"/>
+          <w:color w:val="000000"/>
+          <w:sz w:val="18"/>
+          <w:szCs w:val="18"/>
+          <w:bdr w:val="nil"/>
+          <w:lang w:val="hr-HR" w:eastAsia="es-MX"/>
+        </w:rPr>
+        <w:t xml:space="preserve">Percent; two-way-clustered</w:t>
+      </w:r>
+      <w:r>
+        <w:rPr>
+          <w:rFonts w:asciiTheme="minorHAnsi" w:eastAsia="Georgia" w:hAnsiTheme="minorHAnsi" w:cstheme="minorHAnsi"/>
+          <w:color w:val="000000"/>
+          <w:sz w:val="18"/>
+          <w:szCs w:val="18"/>
+          <w:bdr w:val="nil"/>
+          <w:lang w:val="hr-HR" w:eastAsia="es-MX"/>
+        </w:rPr>
+        <w:t xml:space="preserve"> </w:t>
+      </w:r>
+      <w:r>
+        <w:rPr>
+          <w:rFonts w:asciiTheme="minorHAnsi" w:eastAsia="Georgia" w:hAnsiTheme="minorHAnsi" w:cstheme="minorHAnsi"/>
+          <w:i/>
+          <w:color w:val="000000"/>
+          <w:sz w:val="18"/>
+          <w:szCs w:val="18"/>
+          <w:bdr w:val="nil"/>
+          <w:lang w:val="hr-HR" w:eastAsia="es-MX"/>
+        </w:rPr>
+        <w:t xml:space="preserve">t</w:t>
+      </w:r>
+      <w:r>
+        <w:rPr>
+          <w:rFonts w:asciiTheme="minorHAnsi" w:eastAsia="Georgia" w:hAnsiTheme="minorHAnsi" w:cstheme="minorHAnsi"/>
+          <w:color w:val="000000"/>
+          <w:sz w:val="18"/>
+          <w:szCs w:val="18"/>
+          <w:bdr w:val="nil"/>
+          <w:lang w:val="hr-HR" w:eastAsia="es-MX"/>
+        </w:rPr>
+        <w:t xml:space="preserve">-statistics in parentheses. Periods are split by the date of the opening that defines the gap; the difference</w:t>
       </w:r>
       <w:r>
         <w:rPr>
@@ -25087,41 +25224,7 @@
           <w:bdr w:val="nil"/>
           <w:lang w:val="hr-HR" w:eastAsia="es-MX"/>
         </w:rPr>
-        <w:t xml:space="preserve"> Events and overnight gaps (percent, market-adjusted) by calendar quarter of the opening that defines the gap, with two-way-clustered</w:t>
-      </w:r>
-      <w:r>
-        <w:rPr>
-          <w:rFonts w:asciiTheme="minorHAnsi" w:eastAsia="Georgia" w:hAnsiTheme="minorHAnsi" w:cstheme="minorHAnsi"/>
-          <w:color w:val="000000"/>
-          <w:sz w:val="18"/>
-          <w:szCs w:val="18"/>
-          <w:bdr w:val="nil"/>
-          <w:lang w:val="hr-HR" w:eastAsia="es-MX"/>
-        </w:rPr>
-        <w:t xml:space="preserve"> </w:t>
-      </w:r>
-      <w:r>
-        <w:rPr>
-          <w:rFonts w:asciiTheme="minorHAnsi" w:eastAsia="Georgia" w:hAnsiTheme="minorHAnsi" w:cstheme="minorHAnsi"/>
-          <w:i/>
-          <w:color w:val="000000"/>
-          <w:sz w:val="18"/>
-          <w:szCs w:val="18"/>
-          <w:bdr w:val="nil"/>
-          <w:lang w:val="hr-HR" w:eastAsia="es-MX"/>
-        </w:rPr>
-        <w:t xml:space="preserve">t</w:t>
-      </w:r>
-      <w:r>
-        <w:rPr>
-          <w:rFonts w:asciiTheme="minorHAnsi" w:eastAsia="Georgia" w:hAnsiTheme="minorHAnsi" w:cstheme="minorHAnsi"/>
-          <w:color w:val="000000"/>
-          <w:sz w:val="18"/>
-          <w:szCs w:val="18"/>
-          <w:bdr w:val="nil"/>
-          <w:lang w:val="hr-HR" w:eastAsia="es-MX"/>
-        </w:rPr>
-        <w:t xml:space="preserve">-statistics in parentheses.</w:t>
+        <w:t xml:space="preserve"> Events and overnight gaps by calendar quarter</w:t>
       </w:r>
     </w:p>
     <w:tbl>
@@ -26176,30 +26279,109 @@
           <w:bdr w:val="nil"/>
           <w:lang w:val="hr-HR" w:eastAsia="es-MX"/>
         </w:rPr>
-        <w:t xml:space="preserve">Counts are events with a day-</w:t>
-      </w:r>
-      <w:r>
-        <w:rPr>
-          <w:rFonts w:asciiTheme="minorHAnsi" w:eastAsia="Georgia" w:hAnsiTheme="minorHAnsi" w:cstheme="minorHAnsi"/>
-          <w:i/>
+        <w:t xml:space="preserve"/>
+      </w:r>
+      <w:r>
+        <w:rPr>
+          <w:rFonts w:asciiTheme="minorHAnsi" w:eastAsia="Georgia" w:hAnsiTheme="minorHAnsi" w:cstheme="minorHAnsi"/>
           <w:color w:val="000000"/>
           <w:sz w:val="18"/>
           <w:szCs w:val="18"/>
           <w:bdr w:val="nil"/>
           <w:lang w:val="hr-HR" w:eastAsia="es-MX"/>
         </w:rPr>
-        <w:t xml:space="preserve">d</w:t>
-      </w:r>
-      <w:r>
-        <w:rPr>
-          <w:rFonts w:asciiTheme="minorHAnsi" w:eastAsia="Georgia" w:hAnsiTheme="minorHAnsi" w:cstheme="minorHAnsi"/>
+        <w:t xml:space="preserve"> </w:t>
+      </w:r>
+      <w:r>
+        <w:rPr>
+          <w:rFonts w:asciiTheme="minorHAnsi" w:eastAsia="Georgia" w:hAnsiTheme="minorHAnsi" w:cstheme="minorHAnsi"/>
+          <w:i/>
           <w:color w:val="000000"/>
           <w:sz w:val="18"/>
           <w:szCs w:val="18"/>
           <w:bdr w:val="nil"/>
           <w:lang w:val="hr-HR" w:eastAsia="es-MX"/>
         </w:rPr>
-        <w:t xml:space="preserve">+1 open. The first and last quarters are partial. The KRX platform change falls in 2025-Q2.</w:t>
+        <w:t xml:space="preserve">Note.</w:t>
+      </w:r>
+      <w:r>
+        <w:rPr>
+          <w:rFonts w:asciiTheme="minorHAnsi" w:eastAsia="Georgia" w:hAnsiTheme="minorHAnsi" w:cstheme="minorHAnsi"/>
+          <w:color w:val="000000"/>
+          <w:sz w:val="18"/>
+          <w:szCs w:val="18"/>
+          <w:bdr w:val="nil"/>
+          <w:lang w:val="hr-HR" w:eastAsia="es-MX"/>
+        </w:rPr>
+        <w:t xml:space="preserve"> </w:t>
+      </w:r>
+      <w:r>
+        <w:rPr>
+          <w:rFonts w:asciiTheme="minorHAnsi" w:eastAsia="Georgia" w:hAnsiTheme="minorHAnsi" w:cstheme="minorHAnsi"/>
+          <w:color w:val="000000"/>
+          <w:sz w:val="18"/>
+          <w:szCs w:val="18"/>
+          <w:bdr w:val="nil"/>
+          <w:lang w:val="hr-HR" w:eastAsia="es-MX"/>
+        </w:rPr>
+        <w:t xml:space="preserve">Market-adjusted gaps in percent; two-way-clustered</w:t>
+      </w:r>
+      <w:r>
+        <w:rPr>
+          <w:rFonts w:asciiTheme="minorHAnsi" w:eastAsia="Georgia" w:hAnsiTheme="minorHAnsi" w:cstheme="minorHAnsi"/>
+          <w:color w:val="000000"/>
+          <w:sz w:val="18"/>
+          <w:szCs w:val="18"/>
+          <w:bdr w:val="nil"/>
+          <w:lang w:val="hr-HR" w:eastAsia="es-MX"/>
+        </w:rPr>
+        <w:t xml:space="preserve"> </w:t>
+      </w:r>
+      <w:r>
+        <w:rPr>
+          <w:rFonts w:asciiTheme="minorHAnsi" w:eastAsia="Georgia" w:hAnsiTheme="minorHAnsi" w:cstheme="minorHAnsi"/>
+          <w:i/>
+          <w:color w:val="000000"/>
+          <w:sz w:val="18"/>
+          <w:szCs w:val="18"/>
+          <w:bdr w:val="nil"/>
+          <w:lang w:val="hr-HR" w:eastAsia="es-MX"/>
+        </w:rPr>
+        <w:t xml:space="preserve">t</w:t>
+      </w:r>
+      <w:r>
+        <w:rPr>
+          <w:rFonts w:asciiTheme="minorHAnsi" w:eastAsia="Georgia" w:hAnsiTheme="minorHAnsi" w:cstheme="minorHAnsi"/>
+          <w:color w:val="000000"/>
+          <w:sz w:val="18"/>
+          <w:szCs w:val="18"/>
+          <w:bdr w:val="nil"/>
+          <w:lang w:val="hr-HR" w:eastAsia="es-MX"/>
+        </w:rPr>
+        <w:t xml:space="preserve">-statistics in parentheses. Counts are events with a day-</w:t>
+      </w:r>
+      <w:r>
+        <w:rPr>
+          <w:rFonts w:asciiTheme="minorHAnsi" w:eastAsia="Georgia" w:hAnsiTheme="minorHAnsi" w:cstheme="minorHAnsi"/>
+          <w:i/>
+          <w:color w:val="000000"/>
+          <w:sz w:val="18"/>
+          <w:szCs w:val="18"/>
+          <w:bdr w:val="nil"/>
+          <w:lang w:val="hr-HR" w:eastAsia="es-MX"/>
+        </w:rPr>
+        <w:t xml:space="preserve">d</w:t>
+      </w:r>
+      <w:r>
+        <w:rPr>
+          <w:rFonts w:asciiTheme="minorHAnsi" w:eastAsia="Georgia" w:hAnsiTheme="minorHAnsi" w:cstheme="minorHAnsi"/>
+          <w:color w:val="000000"/>
+          <w:sz w:val="18"/>
+          <w:szCs w:val="18"/>
+          <w:bdr w:val="nil"/>
+          <w:lang w:val="hr-HR" w:eastAsia="es-MX"/>
+        </w:rPr>
+        <w:t xml:space="preserve">+1 open. The first and last quarters are partial; the KRX change falls in 2025-Q2.</w:t>
       </w:r>
     </w:p>
     <w:p>
@@ -26264,7 +26446,7 @@
           <w:bdr w:val="nil"/>
           <w:lang w:val="hr-HR" w:eastAsia="es-MX"/>
         </w:rPr>
-        <w:t xml:space="preserve"> Comparison with earlier studies.</w:t>
+        <w:t xml:space="preserve"> Comparison with earlier studies</w:t>
       </w:r>
     </w:p>
     <w:tbl>
@@ -27426,7 +27608,52 @@
           <w:bdr w:val="nil"/>
           <w:lang w:val="hr-HR" w:eastAsia="es-MX"/>
         </w:rPr>
-        <w:t xml:space="preserve">Findings are as reported in each source’s abstract or in the records we could access.</w:t>
+        <w:t xml:space="preserve"/>
+      </w:r>
+      <w:r>
+        <w:rPr>
+          <w:rFonts w:asciiTheme="minorHAnsi" w:eastAsia="Georgia" w:hAnsiTheme="minorHAnsi" w:cstheme="minorHAnsi"/>
+          <w:color w:val="000000"/>
+          <w:sz w:val="18"/>
+          <w:szCs w:val="18"/>
+          <w:bdr w:val="nil"/>
+          <w:lang w:val="hr-HR" w:eastAsia="es-MX"/>
+        </w:rPr>
+        <w:t xml:space="preserve"> </w:t>
+      </w:r>
+      <w:r>
+        <w:rPr>
+          <w:rFonts w:asciiTheme="minorHAnsi" w:eastAsia="Georgia" w:hAnsiTheme="minorHAnsi" w:cstheme="minorHAnsi"/>
+          <w:i/>
+          <w:color w:val="000000"/>
+          <w:sz w:val="18"/>
+          <w:szCs w:val="18"/>
+          <w:bdr w:val="nil"/>
+          <w:lang w:val="hr-HR" w:eastAsia="es-MX"/>
+        </w:rPr>
+        <w:t xml:space="preserve">Note.</w:t>
+      </w:r>
+      <w:r>
+        <w:rPr>
+          <w:rFonts w:asciiTheme="minorHAnsi" w:eastAsia="Georgia" w:hAnsiTheme="minorHAnsi" w:cstheme="minorHAnsi"/>
+          <w:color w:val="000000"/>
+          <w:sz w:val="18"/>
+          <w:szCs w:val="18"/>
+          <w:bdr w:val="nil"/>
+          <w:lang w:val="hr-HR" w:eastAsia="es-MX"/>
+        </w:rPr>
+        <w:t xml:space="preserve"> </w:t>
+      </w:r>
+      <w:r>
+        <w:rPr>
+          <w:rFonts w:asciiTheme="minorHAnsi" w:eastAsia="Georgia" w:hAnsiTheme="minorHAnsi" w:cstheme="minorHAnsi"/>
+          <w:color w:val="000000"/>
+          <w:sz w:val="18"/>
+          <w:szCs w:val="18"/>
+          <w:bdr w:val="nil"/>
+          <w:lang w:val="hr-HR" w:eastAsia="es-MX"/>
+        </w:rPr>
+        <w:t xml:space="preserve">Findings as reported in each source’s abstract or in the records we could access.</w:t>
       </w:r>
     </w:p>
     <w:sectPr>

</xml_diff>

<commit_message>
Paper C MSJ: mark real captions explicitly so body paragraphs starting with 'Table n'/'Figure n' keep body formatting
Co-Authored-By: Claude Opus 5.5 <noreply@anthropic.com>
Claude-Session: https://claude.ai/code/session_011zPDaCYE4jmmpoRvPu4SUX
</commit_message>
<xml_diff>
--- a/paper2/final/MSJ/Manuscript_MSJ.docx
+++ b/paper2/final/MSJ/Manuscript_MSJ.docx
@@ -9085,8 +9085,9 @@
         <w:tabs>
           <w:tab w:val="left" w:pos="1740"/>
         </w:tabs>
-        <w:spacing w:before="60" w:after="0"/>
-        <w:jc w:val="center"/>
+        <w:spacing w:after="0" w:line="240" w:lineRule="auto"/>
+        <w:ind w:firstLine="567"/>
+        <w:jc w:val="both"/>
         <w:rPr>
           <w:rFonts w:asciiTheme="minorHAnsi" w:eastAsia="Georgia" w:hAnsiTheme="minorHAnsi" w:cstheme="minorHAnsi"/>
           <w:bCs/>
@@ -9101,34 +9102,20 @@
       <w:r>
         <w:rPr>
           <w:rFonts w:asciiTheme="minorHAnsi" w:eastAsia="Georgia" w:hAnsiTheme="minorHAnsi" w:cstheme="minorHAnsi"/>
-          <w:b/>
-          <w:bCs/>
-          <w:color w:val="632423" w:themeColor="accent2" w:themeShade="80"/>
-          <w:sz w:val="18"/>
-          <w:szCs w:val="18"/>
-          <w:u w:color="000000"/>
-          <w:bdr w:val="nil"/>
-          <w:lang w:val="hr-HR" w:eastAsia="es-MX"/>
-        </w:rPr>
-        <w:t xml:space="preserve">Figure 1</w:t>
-      </w:r>
-      <w:r>
-        <w:rPr>
-          <w:rFonts w:asciiTheme="minorHAnsi" w:eastAsia="Georgia" w:hAnsiTheme="minorHAnsi" w:cstheme="minorHAnsi"/>
-          <w:color w:val="000000"/>
-          <w:sz w:val="18"/>
-          <w:szCs w:val="18"/>
-          <w:bdr w:val="nil"/>
-          <w:lang w:val="hr-HR" w:eastAsia="es-MX"/>
-        </w:rPr>
-        <w:t xml:space="preserve"> plots the</w:t>
-      </w:r>
-      <w:r>
-        <w:rPr>
-          <w:rFonts w:asciiTheme="minorHAnsi" w:eastAsia="Georgia" w:hAnsiTheme="minorHAnsi" w:cstheme="minorHAnsi"/>
-          <w:color w:val="000000"/>
-          <w:sz w:val="18"/>
-          <w:szCs w:val="18"/>
+          <w:color w:val="000000"/>
+          <w:sz w:val="20"/>
+          <w:szCs w:val="20"/>
+          <w:bdr w:val="nil"/>
+          <w:lang w:val="hr-HR" w:eastAsia="es-MX"/>
+        </w:rPr>
+        <w:t xml:space="preserve">Figure 1 plots the</w:t>
+      </w:r>
+      <w:r>
+        <w:rPr>
+          <w:rFonts w:asciiTheme="minorHAnsi" w:eastAsia="Georgia" w:hAnsiTheme="minorHAnsi" w:cstheme="minorHAnsi"/>
+          <w:color w:val="000000"/>
+          <w:sz w:val="20"/>
+          <w:szCs w:val="20"/>
           <w:bdr w:val="nil"/>
           <w:lang w:val="hr-HR" w:eastAsia="es-MX"/>
         </w:rPr>
@@ -9139,8 +9126,8 @@
           <w:rFonts w:asciiTheme="minorHAnsi" w:eastAsia="Georgia" w:hAnsiTheme="minorHAnsi" w:cstheme="minorHAnsi"/>
           <w:i/>
           <w:color w:val="000000"/>
-          <w:sz w:val="18"/>
-          <w:szCs w:val="18"/>
+          <w:sz w:val="20"/>
+          <w:szCs w:val="20"/>
           <w:bdr w:val="nil"/>
           <w:lang w:val="hr-HR" w:eastAsia="es-MX"/>
         </w:rPr>
@@ -9150,8 +9137,8 @@
         <w:rPr>
           <w:rFonts w:asciiTheme="minorHAnsi" w:eastAsia="Georgia" w:hAnsiTheme="minorHAnsi" w:cstheme="minorHAnsi"/>
           <w:color w:val="000000"/>
-          <w:sz w:val="18"/>
-          <w:szCs w:val="18"/>
+          <w:sz w:val="20"/>
+          <w:szCs w:val="20"/>
           <w:bdr w:val="nil"/>
           <w:lang w:val="hr-HR" w:eastAsia="es-MX"/>
         </w:rPr>
@@ -9161,8 +9148,8 @@
         <w:rPr>
           <w:rFonts w:asciiTheme="minorHAnsi" w:eastAsia="Georgia" w:hAnsiTheme="minorHAnsi" w:cstheme="minorHAnsi"/>
           <w:color w:val="000000"/>
-          <w:sz w:val="18"/>
-          <w:szCs w:val="18"/>
+          <w:sz w:val="20"/>
+          <w:szCs w:val="20"/>
           <w:bdr w:val="nil"/>
           <w:lang w:val="hr-HR" w:eastAsia="es-MX"/>
         </w:rPr>
@@ -9184,8 +9171,8 @@
         <w:rPr>
           <w:rFonts w:asciiTheme="minorHAnsi" w:eastAsia="Georgia" w:hAnsiTheme="minorHAnsi" w:cstheme="minorHAnsi"/>
           <w:color w:val="000000"/>
-          <w:sz w:val="18"/>
-          <w:szCs w:val="18"/>
+          <w:sz w:val="20"/>
+          <w:szCs w:val="20"/>
           <w:bdr w:val="nil"/>
           <w:lang w:val="hr-HR" w:eastAsia="es-MX"/>
         </w:rPr>
@@ -9195,8 +9182,8 @@
         <w:rPr>
           <w:rFonts w:asciiTheme="minorHAnsi" w:eastAsia="Georgia" w:hAnsiTheme="minorHAnsi" w:cstheme="minorHAnsi"/>
           <w:color w:val="000000"/>
-          <w:sz w:val="18"/>
-          <w:szCs w:val="18"/>
+          <w:sz w:val="20"/>
+          <w:szCs w:val="20"/>
           <w:bdr w:val="nil"/>
           <w:lang w:val="hr-HR" w:eastAsia="es-MX"/>
         </w:rPr>
@@ -9207,8 +9194,8 @@
           <w:rFonts w:asciiTheme="minorHAnsi" w:eastAsia="Georgia" w:hAnsiTheme="minorHAnsi" w:cstheme="minorHAnsi"/>
           <w:i/>
           <w:color w:val="000000"/>
-          <w:sz w:val="18"/>
-          <w:szCs w:val="18"/>
+          <w:sz w:val="20"/>
+          <w:szCs w:val="20"/>
           <w:bdr w:val="nil"/>
           <w:lang w:val="hr-HR" w:eastAsia="es-MX"/>
         </w:rPr>
@@ -9218,8 +9205,8 @@
         <w:rPr>
           <w:rFonts w:asciiTheme="minorHAnsi" w:eastAsia="Georgia" w:hAnsiTheme="minorHAnsi" w:cstheme="minorHAnsi"/>
           <w:color w:val="000000"/>
-          <w:sz w:val="18"/>
-          <w:szCs w:val="18"/>
+          <w:sz w:val="20"/>
+          <w:szCs w:val="20"/>
           <w:bdr w:val="nil"/>
           <w:lang w:val="hr-HR" w:eastAsia="es-MX"/>
         </w:rPr>
@@ -9230,8 +9217,8 @@
           <w:rFonts w:asciiTheme="minorHAnsi" w:eastAsia="Georgia" w:hAnsiTheme="minorHAnsi" w:cstheme="minorHAnsi"/>
           <w:i/>
           <w:color w:val="000000"/>
-          <w:sz w:val="18"/>
-          <w:szCs w:val="18"/>
+          <w:sz w:val="20"/>
+          <w:szCs w:val="20"/>
           <w:bdr w:val="nil"/>
           <w:lang w:val="hr-HR" w:eastAsia="es-MX"/>
         </w:rPr>
@@ -9241,8 +9228,8 @@
         <w:rPr>
           <w:rFonts w:asciiTheme="minorHAnsi" w:eastAsia="Georgia" w:hAnsiTheme="minorHAnsi" w:cstheme="minorHAnsi"/>
           <w:color w:val="000000"/>
-          <w:sz w:val="18"/>
-          <w:szCs w:val="18"/>
+          <w:sz w:val="20"/>
+          <w:szCs w:val="20"/>
           <w:bdr w:val="nil"/>
           <w:lang w:val="hr-HR" w:eastAsia="es-MX"/>
         </w:rPr>
@@ -9252,8 +9239,8 @@
         <w:rPr>
           <w:rFonts w:asciiTheme="minorHAnsi" w:eastAsia="Georgia" w:hAnsiTheme="minorHAnsi" w:cstheme="minorHAnsi"/>
           <w:color w:val="000000"/>
-          <w:sz w:val="18"/>
-          <w:szCs w:val="18"/>
+          <w:sz w:val="20"/>
+          <w:szCs w:val="20"/>
           <w:bdr w:val="nil"/>
           <w:lang w:val="hr-HR" w:eastAsia="es-MX"/>
         </w:rPr>
@@ -9264,8 +9251,8 @@
           <w:rFonts w:asciiTheme="minorHAnsi" w:eastAsia="Georgia" w:hAnsiTheme="minorHAnsi" w:cstheme="minorHAnsi"/>
           <w:i/>
           <w:color w:val="000000"/>
-          <w:sz w:val="18"/>
-          <w:szCs w:val="18"/>
+          <w:sz w:val="20"/>
+          <w:szCs w:val="20"/>
           <w:bdr w:val="nil"/>
           <w:lang w:val="hr-HR" w:eastAsia="es-MX"/>
         </w:rPr>
@@ -9275,8 +9262,8 @@
         <w:rPr>
           <w:rFonts w:asciiTheme="minorHAnsi" w:eastAsia="Georgia" w:hAnsiTheme="minorHAnsi" w:cstheme="minorHAnsi"/>
           <w:color w:val="000000"/>
-          <w:sz w:val="18"/>
-          <w:szCs w:val="18"/>
+          <w:sz w:val="20"/>
+          <w:szCs w:val="20"/>
           <w:bdr w:val="nil"/>
           <w:lang w:val="hr-HR" w:eastAsia="es-MX"/>
         </w:rPr>
@@ -9286,8 +9273,8 @@
         <w:rPr>
           <w:rFonts w:asciiTheme="minorHAnsi" w:eastAsia="Georgia" w:hAnsiTheme="minorHAnsi" w:cstheme="minorHAnsi"/>
           <w:color w:val="000000"/>
-          <w:sz w:val="18"/>
-          <w:szCs w:val="18"/>
+          <w:sz w:val="20"/>
+          <w:szCs w:val="20"/>
           <w:bdr w:val="nil"/>
           <w:lang w:val="hr-HR" w:eastAsia="es-MX"/>
         </w:rPr>
@@ -9298,8 +9285,8 @@
           <w:rFonts w:asciiTheme="minorHAnsi" w:eastAsia="Georgia" w:hAnsiTheme="minorHAnsi" w:cstheme="minorHAnsi"/>
           <w:i/>
           <w:color w:val="000000"/>
-          <w:sz w:val="18"/>
-          <w:szCs w:val="18"/>
+          <w:sz w:val="20"/>
+          <w:szCs w:val="20"/>
           <w:bdr w:val="nil"/>
           <w:lang w:val="hr-HR" w:eastAsia="es-MX"/>
         </w:rPr>
@@ -9309,8 +9296,8 @@
         <w:rPr>
           <w:rFonts w:asciiTheme="minorHAnsi" w:eastAsia="Georgia" w:hAnsiTheme="minorHAnsi" w:cstheme="minorHAnsi"/>
           <w:color w:val="000000"/>
-          <w:sz w:val="18"/>
-          <w:szCs w:val="18"/>
+          <w:sz w:val="20"/>
+          <w:szCs w:val="20"/>
           <w:bdr w:val="nil"/>
           <w:lang w:val="hr-HR" w:eastAsia="es-MX"/>
         </w:rPr>
@@ -9336,6 +9323,287 @@
           <w:lang w:val="hr-HR" w:eastAsia="es-MX"/>
         </w:rPr>
       </w:pPr>
+      <w:r>
+        <w:rPr>
+          <w:rFonts w:asciiTheme="minorHAnsi" w:eastAsia="Georgia" w:hAnsiTheme="minorHAnsi" w:cstheme="minorHAnsi"/>
+          <w:color w:val="000000"/>
+          <w:sz w:val="20"/>
+          <w:szCs w:val="20"/>
+          <w:bdr w:val="nil"/>
+          <w:lang w:val="hr-HR" w:eastAsia="es-MX"/>
+        </w:rPr>
+        <w:t xml:space="preserve">Without market capitalization or accounting data, we cannot test the size and earnings-to-price effects that Huang et al. (2023) find in Vietnam, so our null does not contradict theirs. A short sample, which leaves a premium of a tenth of a percentage point per week below the MDE, and limits that censor the highs and lows of range-based characteristics can each produce the null, and we draw no conclusion about market efficiency from it.</w:t>
+      </w:r>
+    </w:p>
+    <w:p>
+      <w:pPr>
+        <w:keepNext/>
+        <w:tabs>
+          <w:tab w:val="left" w:pos="1740"/>
+        </w:tabs>
+        <w:spacing w:after="0" w:line="240" w:lineRule="auto"/>
+        <w:ind w:firstLine="567"/>
+        <w:jc w:val="both"/>
+        <w:rPr>
+          <w:rFonts w:asciiTheme="minorHAnsi" w:eastAsia="Georgia" w:hAnsiTheme="minorHAnsi" w:cstheme="minorHAnsi"/>
+          <w:bCs/>
+          <w:color w:val="000000"/>
+          <w:sz w:val="20"/>
+          <w:szCs w:val="20"/>
+          <w:u w:color="000000"/>
+          <w:bdr w:val="nil"/>
+          <w:lang w:val="hr-HR" w:eastAsia="es-MX"/>
+        </w:rPr>
+      </w:pPr>
+      <w:r>
+        <w:rPr>
+          <w:rFonts w:asciiTheme="minorHAnsi" w:eastAsia="Georgia" w:hAnsiTheme="minorHAnsi" w:cstheme="minorHAnsi"/>
+          <w:color w:val="000000"/>
+          <w:sz w:val="20"/>
+          <w:szCs w:val="20"/>
+          <w:bdr w:val="nil"/>
+          <w:lang w:val="hr-HR" w:eastAsia="es-MX"/>
+        </w:rPr>
+        <w:t xml:space="preserve">Table 1 reports the event tests. Ceiling closes earn a market-adjusted return of 1.66% on day</w:t>
+      </w:r>
+      <w:r>
+        <w:rPr>
+          <w:rFonts w:asciiTheme="minorHAnsi" w:eastAsia="Georgia" w:hAnsiTheme="minorHAnsi" w:cstheme="minorHAnsi"/>
+          <w:color w:val="000000"/>
+          <w:sz w:val="20"/>
+          <w:szCs w:val="20"/>
+          <w:bdr w:val="nil"/>
+          <w:lang w:val="hr-HR" w:eastAsia="es-MX"/>
+        </w:rPr>
+        <w:t xml:space="preserve"> </w:t>
+      </w:r>
+      <w:r>
+        <w:rPr>
+          <w:rFonts w:asciiTheme="minorHAnsi" w:eastAsia="Georgia" w:hAnsiTheme="minorHAnsi" w:cstheme="minorHAnsi"/>
+          <w:i/>
+          <w:color w:val="000000"/>
+          <w:sz w:val="20"/>
+          <w:szCs w:val="20"/>
+          <w:bdr w:val="nil"/>
+          <w:lang w:val="hr-HR" w:eastAsia="es-MX"/>
+        </w:rPr>
+        <w:t xml:space="preserve">d</w:t>
+      </w:r>
+      <w:r>
+        <w:rPr>
+          <w:rFonts w:asciiTheme="minorHAnsi" w:eastAsia="Georgia" w:hAnsiTheme="minorHAnsi" w:cstheme="minorHAnsi"/>
+          <w:color w:val="000000"/>
+          <w:sz w:val="20"/>
+          <w:szCs w:val="20"/>
+          <w:bdr w:val="nil"/>
+          <w:lang w:val="hr-HR" w:eastAsia="es-MX"/>
+        </w:rPr>
+        <w:t xml:space="preserve">+1 and 1.45% over days</w:t>
+      </w:r>
+      <w:r>
+        <w:rPr>
+          <w:rFonts w:asciiTheme="minorHAnsi" w:eastAsia="Georgia" w:hAnsiTheme="minorHAnsi" w:cstheme="minorHAnsi"/>
+          <w:color w:val="000000"/>
+          <w:sz w:val="20"/>
+          <w:szCs w:val="20"/>
+          <w:bdr w:val="nil"/>
+          <w:lang w:val="hr-HR" w:eastAsia="es-MX"/>
+        </w:rPr>
+        <w:t xml:space="preserve"> </w:t>
+      </w:r>
+      <w:r>
+        <w:rPr>
+          <w:rFonts w:asciiTheme="minorHAnsi" w:eastAsia="Georgia" w:hAnsiTheme="minorHAnsi" w:cstheme="minorHAnsi"/>
+          <w:i/>
+          <w:color w:val="000000"/>
+          <w:sz w:val="20"/>
+          <w:szCs w:val="20"/>
+          <w:bdr w:val="nil"/>
+          <w:lang w:val="hr-HR" w:eastAsia="es-MX"/>
+        </w:rPr>
+        <w:t xml:space="preserve">d</w:t>
+      </w:r>
+      <w:r>
+        <w:rPr>
+          <w:rFonts w:asciiTheme="minorHAnsi" w:eastAsia="Georgia" w:hAnsiTheme="minorHAnsi" w:cstheme="minorHAnsi"/>
+          <w:color w:val="000000"/>
+          <w:sz w:val="20"/>
+          <w:szCs w:val="20"/>
+          <w:bdr w:val="nil"/>
+          <w:lang w:val="hr-HR" w:eastAsia="es-MX"/>
+        </w:rPr>
+        <w:t xml:space="preserve">+1 to</w:t>
+      </w:r>
+      <w:r>
+        <w:rPr>
+          <w:rFonts w:asciiTheme="minorHAnsi" w:eastAsia="Georgia" w:hAnsiTheme="minorHAnsi" w:cstheme="minorHAnsi"/>
+          <w:color w:val="000000"/>
+          <w:sz w:val="20"/>
+          <w:szCs w:val="20"/>
+          <w:bdr w:val="nil"/>
+          <w:lang w:val="hr-HR" w:eastAsia="es-MX"/>
+        </w:rPr>
+        <w:t xml:space="preserve"> </w:t>
+      </w:r>
+      <w:r>
+        <w:rPr>
+          <w:rFonts w:asciiTheme="minorHAnsi" w:eastAsia="Georgia" w:hAnsiTheme="minorHAnsi" w:cstheme="minorHAnsi"/>
+          <w:i/>
+          <w:color w:val="000000"/>
+          <w:sz w:val="20"/>
+          <w:szCs w:val="20"/>
+          <w:bdr w:val="nil"/>
+          <w:lang w:val="hr-HR" w:eastAsia="es-MX"/>
+        </w:rPr>
+        <w:t xml:space="preserve">d</w:t>
+      </w:r>
+      <w:r>
+        <w:rPr>
+          <w:rFonts w:asciiTheme="minorHAnsi" w:eastAsia="Georgia" w:hAnsiTheme="minorHAnsi" w:cstheme="minorHAnsi"/>
+          <w:color w:val="000000"/>
+          <w:sz w:val="20"/>
+          <w:szCs w:val="20"/>
+          <w:bdr w:val="nil"/>
+          <w:lang w:val="hr-HR" w:eastAsia="es-MX"/>
+        </w:rPr>
+        <w:t xml:space="preserve">+5, and floor closes earn −0.71% and −1.76%. All four tests survive the BH control (Equation (8); adjusted</w:t>
+      </w:r>
+      <w:r>
+        <w:rPr>
+          <w:rFonts w:asciiTheme="minorHAnsi" w:eastAsia="Georgia" w:hAnsiTheme="minorHAnsi" w:cstheme="minorHAnsi"/>
+          <w:color w:val="000000"/>
+          <w:sz w:val="20"/>
+          <w:szCs w:val="20"/>
+          <w:bdr w:val="nil"/>
+          <w:lang w:val="hr-HR" w:eastAsia="es-MX"/>
+        </w:rPr>
+        <w:t xml:space="preserve"> </w:t>
+      </w:r>
+      <w:r>
+        <w:rPr>
+          <w:rFonts w:asciiTheme="minorHAnsi" w:eastAsia="Georgia" w:hAnsiTheme="minorHAnsi" w:cstheme="minorHAnsi"/>
+          <w:i/>
+          <w:color w:val="000000"/>
+          <w:sz w:val="20"/>
+          <w:szCs w:val="20"/>
+          <w:bdr w:val="nil"/>
+          <w:lang w:val="hr-HR" w:eastAsia="es-MX"/>
+        </w:rPr>
+        <w:t xml:space="preserve">p</w:t>
+      </w:r>
+      <w:r>
+        <w:rPr>
+          <w:rFonts w:asciiTheme="minorHAnsi" w:eastAsia="Georgia" w:hAnsiTheme="minorHAnsi" w:cstheme="minorHAnsi"/>
+          <w:color w:val="000000"/>
+          <w:sz w:val="20"/>
+          <w:szCs w:val="20"/>
+          <w:bdr w:val="nil"/>
+          <w:lang w:val="hr-HR" w:eastAsia="es-MX"/>
+        </w:rPr>
+        <w:t xml:space="preserve">-values of at most 0.0004), keep their signs in both halves, and exceed |</w:t>
+      </w:r>
+      <w:r>
+        <w:rPr>
+          <w:rFonts w:asciiTheme="minorHAnsi" w:eastAsia="Georgia" w:hAnsiTheme="minorHAnsi" w:cstheme="minorHAnsi"/>
+          <w:i/>
+          <w:color w:val="000000"/>
+          <w:sz w:val="20"/>
+          <w:szCs w:val="20"/>
+          <w:bdr w:val="nil"/>
+          <w:lang w:val="hr-HR" w:eastAsia="es-MX"/>
+        </w:rPr>
+        <w:t xml:space="preserve">t</w:t>
+      </w:r>
+      <w:r>
+        <w:rPr>
+          <w:rFonts w:asciiTheme="minorHAnsi" w:eastAsia="Georgia" w:hAnsiTheme="minorHAnsi" w:cstheme="minorHAnsi"/>
+          <w:color w:val="000000"/>
+          <w:sz w:val="20"/>
+          <w:szCs w:val="20"/>
+          <w:bdr w:val="nil"/>
+          <w:lang w:val="hr-HR" w:eastAsia="es-MX"/>
+        </w:rPr>
+        <w:t xml:space="preserve">| = 1.96 in the confirmation half. Clustering by calendar week or 10-day block, with a</w:t>
+      </w:r>
+      <w:r>
+        <w:rPr>
+          <w:rFonts w:asciiTheme="minorHAnsi" w:eastAsia="Georgia" w:hAnsiTheme="minorHAnsi" w:cstheme="minorHAnsi"/>
+          <w:color w:val="000000"/>
+          <w:sz w:val="20"/>
+          <w:szCs w:val="20"/>
+          <w:bdr w:val="nil"/>
+          <w:lang w:val="hr-HR" w:eastAsia="es-MX"/>
+        </w:rPr>
+        <w:t xml:space="preserve"> </w:t>
+      </w:r>
+      <w:r>
+        <w:rPr>
+          <w:rFonts w:asciiTheme="minorHAnsi" w:eastAsia="Georgia" w:hAnsiTheme="minorHAnsi" w:cstheme="minorHAnsi"/>
+          <w:i/>
+          <w:color w:val="000000"/>
+          <w:sz w:val="20"/>
+          <w:szCs w:val="20"/>
+          <w:bdr w:val="nil"/>
+          <w:lang w:val="hr-HR" w:eastAsia="es-MX"/>
+        </w:rPr>
+        <w:t xml:space="preserve">t</w:t>
+      </w:r>
+      <w:r>
+        <w:rPr>
+          <w:rFonts w:asciiTheme="minorHAnsi" w:eastAsia="Georgia" w:hAnsiTheme="minorHAnsi" w:cstheme="minorHAnsi"/>
+          <w:color w:val="000000"/>
+          <w:sz w:val="20"/>
+          <w:szCs w:val="20"/>
+          <w:bdr w:val="nil"/>
+          <w:lang w:val="hr-HR" w:eastAsia="es-MX"/>
+        </w:rPr>
+        <w:t xml:space="preserve"> </w:t>
+      </w:r>
+      <w:r>
+        <w:rPr>
+          <w:rFonts w:asciiTheme="minorHAnsi" w:eastAsia="Georgia" w:hAnsiTheme="minorHAnsi" w:cstheme="minorHAnsi"/>
+          <w:color w:val="000000"/>
+          <w:sz w:val="20"/>
+          <w:szCs w:val="20"/>
+          <w:bdr w:val="nil"/>
+          <w:lang w:val="hr-HR" w:eastAsia="es-MX"/>
+        </w:rPr>
+        <w:t xml:space="preserve">reference, leaves all four significant. The floor five-day test clears the confirmation criterion by the smallest margin (</w:t>
+      </w:r>
+      <w:r>
+        <w:rPr>
+          <w:rFonts w:asciiTheme="minorHAnsi" w:eastAsia="Georgia" w:hAnsiTheme="minorHAnsi" w:cstheme="minorHAnsi"/>
+          <w:i/>
+          <w:color w:val="000000"/>
+          <w:sz w:val="20"/>
+          <w:szCs w:val="20"/>
+          <w:bdr w:val="nil"/>
+          <w:lang w:val="hr-HR" w:eastAsia="es-MX"/>
+        </w:rPr>
+        <w:t xml:space="preserve">t</w:t>
+      </w:r>
+      <w:r>
+        <w:rPr>
+          <w:rFonts w:asciiTheme="minorHAnsi" w:eastAsia="Georgia" w:hAnsiTheme="minorHAnsi" w:cstheme="minorHAnsi"/>
+          <w:color w:val="000000"/>
+          <w:sz w:val="20"/>
+          <w:szCs w:val="20"/>
+          <w:bdr w:val="nil"/>
+          <w:lang w:val="hr-HR" w:eastAsia="es-MX"/>
+        </w:rPr>
+        <w:t xml:space="preserve"> </w:t>
+      </w:r>
+      <w:r>
+        <w:rPr>
+          <w:rFonts w:asciiTheme="minorHAnsi" w:eastAsia="Georgia" w:hAnsiTheme="minorHAnsi" w:cstheme="minorHAnsi"/>
+          <w:color w:val="000000"/>
+          <w:sz w:val="20"/>
+          <w:szCs w:val="20"/>
+          <w:bdr w:val="nil"/>
+          <w:lang w:val="hr-HR" w:eastAsia="es-MX"/>
+        </w:rPr>
+        <w:t xml:space="preserve">= −2.22 with week clusters), and all four tests survive the rule re-applied with week-clustered statistics.</w:t>
+      </w:r>
     </w:p>
     <w:p>
       <w:pPr>
@@ -9365,7 +9633,492 @@
           <w:bdr w:val="nil"/>
           <w:lang w:val="hr-HR" w:eastAsia="es-MX"/>
         </w:rPr>
-        <w:t xml:space="preserve">Without market capitalization or accounting data, we cannot test the size and earnings-to-price effects that Huang et al. (2023) find in Vietnam, so our null does not contradict theirs. A short sample, which leaves a premium of a tenth of a percentage point per week below the MDE, and limits that censor the highs and lows of range-based characteristics can each produce the null, and we draw no conclusion about market efficiency from it.</w:t>
+        <w:t xml:space="preserve">For ceilings, the five-day result comes from the first day: over days</w:t>
+      </w:r>
+      <w:r>
+        <w:rPr>
+          <w:rFonts w:asciiTheme="minorHAnsi" w:eastAsia="Georgia" w:hAnsiTheme="minorHAnsi" w:cstheme="minorHAnsi"/>
+          <w:color w:val="000000"/>
+          <w:sz w:val="20"/>
+          <w:szCs w:val="20"/>
+          <w:bdr w:val="nil"/>
+          <w:lang w:val="hr-HR" w:eastAsia="es-MX"/>
+        </w:rPr>
+        <w:t xml:space="preserve"> </w:t>
+      </w:r>
+      <w:r>
+        <w:rPr>
+          <w:rFonts w:asciiTheme="minorHAnsi" w:eastAsia="Georgia" w:hAnsiTheme="minorHAnsi" w:cstheme="minorHAnsi"/>
+          <w:i/>
+          <w:color w:val="000000"/>
+          <w:sz w:val="20"/>
+          <w:szCs w:val="20"/>
+          <w:bdr w:val="nil"/>
+          <w:lang w:val="hr-HR" w:eastAsia="es-MX"/>
+        </w:rPr>
+        <w:t xml:space="preserve">d</w:t>
+      </w:r>
+      <w:r>
+        <w:rPr>
+          <w:rFonts w:asciiTheme="minorHAnsi" w:eastAsia="Georgia" w:hAnsiTheme="minorHAnsi" w:cstheme="minorHAnsi"/>
+          <w:color w:val="000000"/>
+          <w:sz w:val="20"/>
+          <w:szCs w:val="20"/>
+          <w:bdr w:val="nil"/>
+          <w:lang w:val="hr-HR" w:eastAsia="es-MX"/>
+        </w:rPr>
+        <w:t xml:space="preserve">+2 to</w:t>
+      </w:r>
+      <w:r>
+        <w:rPr>
+          <w:rFonts w:asciiTheme="minorHAnsi" w:eastAsia="Georgia" w:hAnsiTheme="minorHAnsi" w:cstheme="minorHAnsi"/>
+          <w:color w:val="000000"/>
+          <w:sz w:val="20"/>
+          <w:szCs w:val="20"/>
+          <w:bdr w:val="nil"/>
+          <w:lang w:val="hr-HR" w:eastAsia="es-MX"/>
+        </w:rPr>
+        <w:t xml:space="preserve"> </w:t>
+      </w:r>
+      <w:r>
+        <w:rPr>
+          <w:rFonts w:asciiTheme="minorHAnsi" w:eastAsia="Georgia" w:hAnsiTheme="minorHAnsi" w:cstheme="minorHAnsi"/>
+          <w:i/>
+          <w:color w:val="000000"/>
+          <w:sz w:val="20"/>
+          <w:szCs w:val="20"/>
+          <w:bdr w:val="nil"/>
+          <w:lang w:val="hr-HR" w:eastAsia="es-MX"/>
+        </w:rPr>
+        <w:t xml:space="preserve">d</w:t>
+      </w:r>
+      <w:r>
+        <w:rPr>
+          <w:rFonts w:asciiTheme="minorHAnsi" w:eastAsia="Georgia" w:hAnsiTheme="minorHAnsi" w:cstheme="minorHAnsi"/>
+          <w:color w:val="000000"/>
+          <w:sz w:val="20"/>
+          <w:szCs w:val="20"/>
+          <w:bdr w:val="nil"/>
+          <w:lang w:val="hr-HR" w:eastAsia="es-MX"/>
+        </w:rPr>
+        <w:t xml:space="preserve">+5 the ceiling return is −0.24% (</w:t>
+      </w:r>
+      <w:r>
+        <w:rPr>
+          <w:rFonts w:asciiTheme="minorHAnsi" w:eastAsia="Georgia" w:hAnsiTheme="minorHAnsi" w:cstheme="minorHAnsi"/>
+          <w:i/>
+          <w:color w:val="000000"/>
+          <w:sz w:val="20"/>
+          <w:szCs w:val="20"/>
+          <w:bdr w:val="nil"/>
+          <w:lang w:val="hr-HR" w:eastAsia="es-MX"/>
+        </w:rPr>
+        <w:t xml:space="preserve">t</w:t>
+      </w:r>
+      <w:r>
+        <w:rPr>
+          <w:rFonts w:asciiTheme="minorHAnsi" w:eastAsia="Georgia" w:hAnsiTheme="minorHAnsi" w:cstheme="minorHAnsi"/>
+          <w:color w:val="000000"/>
+          <w:sz w:val="20"/>
+          <w:szCs w:val="20"/>
+          <w:bdr w:val="nil"/>
+          <w:lang w:val="hr-HR" w:eastAsia="es-MX"/>
+        </w:rPr>
+        <w:t xml:space="preserve"> </w:t>
+      </w:r>
+      <w:r>
+        <w:rPr>
+          <w:rFonts w:asciiTheme="minorHAnsi" w:eastAsia="Georgia" w:hAnsiTheme="minorHAnsi" w:cstheme="minorHAnsi"/>
+          <w:color w:val="000000"/>
+          <w:sz w:val="20"/>
+          <w:szCs w:val="20"/>
+          <w:bdr w:val="nil"/>
+          <w:lang w:val="hr-HR" w:eastAsia="es-MX"/>
+        </w:rPr>
+        <w:t xml:space="preserve">= −1.53). After floor closes, days</w:t>
+      </w:r>
+      <w:r>
+        <w:rPr>
+          <w:rFonts w:asciiTheme="minorHAnsi" w:eastAsia="Georgia" w:hAnsiTheme="minorHAnsi" w:cstheme="minorHAnsi"/>
+          <w:color w:val="000000"/>
+          <w:sz w:val="20"/>
+          <w:szCs w:val="20"/>
+          <w:bdr w:val="nil"/>
+          <w:lang w:val="hr-HR" w:eastAsia="es-MX"/>
+        </w:rPr>
+        <w:t xml:space="preserve"> </w:t>
+      </w:r>
+      <w:r>
+        <w:rPr>
+          <w:rFonts w:asciiTheme="minorHAnsi" w:eastAsia="Georgia" w:hAnsiTheme="minorHAnsi" w:cstheme="minorHAnsi"/>
+          <w:i/>
+          <w:color w:val="000000"/>
+          <w:sz w:val="20"/>
+          <w:szCs w:val="20"/>
+          <w:bdr w:val="nil"/>
+          <w:lang w:val="hr-HR" w:eastAsia="es-MX"/>
+        </w:rPr>
+        <w:t xml:space="preserve">d</w:t>
+      </w:r>
+      <w:r>
+        <w:rPr>
+          <w:rFonts w:asciiTheme="minorHAnsi" w:eastAsia="Georgia" w:hAnsiTheme="minorHAnsi" w:cstheme="minorHAnsi"/>
+          <w:color w:val="000000"/>
+          <w:sz w:val="20"/>
+          <w:szCs w:val="20"/>
+          <w:bdr w:val="nil"/>
+          <w:lang w:val="hr-HR" w:eastAsia="es-MX"/>
+        </w:rPr>
+        <w:t xml:space="preserve">+2 to</w:t>
+      </w:r>
+      <w:r>
+        <w:rPr>
+          <w:rFonts w:asciiTheme="minorHAnsi" w:eastAsia="Georgia" w:hAnsiTheme="minorHAnsi" w:cstheme="minorHAnsi"/>
+          <w:color w:val="000000"/>
+          <w:sz w:val="20"/>
+          <w:szCs w:val="20"/>
+          <w:bdr w:val="nil"/>
+          <w:lang w:val="hr-HR" w:eastAsia="es-MX"/>
+        </w:rPr>
+        <w:t xml:space="preserve"> </w:t>
+      </w:r>
+      <w:r>
+        <w:rPr>
+          <w:rFonts w:asciiTheme="minorHAnsi" w:eastAsia="Georgia" w:hAnsiTheme="minorHAnsi" w:cstheme="minorHAnsi"/>
+          <w:i/>
+          <w:color w:val="000000"/>
+          <w:sz w:val="20"/>
+          <w:szCs w:val="20"/>
+          <w:bdr w:val="nil"/>
+          <w:lang w:val="hr-HR" w:eastAsia="es-MX"/>
+        </w:rPr>
+        <w:t xml:space="preserve">d</w:t>
+      </w:r>
+      <w:r>
+        <w:rPr>
+          <w:rFonts w:asciiTheme="minorHAnsi" w:eastAsia="Georgia" w:hAnsiTheme="minorHAnsi" w:cstheme="minorHAnsi"/>
+          <w:color w:val="000000"/>
+          <w:sz w:val="20"/>
+          <w:szCs w:val="20"/>
+          <w:bdr w:val="nil"/>
+          <w:lang w:val="hr-HR" w:eastAsia="es-MX"/>
+        </w:rPr>
+        <w:t xml:space="preserve">+5 add −1.10% (</w:t>
+      </w:r>
+      <w:r>
+        <w:rPr>
+          <w:rFonts w:asciiTheme="minorHAnsi" w:eastAsia="Georgia" w:hAnsiTheme="minorHAnsi" w:cstheme="minorHAnsi"/>
+          <w:i/>
+          <w:color w:val="000000"/>
+          <w:sz w:val="20"/>
+          <w:szCs w:val="20"/>
+          <w:bdr w:val="nil"/>
+          <w:lang w:val="hr-HR" w:eastAsia="es-MX"/>
+        </w:rPr>
+        <w:t xml:space="preserve">t</w:t>
+      </w:r>
+      <w:r>
+        <w:rPr>
+          <w:rFonts w:asciiTheme="minorHAnsi" w:eastAsia="Georgia" w:hAnsiTheme="minorHAnsi" w:cstheme="minorHAnsi"/>
+          <w:color w:val="000000"/>
+          <w:sz w:val="20"/>
+          <w:szCs w:val="20"/>
+          <w:bdr w:val="nil"/>
+          <w:lang w:val="hr-HR" w:eastAsia="es-MX"/>
+        </w:rPr>
+        <w:t xml:space="preserve"> </w:t>
+      </w:r>
+      <w:r>
+        <w:rPr>
+          <w:rFonts w:asciiTheme="minorHAnsi" w:eastAsia="Georgia" w:hAnsiTheme="minorHAnsi" w:cstheme="minorHAnsi"/>
+          <w:color w:val="000000"/>
+          <w:sz w:val="20"/>
+          <w:szCs w:val="20"/>
+          <w:bdr w:val="nil"/>
+          <w:lang w:val="hr-HR" w:eastAsia="es-MX"/>
+        </w:rPr>
+        <w:t xml:space="preserve">= −2.91), but the confirmation-half week-clustered</w:t>
+      </w:r>
+      <w:r>
+        <w:rPr>
+          <w:rFonts w:asciiTheme="minorHAnsi" w:eastAsia="Georgia" w:hAnsiTheme="minorHAnsi" w:cstheme="minorHAnsi"/>
+          <w:color w:val="000000"/>
+          <w:sz w:val="20"/>
+          <w:szCs w:val="20"/>
+          <w:bdr w:val="nil"/>
+          <w:lang w:val="hr-HR" w:eastAsia="es-MX"/>
+        </w:rPr>
+        <w:t xml:space="preserve"> </w:t>
+      </w:r>
+      <w:r>
+        <w:rPr>
+          <w:rFonts w:asciiTheme="minorHAnsi" w:eastAsia="Georgia" w:hAnsiTheme="minorHAnsi" w:cstheme="minorHAnsi"/>
+          <w:i/>
+          <w:color w:val="000000"/>
+          <w:sz w:val="20"/>
+          <w:szCs w:val="20"/>
+          <w:bdr w:val="nil"/>
+          <w:lang w:val="hr-HR" w:eastAsia="es-MX"/>
+        </w:rPr>
+        <w:t xml:space="preserve">t</w:t>
+      </w:r>
+      <w:r>
+        <w:rPr>
+          <w:rFonts w:asciiTheme="minorHAnsi" w:eastAsia="Georgia" w:hAnsiTheme="minorHAnsi" w:cstheme="minorHAnsi"/>
+          <w:color w:val="000000"/>
+          <w:sz w:val="20"/>
+          <w:szCs w:val="20"/>
+          <w:bdr w:val="nil"/>
+          <w:lang w:val="hr-HR" w:eastAsia="es-MX"/>
+        </w:rPr>
+        <w:t xml:space="preserve"> </w:t>
+      </w:r>
+      <w:r>
+        <w:rPr>
+          <w:rFonts w:asciiTheme="minorHAnsi" w:eastAsia="Georgia" w:hAnsiTheme="minorHAnsi" w:cstheme="minorHAnsi"/>
+          <w:color w:val="000000"/>
+          <w:sz w:val="20"/>
+          <w:szCs w:val="20"/>
+          <w:bdr w:val="nil"/>
+          <w:lang w:val="hr-HR" w:eastAsia="es-MX"/>
+        </w:rPr>
+        <w:t xml:space="preserve">is −1.14. With days</w:t>
+      </w:r>
+      <w:r>
+        <w:rPr>
+          <w:rFonts w:asciiTheme="minorHAnsi" w:eastAsia="Georgia" w:hAnsiTheme="minorHAnsi" w:cstheme="minorHAnsi"/>
+          <w:color w:val="000000"/>
+          <w:sz w:val="20"/>
+          <w:szCs w:val="20"/>
+          <w:bdr w:val="nil"/>
+          <w:lang w:val="hr-HR" w:eastAsia="es-MX"/>
+        </w:rPr>
+        <w:t xml:space="preserve"> </w:t>
+      </w:r>
+      <w:r>
+        <w:rPr>
+          <w:rFonts w:asciiTheme="minorHAnsi" w:eastAsia="Georgia" w:hAnsiTheme="minorHAnsi" w:cstheme="minorHAnsi"/>
+          <w:i/>
+          <w:color w:val="000000"/>
+          <w:sz w:val="20"/>
+          <w:szCs w:val="20"/>
+          <w:bdr w:val="nil"/>
+          <w:lang w:val="hr-HR" w:eastAsia="es-MX"/>
+        </w:rPr>
+        <w:t xml:space="preserve">d</w:t>
+      </w:r>
+      <w:r>
+        <w:rPr>
+          <w:rFonts w:asciiTheme="minorHAnsi" w:eastAsia="Georgia" w:hAnsiTheme="minorHAnsi" w:cstheme="minorHAnsi"/>
+          <w:color w:val="000000"/>
+          <w:sz w:val="20"/>
+          <w:szCs w:val="20"/>
+          <w:bdr w:val="nil"/>
+          <w:lang w:val="hr-HR" w:eastAsia="es-MX"/>
+        </w:rPr>
+        <w:t xml:space="preserve">+2 to</w:t>
+      </w:r>
+      <w:r>
+        <w:rPr>
+          <w:rFonts w:asciiTheme="minorHAnsi" w:eastAsia="Georgia" w:hAnsiTheme="minorHAnsi" w:cstheme="minorHAnsi"/>
+          <w:color w:val="000000"/>
+          <w:sz w:val="20"/>
+          <w:szCs w:val="20"/>
+          <w:bdr w:val="nil"/>
+          <w:lang w:val="hr-HR" w:eastAsia="es-MX"/>
+        </w:rPr>
+        <w:t xml:space="preserve"> </w:t>
+      </w:r>
+      <w:r>
+        <w:rPr>
+          <w:rFonts w:asciiTheme="minorHAnsi" w:eastAsia="Georgia" w:hAnsiTheme="minorHAnsi" w:cstheme="minorHAnsi"/>
+          <w:i/>
+          <w:color w:val="000000"/>
+          <w:sz w:val="20"/>
+          <w:szCs w:val="20"/>
+          <w:bdr w:val="nil"/>
+          <w:lang w:val="hr-HR" w:eastAsia="es-MX"/>
+        </w:rPr>
+        <w:t xml:space="preserve">d</w:t>
+      </w:r>
+      <w:r>
+        <w:rPr>
+          <w:rFonts w:asciiTheme="minorHAnsi" w:eastAsia="Georgia" w:hAnsiTheme="minorHAnsi" w:cstheme="minorHAnsi"/>
+          <w:color w:val="000000"/>
+          <w:sz w:val="20"/>
+          <w:szCs w:val="20"/>
+          <w:bdr w:val="nil"/>
+          <w:lang w:val="hr-HR" w:eastAsia="es-MX"/>
+        </w:rPr>
+        <w:t xml:space="preserve">+5 as the second horizon, the ceiling test would fail and the floor test would fail the confirmation criterion. Ceiling closes carry a one-day effect, and floor closes a one-day effect plus some later drift. These tests support H</w:t>
+      </w:r>
+      <w:r>
+        <w:rPr>
+          <w:rFonts w:asciiTheme="minorHAnsi" w:eastAsia="Georgia" w:hAnsiTheme="minorHAnsi" w:cstheme="minorHAnsi"/>
+          <w:color w:val="000000"/>
+          <w:sz w:val="20"/>
+          <w:szCs w:val="20"/>
+          <w:bdr w:val="nil"/>
+          <w:vertAlign w:val="subscript"/>
+          <w:lang w:val="hr-HR" w:eastAsia="es-MX"/>
+        </w:rPr>
+        <w:t xml:space="preserve">1</w:t>
+      </w:r>
+      <w:r>
+        <w:rPr>
+          <w:rFonts w:asciiTheme="minorHAnsi" w:eastAsia="Georgia" w:hAnsiTheme="minorHAnsi" w:cstheme="minorHAnsi"/>
+          <w:color w:val="000000"/>
+          <w:sz w:val="20"/>
+          <w:szCs w:val="20"/>
+          <w:bdr w:val="nil"/>
+          <w:lang w:val="hr-HR" w:eastAsia="es-MX"/>
+        </w:rPr>
+        <w:t xml:space="preserve">: limit closes predict the next day’s abnormal return, whereas none of the 22 characteristics passes the same screen at its weekly horizon.</w:t>
+      </w:r>
+    </w:p>
+    <w:p>
+      <w:pPr>
+        <w:keepNext/>
+        <w:tabs>
+          <w:tab w:val="left" w:pos="1740"/>
+        </w:tabs>
+        <w:spacing w:after="0" w:line="240" w:lineRule="auto"/>
+        <w:ind w:firstLine="567"/>
+        <w:jc w:val="both"/>
+        <w:rPr>
+          <w:rFonts w:asciiTheme="minorHAnsi" w:eastAsia="Georgia" w:hAnsiTheme="minorHAnsi" w:cstheme="minorHAnsi"/>
+          <w:bCs/>
+          <w:color w:val="000000"/>
+          <w:sz w:val="20"/>
+          <w:szCs w:val="20"/>
+          <w:u w:color="000000"/>
+          <w:bdr w:val="nil"/>
+          <w:lang w:val="hr-HR" w:eastAsia="es-MX"/>
+        </w:rPr>
+      </w:pPr>
+      <w:r>
+        <w:rPr>
+          <w:rFonts w:asciiTheme="minorHAnsi" w:eastAsia="Georgia" w:hAnsiTheme="minorHAnsi" w:cstheme="minorHAnsi"/>
+          <w:color w:val="000000"/>
+          <w:sz w:val="20"/>
+          <w:szCs w:val="20"/>
+          <w:bdr w:val="nil"/>
+          <w:lang w:val="hr-HR" w:eastAsia="es-MX"/>
+        </w:rPr>
+        <w:t xml:space="preserve">Table 2 decomposes the next-day return as in Equation (5). After a ceiling close the overnight gap is 2.24% (two-way-clustered</w:t>
+      </w:r>
+      <w:r>
+        <w:rPr>
+          <w:rFonts w:asciiTheme="minorHAnsi" w:eastAsia="Georgia" w:hAnsiTheme="minorHAnsi" w:cstheme="minorHAnsi"/>
+          <w:color w:val="000000"/>
+          <w:sz w:val="20"/>
+          <w:szCs w:val="20"/>
+          <w:bdr w:val="nil"/>
+          <w:lang w:val="hr-HR" w:eastAsia="es-MX"/>
+        </w:rPr>
+        <w:t xml:space="preserve"> </w:t>
+      </w:r>
+      <w:r>
+        <w:rPr>
+          <w:rFonts w:asciiTheme="minorHAnsi" w:eastAsia="Georgia" w:hAnsiTheme="minorHAnsi" w:cstheme="minorHAnsi"/>
+          <w:i/>
+          <w:color w:val="000000"/>
+          <w:sz w:val="20"/>
+          <w:szCs w:val="20"/>
+          <w:bdr w:val="nil"/>
+          <w:lang w:val="hr-HR" w:eastAsia="es-MX"/>
+        </w:rPr>
+        <w:t xml:space="preserve">t</w:t>
+      </w:r>
+      <w:r>
+        <w:rPr>
+          <w:rFonts w:asciiTheme="minorHAnsi" w:eastAsia="Georgia" w:hAnsiTheme="minorHAnsi" w:cstheme="minorHAnsi"/>
+          <w:color w:val="000000"/>
+          <w:sz w:val="20"/>
+          <w:szCs w:val="20"/>
+          <w:bdr w:val="nil"/>
+          <w:lang w:val="hr-HR" w:eastAsia="es-MX"/>
+        </w:rPr>
+        <w:t xml:space="preserve"> </w:t>
+      </w:r>
+      <w:r>
+        <w:rPr>
+          <w:rFonts w:asciiTheme="minorHAnsi" w:eastAsia="Georgia" w:hAnsiTheme="minorHAnsi" w:cstheme="minorHAnsi"/>
+          <w:color w:val="000000"/>
+          <w:sz w:val="20"/>
+          <w:szCs w:val="20"/>
+          <w:bdr w:val="nil"/>
+          <w:lang w:val="hr-HR" w:eastAsia="es-MX"/>
+        </w:rPr>
+        <w:t xml:space="preserve">= 9.7) and the intraday return is −0.54% (</w:t>
+      </w:r>
+      <w:r>
+        <w:rPr>
+          <w:rFonts w:asciiTheme="minorHAnsi" w:eastAsia="Georgia" w:hAnsiTheme="minorHAnsi" w:cstheme="minorHAnsi"/>
+          <w:i/>
+          <w:color w:val="000000"/>
+          <w:sz w:val="20"/>
+          <w:szCs w:val="20"/>
+          <w:bdr w:val="nil"/>
+          <w:lang w:val="hr-HR" w:eastAsia="es-MX"/>
+        </w:rPr>
+        <w:t xml:space="preserve">t</w:t>
+      </w:r>
+      <w:r>
+        <w:rPr>
+          <w:rFonts w:asciiTheme="minorHAnsi" w:eastAsia="Georgia" w:hAnsiTheme="minorHAnsi" w:cstheme="minorHAnsi"/>
+          <w:color w:val="000000"/>
+          <w:sz w:val="20"/>
+          <w:szCs w:val="20"/>
+          <w:bdr w:val="nil"/>
+          <w:lang w:val="hr-HR" w:eastAsia="es-MX"/>
+        </w:rPr>
+        <w:t xml:space="preserve"> </w:t>
+      </w:r>
+      <w:r>
+        <w:rPr>
+          <w:rFonts w:asciiTheme="minorHAnsi" w:eastAsia="Georgia" w:hAnsiTheme="minorHAnsi" w:cstheme="minorHAnsi"/>
+          <w:color w:val="000000"/>
+          <w:sz w:val="20"/>
+          <w:szCs w:val="20"/>
+          <w:bdr w:val="nil"/>
+          <w:lang w:val="hr-HR" w:eastAsia="es-MX"/>
+        </w:rPr>
+        <w:t xml:space="preserve">= −3.5): the session reverses about 24% of the gap, and the close-to-close effect is positive because the gap exceeds the giveback. The effect sits in the opening auction, as H</w:t>
+      </w:r>
+      <w:r>
+        <w:rPr>
+          <w:rFonts w:asciiTheme="minorHAnsi" w:eastAsia="Georgia" w:hAnsiTheme="minorHAnsi" w:cstheme="minorHAnsi"/>
+          <w:color w:val="000000"/>
+          <w:sz w:val="20"/>
+          <w:szCs w:val="20"/>
+          <w:bdr w:val="nil"/>
+          <w:vertAlign w:val="subscript"/>
+          <w:lang w:val="hr-HR" w:eastAsia="es-MX"/>
+        </w:rPr>
+        <w:t xml:space="preserve">2</w:t>
+      </w:r>
+      <w:r>
+        <w:rPr>
+          <w:rFonts w:asciiTheme="minorHAnsi" w:eastAsia="Georgia" w:hAnsiTheme="minorHAnsi" w:cstheme="minorHAnsi"/>
+          <w:color w:val="000000"/>
+          <w:sz w:val="20"/>
+          <w:szCs w:val="20"/>
+          <w:bdr w:val="nil"/>
+          <w:lang w:val="hr-HR" w:eastAsia="es-MX"/>
+        </w:rPr>
+        <w:t xml:space="preserve"> </w:t>
+      </w:r>
+      <w:r>
+        <w:rPr>
+          <w:rFonts w:asciiTheme="minorHAnsi" w:eastAsia="Georgia" w:hAnsiTheme="minorHAnsi" w:cstheme="minorHAnsi"/>
+          <w:color w:val="000000"/>
+          <w:sz w:val="20"/>
+          <w:szCs w:val="20"/>
+          <w:bdr w:val="nil"/>
+          <w:lang w:val="hr-HR" w:eastAsia="es-MX"/>
+        </w:rPr>
+        <w:t xml:space="preserve">predicts. A stock that closes at its ceiling may carry unfilled buy orders into the night; those orders and any overnight news would set the opening price, and the intraday reversal suggests that part of that price reflects transient demand.</w:t>
       </w:r>
     </w:p>
     <w:p>
@@ -9387,57 +10140,35 @@
           <w:lang w:val="hr-HR" w:eastAsia="es-MX"/>
         </w:rPr>
       </w:pPr>
-    </w:p>
-    <w:p>
-      <w:pPr>
-        <w:keepNext/>
-        <w:tabs>
-          <w:tab w:val="left" w:pos="1740"/>
-        </w:tabs>
-        <w:spacing w:after="0"/>
-        <w:jc w:val="center"/>
-        <w:rPr>
-          <w:rFonts w:asciiTheme="minorHAnsi" w:eastAsia="Georgia" w:hAnsiTheme="minorHAnsi" w:cstheme="minorHAnsi"/>
-          <w:bCs/>
-          <w:color w:val="000000"/>
-          <w:sz w:val="18"/>
-          <w:szCs w:val="18"/>
-          <w:u w:color="000000"/>
-          <w:bdr w:val="nil"/>
-          <w:lang w:val="hr-HR" w:eastAsia="es-MX"/>
-        </w:rPr>
-      </w:pPr>
-      <w:r>
-        <w:rPr>
-          <w:rFonts w:asciiTheme="minorHAnsi" w:eastAsia="Georgia" w:hAnsiTheme="minorHAnsi" w:cstheme="minorHAnsi"/>
-          <w:b/>
-          <w:bCs/>
-          <w:color w:val="632423" w:themeColor="accent2" w:themeShade="80"/>
-          <w:sz w:val="18"/>
-          <w:szCs w:val="18"/>
-          <w:u w:color="000000"/>
-          <w:bdr w:val="nil"/>
-          <w:lang w:val="hr-HR" w:eastAsia="es-MX"/>
-        </w:rPr>
-        <w:t xml:space="preserve">Table 1</w:t>
-      </w:r>
-      <w:r>
-        <w:rPr>
-          <w:rFonts w:asciiTheme="minorHAnsi" w:eastAsia="Georgia" w:hAnsiTheme="minorHAnsi" w:cstheme="minorHAnsi"/>
-          <w:color w:val="000000"/>
-          <w:sz w:val="18"/>
-          <w:szCs w:val="18"/>
-          <w:bdr w:val="nil"/>
-          <w:lang w:val="hr-HR" w:eastAsia="es-MX"/>
-        </w:rPr>
-        <w:t xml:space="preserve"> reports the event tests. Ceiling closes earn a market-adjusted return of 1.66% on day</w:t>
-      </w:r>
-      <w:r>
-        <w:rPr>
-          <w:rFonts w:asciiTheme="minorHAnsi" w:eastAsia="Georgia" w:hAnsiTheme="minorHAnsi" w:cstheme="minorHAnsi"/>
-          <w:color w:val="000000"/>
-          <w:sz w:val="18"/>
-          <w:szCs w:val="18"/>
+      <w:r>
+        <w:rPr>
+          <w:rFonts w:asciiTheme="minorHAnsi" w:eastAsia="Georgia" w:hAnsiTheme="minorHAnsi" w:cstheme="minorHAnsi"/>
+          <w:color w:val="000000"/>
+          <w:sz w:val="20"/>
+          <w:szCs w:val="20"/>
+          <w:bdr w:val="nil"/>
+          <w:lang w:val="hr-HR" w:eastAsia="es-MX"/>
+        </w:rPr>
+        <w:t xml:space="preserve">After a floor close the gap is −0.97% (</w:t>
+      </w:r>
+      <w:r>
+        <w:rPr>
+          <w:rFonts w:asciiTheme="minorHAnsi" w:eastAsia="Georgia" w:hAnsiTheme="minorHAnsi" w:cstheme="minorHAnsi"/>
+          <w:i/>
+          <w:color w:val="000000"/>
+          <w:sz w:val="20"/>
+          <w:szCs w:val="20"/>
+          <w:bdr w:val="nil"/>
+          <w:lang w:val="hr-HR" w:eastAsia="es-MX"/>
+        </w:rPr>
+        <w:t xml:space="preserve">t</w:t>
+      </w:r>
+      <w:r>
+        <w:rPr>
+          <w:rFonts w:asciiTheme="minorHAnsi" w:eastAsia="Georgia" w:hAnsiTheme="minorHAnsi" w:cstheme="minorHAnsi"/>
+          <w:color w:val="000000"/>
+          <w:sz w:val="20"/>
+          <w:szCs w:val="20"/>
           <w:bdr w:val="nil"/>
           <w:lang w:val="hr-HR" w:eastAsia="es-MX"/>
         </w:rPr>
@@ -9446,10 +10177,21 @@
       <w:r>
         <w:rPr>
           <w:rFonts w:asciiTheme="minorHAnsi" w:eastAsia="Georgia" w:hAnsiTheme="minorHAnsi" w:cstheme="minorHAnsi"/>
+          <w:color w:val="000000"/>
+          <w:sz w:val="20"/>
+          <w:szCs w:val="20"/>
+          <w:bdr w:val="nil"/>
+          <w:lang w:val="hr-HR" w:eastAsia="es-MX"/>
+        </w:rPr>
+        <w:t xml:space="preserve">= −4.6) and the intraday return is a weak reversal of 0.30%. The ceiling gap holds for exact limit hits (2.79%) and for the first day of a streak of exact hits (2.39%). Near hits show a smaller gap (1.67%) and no significant intraday return, but their median day-</w:t>
+      </w:r>
+      <w:r>
+        <w:rPr>
+          <w:rFonts w:asciiTheme="minorHAnsi" w:eastAsia="Georgia" w:hAnsiTheme="minorHAnsi" w:cstheme="minorHAnsi"/>
           <w:i/>
           <w:color w:val="000000"/>
-          <w:sz w:val="18"/>
-          <w:szCs w:val="18"/>
+          <w:sz w:val="20"/>
+          <w:szCs w:val="20"/>
           <w:bdr w:val="nil"/>
           <w:lang w:val="hr-HR" w:eastAsia="es-MX"/>
         </w:rPr>
@@ -9459,19 +10201,8 @@
         <w:rPr>
           <w:rFonts w:asciiTheme="minorHAnsi" w:eastAsia="Georgia" w:hAnsiTheme="minorHAnsi" w:cstheme="minorHAnsi"/>
           <w:color w:val="000000"/>
-          <w:sz w:val="18"/>
-          <w:szCs w:val="18"/>
-          <w:bdr w:val="nil"/>
-          <w:lang w:val="hr-HR" w:eastAsia="es-MX"/>
-        </w:rPr>
-        <w:t xml:space="preserve">+1 and 1.45% over days</w:t>
-      </w:r>
-      <w:r>
-        <w:rPr>
-          <w:rFonts w:asciiTheme="minorHAnsi" w:eastAsia="Georgia" w:hAnsiTheme="minorHAnsi" w:cstheme="minorHAnsi"/>
-          <w:color w:val="000000"/>
-          <w:sz w:val="18"/>
-          <w:szCs w:val="18"/>
+          <w:sz w:val="20"/>
+          <w:szCs w:val="20"/>
           <w:bdr w:val="nil"/>
           <w:lang w:val="hr-HR" w:eastAsia="es-MX"/>
         </w:rPr>
@@ -9480,32 +10211,32 @@
       <w:r>
         <w:rPr>
           <w:rFonts w:asciiTheme="minorHAnsi" w:eastAsia="Georgia" w:hAnsiTheme="minorHAnsi" w:cstheme="minorHAnsi"/>
+          <w:color w:val="000000"/>
+          <w:sz w:val="20"/>
+          <w:szCs w:val="20"/>
+          <w:bdr w:val="nil"/>
+          <w:lang w:val="hr-HR" w:eastAsia="es-MX"/>
+        </w:rPr>
+        <w:t xml:space="preserve">return is 6.89% against 6.90% for exact hits, and 83% of their closes are not multiples of the tick size. This points to later price adjustment by the vendor rather than to closes below the limit. The split is therefore weighted toward higher-priced stocks, where the tick is coarser, and we do not read the difference as a gradient toward the limit. The gap appears in both halves of the sample, on days locked at one price from open to close, and, for ceilings, in each tercile of 60-day average dollar volume (1.52% in the most liquid). Against same-date controls the ceiling gap is 2.70% and the floor close-to-close return −1.65%, so the floor effect depends on the benchmark. Floor events cluster on market-wide down days (740 of 2,111 remain without days on which the market fell more than 2%), and the floor gap is not significant in the least liquid tercile (</w:t>
+      </w:r>
+      <w:r>
+        <w:rPr>
+          <w:rFonts w:asciiTheme="minorHAnsi" w:eastAsia="Georgia" w:hAnsiTheme="minorHAnsi" w:cstheme="minorHAnsi"/>
           <w:i/>
           <w:color w:val="000000"/>
-          <w:sz w:val="18"/>
-          <w:szCs w:val="18"/>
-          <w:bdr w:val="nil"/>
-          <w:lang w:val="hr-HR" w:eastAsia="es-MX"/>
-        </w:rPr>
-        <w:t xml:space="preserve">d</w:t>
-      </w:r>
-      <w:r>
-        <w:rPr>
-          <w:rFonts w:asciiTheme="minorHAnsi" w:eastAsia="Georgia" w:hAnsiTheme="minorHAnsi" w:cstheme="minorHAnsi"/>
-          <w:color w:val="000000"/>
-          <w:sz w:val="18"/>
-          <w:szCs w:val="18"/>
-          <w:bdr w:val="nil"/>
-          <w:lang w:val="hr-HR" w:eastAsia="es-MX"/>
-        </w:rPr>
-        <w:t xml:space="preserve">+1 to</w:t>
-      </w:r>
-      <w:r>
-        <w:rPr>
-          <w:rFonts w:asciiTheme="minorHAnsi" w:eastAsia="Georgia" w:hAnsiTheme="minorHAnsi" w:cstheme="minorHAnsi"/>
-          <w:color w:val="000000"/>
-          <w:sz w:val="18"/>
-          <w:szCs w:val="18"/>
+          <w:sz w:val="20"/>
+          <w:szCs w:val="20"/>
+          <w:bdr w:val="nil"/>
+          <w:lang w:val="hr-HR" w:eastAsia="es-MX"/>
+        </w:rPr>
+        <w:t xml:space="preserve">t</w:t>
+      </w:r>
+      <w:r>
+        <w:rPr>
+          <w:rFonts w:asciiTheme="minorHAnsi" w:eastAsia="Georgia" w:hAnsiTheme="minorHAnsi" w:cstheme="minorHAnsi"/>
+          <w:color w:val="000000"/>
+          <w:sz w:val="20"/>
+          <w:szCs w:val="20"/>
           <w:bdr w:val="nil"/>
           <w:lang w:val="hr-HR" w:eastAsia="es-MX"/>
         </w:rPr>
@@ -9514,161 +10245,13 @@
       <w:r>
         <w:rPr>
           <w:rFonts w:asciiTheme="minorHAnsi" w:eastAsia="Georgia" w:hAnsiTheme="minorHAnsi" w:cstheme="minorHAnsi"/>
-          <w:i/>
-          <w:color w:val="000000"/>
-          <w:sz w:val="18"/>
-          <w:szCs w:val="18"/>
-          <w:bdr w:val="nil"/>
-          <w:lang w:val="hr-HR" w:eastAsia="es-MX"/>
-        </w:rPr>
-        <w:t xml:space="preserve">d</w:t>
-      </w:r>
-      <w:r>
-        <w:rPr>
-          <w:rFonts w:asciiTheme="minorHAnsi" w:eastAsia="Georgia" w:hAnsiTheme="minorHAnsi" w:cstheme="minorHAnsi"/>
-          <w:color w:val="000000"/>
-          <w:sz w:val="18"/>
-          <w:szCs w:val="18"/>
-          <w:bdr w:val="nil"/>
-          <w:lang w:val="hr-HR" w:eastAsia="es-MX"/>
-        </w:rPr>
-        <w:t xml:space="preserve">+5, and floor closes earn −0.71% and −1.76%. All four tests survive the BH control (Equation (8); adjusted</w:t>
-      </w:r>
-      <w:r>
-        <w:rPr>
-          <w:rFonts w:asciiTheme="minorHAnsi" w:eastAsia="Georgia" w:hAnsiTheme="minorHAnsi" w:cstheme="minorHAnsi"/>
-          <w:color w:val="000000"/>
-          <w:sz w:val="18"/>
-          <w:szCs w:val="18"/>
-          <w:bdr w:val="nil"/>
-          <w:lang w:val="hr-HR" w:eastAsia="es-MX"/>
-        </w:rPr>
-        <w:t xml:space="preserve"> </w:t>
-      </w:r>
-      <w:r>
-        <w:rPr>
-          <w:rFonts w:asciiTheme="minorHAnsi" w:eastAsia="Georgia" w:hAnsiTheme="minorHAnsi" w:cstheme="minorHAnsi"/>
-          <w:i/>
-          <w:color w:val="000000"/>
-          <w:sz w:val="18"/>
-          <w:szCs w:val="18"/>
-          <w:bdr w:val="nil"/>
-          <w:lang w:val="hr-HR" w:eastAsia="es-MX"/>
-        </w:rPr>
-        <w:t xml:space="preserve">p</w:t>
-      </w:r>
-      <w:r>
-        <w:rPr>
-          <w:rFonts w:asciiTheme="minorHAnsi" w:eastAsia="Georgia" w:hAnsiTheme="minorHAnsi" w:cstheme="minorHAnsi"/>
-          <w:color w:val="000000"/>
-          <w:sz w:val="18"/>
-          <w:szCs w:val="18"/>
-          <w:bdr w:val="nil"/>
-          <w:lang w:val="hr-HR" w:eastAsia="es-MX"/>
-        </w:rPr>
-        <w:t xml:space="preserve">-values of at most 0.0004), keep their signs in both halves, and exceed |</w:t>
-      </w:r>
-      <w:r>
-        <w:rPr>
-          <w:rFonts w:asciiTheme="minorHAnsi" w:eastAsia="Georgia" w:hAnsiTheme="minorHAnsi" w:cstheme="minorHAnsi"/>
-          <w:i/>
-          <w:color w:val="000000"/>
-          <w:sz w:val="18"/>
-          <w:szCs w:val="18"/>
-          <w:bdr w:val="nil"/>
-          <w:lang w:val="hr-HR" w:eastAsia="es-MX"/>
-        </w:rPr>
-        <w:t xml:space="preserve">t</w:t>
-      </w:r>
-      <w:r>
-        <w:rPr>
-          <w:rFonts w:asciiTheme="minorHAnsi" w:eastAsia="Georgia" w:hAnsiTheme="minorHAnsi" w:cstheme="minorHAnsi"/>
-          <w:color w:val="000000"/>
-          <w:sz w:val="18"/>
-          <w:szCs w:val="18"/>
-          <w:bdr w:val="nil"/>
-          <w:lang w:val="hr-HR" w:eastAsia="es-MX"/>
-        </w:rPr>
-        <w:t xml:space="preserve">| = 1.96 in the confirmation half. Clustering by calendar week or 10-day block, with a</w:t>
-      </w:r>
-      <w:r>
-        <w:rPr>
-          <w:rFonts w:asciiTheme="minorHAnsi" w:eastAsia="Georgia" w:hAnsiTheme="minorHAnsi" w:cstheme="minorHAnsi"/>
-          <w:color w:val="000000"/>
-          <w:sz w:val="18"/>
-          <w:szCs w:val="18"/>
-          <w:bdr w:val="nil"/>
-          <w:lang w:val="hr-HR" w:eastAsia="es-MX"/>
-        </w:rPr>
-        <w:t xml:space="preserve"> </w:t>
-      </w:r>
-      <w:r>
-        <w:rPr>
-          <w:rFonts w:asciiTheme="minorHAnsi" w:eastAsia="Georgia" w:hAnsiTheme="minorHAnsi" w:cstheme="minorHAnsi"/>
-          <w:i/>
-          <w:color w:val="000000"/>
-          <w:sz w:val="18"/>
-          <w:szCs w:val="18"/>
-          <w:bdr w:val="nil"/>
-          <w:lang w:val="hr-HR" w:eastAsia="es-MX"/>
-        </w:rPr>
-        <w:t xml:space="preserve">t</w:t>
-      </w:r>
-      <w:r>
-        <w:rPr>
-          <w:rFonts w:asciiTheme="minorHAnsi" w:eastAsia="Georgia" w:hAnsiTheme="minorHAnsi" w:cstheme="minorHAnsi"/>
-          <w:color w:val="000000"/>
-          <w:sz w:val="18"/>
-          <w:szCs w:val="18"/>
-          <w:bdr w:val="nil"/>
-          <w:lang w:val="hr-HR" w:eastAsia="es-MX"/>
-        </w:rPr>
-        <w:t xml:space="preserve"> </w:t>
-      </w:r>
-      <w:r>
-        <w:rPr>
-          <w:rFonts w:asciiTheme="minorHAnsi" w:eastAsia="Georgia" w:hAnsiTheme="minorHAnsi" w:cstheme="minorHAnsi"/>
-          <w:color w:val="000000"/>
-          <w:sz w:val="18"/>
-          <w:szCs w:val="18"/>
-          <w:bdr w:val="nil"/>
-          <w:lang w:val="hr-HR" w:eastAsia="es-MX"/>
-        </w:rPr>
-        <w:t xml:space="preserve">reference, leaves all four significant. The floor five-day test clears the confirmation criterion by the smallest margin (</w:t>
-      </w:r>
-      <w:r>
-        <w:rPr>
-          <w:rFonts w:asciiTheme="minorHAnsi" w:eastAsia="Georgia" w:hAnsiTheme="minorHAnsi" w:cstheme="minorHAnsi"/>
-          <w:i/>
-          <w:color w:val="000000"/>
-          <w:sz w:val="18"/>
-          <w:szCs w:val="18"/>
-          <w:bdr w:val="nil"/>
-          <w:lang w:val="hr-HR" w:eastAsia="es-MX"/>
-        </w:rPr>
-        <w:t xml:space="preserve">t</w:t>
-      </w:r>
-      <w:r>
-        <w:rPr>
-          <w:rFonts w:asciiTheme="minorHAnsi" w:eastAsia="Georgia" w:hAnsiTheme="minorHAnsi" w:cstheme="minorHAnsi"/>
-          <w:color w:val="000000"/>
-          <w:sz w:val="18"/>
-          <w:szCs w:val="18"/>
-          <w:bdr w:val="nil"/>
-          <w:lang w:val="hr-HR" w:eastAsia="es-MX"/>
-        </w:rPr>
-        <w:t xml:space="preserve"> </w:t>
-      </w:r>
-      <w:r>
-        <w:rPr>
-          <w:rFonts w:asciiTheme="minorHAnsi" w:eastAsia="Georgia" w:hAnsiTheme="minorHAnsi" w:cstheme="minorHAnsi"/>
-          <w:color w:val="000000"/>
-          <w:sz w:val="18"/>
-          <w:szCs w:val="18"/>
-          <w:bdr w:val="nil"/>
-          <w:lang w:val="hr-HR" w:eastAsia="es-MX"/>
-        </w:rPr>
-        <w:t xml:space="preserve">= −2.22 with week clusters), and all four tests survive the rule re-applied with week-clustered statistics.</w:t>
+          <w:color w:val="000000"/>
+          <w:sz w:val="20"/>
+          <w:szCs w:val="20"/>
+          <w:bdr w:val="nil"/>
+          <w:lang w:val="hr-HR" w:eastAsia="es-MX"/>
+        </w:rPr>
+        <w:t xml:space="preserve">= −1.0).</w:t>
       </w:r>
     </w:p>
     <w:p>
@@ -9699,7 +10282,19 @@
           <w:bdr w:val="nil"/>
           <w:lang w:val="hr-HR" w:eastAsia="es-MX"/>
         </w:rPr>
-        <w:t xml:space="preserve">For ceilings, the five-day result comes from the first day: over days</w:t>
+        <w:t xml:space="preserve">An outside buyer cannot capture the close-to-close continuation: a buyer who wants a stock at its ceiling joins a queue at the close, so the first obtainable price is the next open, which already contains the gap. From that open the ceiling return through the fifth close is −0.75% against the market (</w:t>
+      </w:r>
+      <w:r>
+        <w:rPr>
+          <w:rFonts w:asciiTheme="minorHAnsi" w:eastAsia="Georgia" w:hAnsiTheme="minorHAnsi" w:cstheme="minorHAnsi"/>
+          <w:i/>
+          <w:color w:val="000000"/>
+          <w:sz w:val="20"/>
+          <w:szCs w:val="20"/>
+          <w:bdr w:val="nil"/>
+          <w:lang w:val="hr-HR" w:eastAsia="es-MX"/>
+        </w:rPr>
+        <w:t xml:space="preserve">t</w:t>
       </w:r>
       <w:r>
         <w:rPr>
@@ -9715,6 +10310,17 @@
       <w:r>
         <w:rPr>
           <w:rFonts w:asciiTheme="minorHAnsi" w:eastAsia="Georgia" w:hAnsiTheme="minorHAnsi" w:cstheme="minorHAnsi"/>
+          <w:color w:val="000000"/>
+          <w:sz w:val="20"/>
+          <w:szCs w:val="20"/>
+          <w:bdr w:val="nil"/>
+          <w:lang w:val="hr-HR" w:eastAsia="es-MX"/>
+        </w:rPr>
+        <w:t xml:space="preserve">= −2.7) and −0.53% against same-date controls (</w:t>
+      </w:r>
+      <w:r>
+        <w:rPr>
+          <w:rFonts w:asciiTheme="minorHAnsi" w:eastAsia="Georgia" w:hAnsiTheme="minorHAnsi" w:cstheme="minorHAnsi"/>
           <w:i/>
           <w:color w:val="000000"/>
           <w:sz w:val="20"/>
@@ -9722,18 +10328,7 @@
           <w:bdr w:val="nil"/>
           <w:lang w:val="hr-HR" w:eastAsia="es-MX"/>
         </w:rPr>
-        <w:t xml:space="preserve">d</w:t>
-      </w:r>
-      <w:r>
-        <w:rPr>
-          <w:rFonts w:asciiTheme="minorHAnsi" w:eastAsia="Georgia" w:hAnsiTheme="minorHAnsi" w:cstheme="minorHAnsi"/>
-          <w:color w:val="000000"/>
-          <w:sz w:val="20"/>
-          <w:szCs w:val="20"/>
-          <w:bdr w:val="nil"/>
-          <w:lang w:val="hr-HR" w:eastAsia="es-MX"/>
-        </w:rPr>
-        <w:t xml:space="preserve">+2 to</w:t>
+        <w:t xml:space="preserve">t</w:t>
       </w:r>
       <w:r>
         <w:rPr>
@@ -9749,6 +10344,40 @@
       <w:r>
         <w:rPr>
           <w:rFonts w:asciiTheme="minorHAnsi" w:eastAsia="Georgia" w:hAnsiTheme="minorHAnsi" w:cstheme="minorHAnsi"/>
+          <w:color w:val="000000"/>
+          <w:sz w:val="20"/>
+          <w:szCs w:val="20"/>
+          <w:bdr w:val="nil"/>
+          <w:lang w:val="hr-HR" w:eastAsia="es-MX"/>
+        </w:rPr>
+        <w:t xml:space="preserve">= −1.8), which supports H</w:t>
+      </w:r>
+      <w:r>
+        <w:rPr>
+          <w:rFonts w:asciiTheme="minorHAnsi" w:eastAsia="Georgia" w:hAnsiTheme="minorHAnsi" w:cstheme="minorHAnsi"/>
+          <w:color w:val="000000"/>
+          <w:sz w:val="20"/>
+          <w:szCs w:val="20"/>
+          <w:bdr w:val="nil"/>
+          <w:vertAlign w:val="subscript"/>
+          <w:lang w:val="hr-HR" w:eastAsia="es-MX"/>
+        </w:rPr>
+        <w:t xml:space="preserve">4</w:t>
+      </w:r>
+      <w:r>
+        <w:rPr>
+          <w:rFonts w:asciiTheme="minorHAnsi" w:eastAsia="Georgia" w:hAnsiTheme="minorHAnsi" w:cstheme="minorHAnsi"/>
+          <w:color w:val="000000"/>
+          <w:sz w:val="20"/>
+          <w:szCs w:val="20"/>
+          <w:bdr w:val="nil"/>
+          <w:lang w:val="hr-HR" w:eastAsia="es-MX"/>
+        </w:rPr>
+        <w:t xml:space="preserve">; a holder who sells at the next open avoids the intraday giveback. These figures use quoted prices and ignore achievable fills: 522 ceiling events were locked at one price all day, and some of these stocks opened at the limit the next day, where a buyer may be rationed. After floor closes, prices fall a further 0.82% from the next open to the fifth close against the market (</w:t>
+      </w:r>
+      <w:r>
+        <w:rPr>
+          <w:rFonts w:asciiTheme="minorHAnsi" w:eastAsia="Georgia" w:hAnsiTheme="minorHAnsi" w:cstheme="minorHAnsi"/>
           <w:i/>
           <w:color w:val="000000"/>
           <w:sz w:val="20"/>
@@ -9756,29 +10385,6 @@
           <w:bdr w:val="nil"/>
           <w:lang w:val="hr-HR" w:eastAsia="es-MX"/>
         </w:rPr>
-        <w:t xml:space="preserve">d</w:t>
-      </w:r>
-      <w:r>
-        <w:rPr>
-          <w:rFonts w:asciiTheme="minorHAnsi" w:eastAsia="Georgia" w:hAnsiTheme="minorHAnsi" w:cstheme="minorHAnsi"/>
-          <w:color w:val="000000"/>
-          <w:sz w:val="20"/>
-          <w:szCs w:val="20"/>
-          <w:bdr w:val="nil"/>
-          <w:lang w:val="hr-HR" w:eastAsia="es-MX"/>
-        </w:rPr>
-        <w:t xml:space="preserve">+5 the ceiling return is −0.24% (</w:t>
-      </w:r>
-      <w:r>
-        <w:rPr>
-          <w:rFonts w:asciiTheme="minorHAnsi" w:eastAsia="Georgia" w:hAnsiTheme="minorHAnsi" w:cstheme="minorHAnsi"/>
-          <w:i/>
-          <w:color w:val="000000"/>
-          <w:sz w:val="20"/>
-          <w:szCs w:val="20"/>
-          <w:bdr w:val="nil"/>
-          <w:lang w:val="hr-HR" w:eastAsia="es-MX"/>
-        </w:rPr>
         <w:t xml:space="preserve">t</w:t>
       </w:r>
       <w:r>
@@ -9801,245 +10407,7 @@
           <w:bdr w:val="nil"/>
           <w:lang w:val="hr-HR" w:eastAsia="es-MX"/>
         </w:rPr>
-        <w:t xml:space="preserve">= −1.53). After floor closes, days</w:t>
-      </w:r>
-      <w:r>
-        <w:rPr>
-          <w:rFonts w:asciiTheme="minorHAnsi" w:eastAsia="Georgia" w:hAnsiTheme="minorHAnsi" w:cstheme="minorHAnsi"/>
-          <w:color w:val="000000"/>
-          <w:sz w:val="20"/>
-          <w:szCs w:val="20"/>
-          <w:bdr w:val="nil"/>
-          <w:lang w:val="hr-HR" w:eastAsia="es-MX"/>
-        </w:rPr>
-        <w:t xml:space="preserve"> </w:t>
-      </w:r>
-      <w:r>
-        <w:rPr>
-          <w:rFonts w:asciiTheme="minorHAnsi" w:eastAsia="Georgia" w:hAnsiTheme="minorHAnsi" w:cstheme="minorHAnsi"/>
-          <w:i/>
-          <w:color w:val="000000"/>
-          <w:sz w:val="20"/>
-          <w:szCs w:val="20"/>
-          <w:bdr w:val="nil"/>
-          <w:lang w:val="hr-HR" w:eastAsia="es-MX"/>
-        </w:rPr>
-        <w:t xml:space="preserve">d</w:t>
-      </w:r>
-      <w:r>
-        <w:rPr>
-          <w:rFonts w:asciiTheme="minorHAnsi" w:eastAsia="Georgia" w:hAnsiTheme="minorHAnsi" w:cstheme="minorHAnsi"/>
-          <w:color w:val="000000"/>
-          <w:sz w:val="20"/>
-          <w:szCs w:val="20"/>
-          <w:bdr w:val="nil"/>
-          <w:lang w:val="hr-HR" w:eastAsia="es-MX"/>
-        </w:rPr>
-        <w:t xml:space="preserve">+2 to</w:t>
-      </w:r>
-      <w:r>
-        <w:rPr>
-          <w:rFonts w:asciiTheme="minorHAnsi" w:eastAsia="Georgia" w:hAnsiTheme="minorHAnsi" w:cstheme="minorHAnsi"/>
-          <w:color w:val="000000"/>
-          <w:sz w:val="20"/>
-          <w:szCs w:val="20"/>
-          <w:bdr w:val="nil"/>
-          <w:lang w:val="hr-HR" w:eastAsia="es-MX"/>
-        </w:rPr>
-        <w:t xml:space="preserve"> </w:t>
-      </w:r>
-      <w:r>
-        <w:rPr>
-          <w:rFonts w:asciiTheme="minorHAnsi" w:eastAsia="Georgia" w:hAnsiTheme="minorHAnsi" w:cstheme="minorHAnsi"/>
-          <w:i/>
-          <w:color w:val="000000"/>
-          <w:sz w:val="20"/>
-          <w:szCs w:val="20"/>
-          <w:bdr w:val="nil"/>
-          <w:lang w:val="hr-HR" w:eastAsia="es-MX"/>
-        </w:rPr>
-        <w:t xml:space="preserve">d</w:t>
-      </w:r>
-      <w:r>
-        <w:rPr>
-          <w:rFonts w:asciiTheme="minorHAnsi" w:eastAsia="Georgia" w:hAnsiTheme="minorHAnsi" w:cstheme="minorHAnsi"/>
-          <w:color w:val="000000"/>
-          <w:sz w:val="20"/>
-          <w:szCs w:val="20"/>
-          <w:bdr w:val="nil"/>
-          <w:lang w:val="hr-HR" w:eastAsia="es-MX"/>
-        </w:rPr>
-        <w:t xml:space="preserve">+5 add −1.10% (</w:t>
-      </w:r>
-      <w:r>
-        <w:rPr>
-          <w:rFonts w:asciiTheme="minorHAnsi" w:eastAsia="Georgia" w:hAnsiTheme="minorHAnsi" w:cstheme="minorHAnsi"/>
-          <w:i/>
-          <w:color w:val="000000"/>
-          <w:sz w:val="20"/>
-          <w:szCs w:val="20"/>
-          <w:bdr w:val="nil"/>
-          <w:lang w:val="hr-HR" w:eastAsia="es-MX"/>
-        </w:rPr>
-        <w:t xml:space="preserve">t</w:t>
-      </w:r>
-      <w:r>
-        <w:rPr>
-          <w:rFonts w:asciiTheme="minorHAnsi" w:eastAsia="Georgia" w:hAnsiTheme="minorHAnsi" w:cstheme="minorHAnsi"/>
-          <w:color w:val="000000"/>
-          <w:sz w:val="20"/>
-          <w:szCs w:val="20"/>
-          <w:bdr w:val="nil"/>
-          <w:lang w:val="hr-HR" w:eastAsia="es-MX"/>
-        </w:rPr>
-        <w:t xml:space="preserve"> </w:t>
-      </w:r>
-      <w:r>
-        <w:rPr>
-          <w:rFonts w:asciiTheme="minorHAnsi" w:eastAsia="Georgia" w:hAnsiTheme="minorHAnsi" w:cstheme="minorHAnsi"/>
-          <w:color w:val="000000"/>
-          <w:sz w:val="20"/>
-          <w:szCs w:val="20"/>
-          <w:bdr w:val="nil"/>
-          <w:lang w:val="hr-HR" w:eastAsia="es-MX"/>
-        </w:rPr>
-        <w:t xml:space="preserve">= −2.91), but the confirmation-half week-clustered</w:t>
-      </w:r>
-      <w:r>
-        <w:rPr>
-          <w:rFonts w:asciiTheme="minorHAnsi" w:eastAsia="Georgia" w:hAnsiTheme="minorHAnsi" w:cstheme="minorHAnsi"/>
-          <w:color w:val="000000"/>
-          <w:sz w:val="20"/>
-          <w:szCs w:val="20"/>
-          <w:bdr w:val="nil"/>
-          <w:lang w:val="hr-HR" w:eastAsia="es-MX"/>
-        </w:rPr>
-        <w:t xml:space="preserve"> </w:t>
-      </w:r>
-      <w:r>
-        <w:rPr>
-          <w:rFonts w:asciiTheme="minorHAnsi" w:eastAsia="Georgia" w:hAnsiTheme="minorHAnsi" w:cstheme="minorHAnsi"/>
-          <w:i/>
-          <w:color w:val="000000"/>
-          <w:sz w:val="20"/>
-          <w:szCs w:val="20"/>
-          <w:bdr w:val="nil"/>
-          <w:lang w:val="hr-HR" w:eastAsia="es-MX"/>
-        </w:rPr>
-        <w:t xml:space="preserve">t</w:t>
-      </w:r>
-      <w:r>
-        <w:rPr>
-          <w:rFonts w:asciiTheme="minorHAnsi" w:eastAsia="Georgia" w:hAnsiTheme="minorHAnsi" w:cstheme="minorHAnsi"/>
-          <w:color w:val="000000"/>
-          <w:sz w:val="20"/>
-          <w:szCs w:val="20"/>
-          <w:bdr w:val="nil"/>
-          <w:lang w:val="hr-HR" w:eastAsia="es-MX"/>
-        </w:rPr>
-        <w:t xml:space="preserve"> </w:t>
-      </w:r>
-      <w:r>
-        <w:rPr>
-          <w:rFonts w:asciiTheme="minorHAnsi" w:eastAsia="Georgia" w:hAnsiTheme="minorHAnsi" w:cstheme="minorHAnsi"/>
-          <w:color w:val="000000"/>
-          <w:sz w:val="20"/>
-          <w:szCs w:val="20"/>
-          <w:bdr w:val="nil"/>
-          <w:lang w:val="hr-HR" w:eastAsia="es-MX"/>
-        </w:rPr>
-        <w:t xml:space="preserve">is −1.14. With days</w:t>
-      </w:r>
-      <w:r>
-        <w:rPr>
-          <w:rFonts w:asciiTheme="minorHAnsi" w:eastAsia="Georgia" w:hAnsiTheme="minorHAnsi" w:cstheme="minorHAnsi"/>
-          <w:color w:val="000000"/>
-          <w:sz w:val="20"/>
-          <w:szCs w:val="20"/>
-          <w:bdr w:val="nil"/>
-          <w:lang w:val="hr-HR" w:eastAsia="es-MX"/>
-        </w:rPr>
-        <w:t xml:space="preserve"> </w:t>
-      </w:r>
-      <w:r>
-        <w:rPr>
-          <w:rFonts w:asciiTheme="minorHAnsi" w:eastAsia="Georgia" w:hAnsiTheme="minorHAnsi" w:cstheme="minorHAnsi"/>
-          <w:i/>
-          <w:color w:val="000000"/>
-          <w:sz w:val="20"/>
-          <w:szCs w:val="20"/>
-          <w:bdr w:val="nil"/>
-          <w:lang w:val="hr-HR" w:eastAsia="es-MX"/>
-        </w:rPr>
-        <w:t xml:space="preserve">d</w:t>
-      </w:r>
-      <w:r>
-        <w:rPr>
-          <w:rFonts w:asciiTheme="minorHAnsi" w:eastAsia="Georgia" w:hAnsiTheme="minorHAnsi" w:cstheme="minorHAnsi"/>
-          <w:color w:val="000000"/>
-          <w:sz w:val="20"/>
-          <w:szCs w:val="20"/>
-          <w:bdr w:val="nil"/>
-          <w:lang w:val="hr-HR" w:eastAsia="es-MX"/>
-        </w:rPr>
-        <w:t xml:space="preserve">+2 to</w:t>
-      </w:r>
-      <w:r>
-        <w:rPr>
-          <w:rFonts w:asciiTheme="minorHAnsi" w:eastAsia="Georgia" w:hAnsiTheme="minorHAnsi" w:cstheme="minorHAnsi"/>
-          <w:color w:val="000000"/>
-          <w:sz w:val="20"/>
-          <w:szCs w:val="20"/>
-          <w:bdr w:val="nil"/>
-          <w:lang w:val="hr-HR" w:eastAsia="es-MX"/>
-        </w:rPr>
-        <w:t xml:space="preserve"> </w:t>
-      </w:r>
-      <w:r>
-        <w:rPr>
-          <w:rFonts w:asciiTheme="minorHAnsi" w:eastAsia="Georgia" w:hAnsiTheme="minorHAnsi" w:cstheme="minorHAnsi"/>
-          <w:i/>
-          <w:color w:val="000000"/>
-          <w:sz w:val="20"/>
-          <w:szCs w:val="20"/>
-          <w:bdr w:val="nil"/>
-          <w:lang w:val="hr-HR" w:eastAsia="es-MX"/>
-        </w:rPr>
-        <w:t xml:space="preserve">d</w:t>
-      </w:r>
-      <w:r>
-        <w:rPr>
-          <w:rFonts w:asciiTheme="minorHAnsi" w:eastAsia="Georgia" w:hAnsiTheme="minorHAnsi" w:cstheme="minorHAnsi"/>
-          <w:color w:val="000000"/>
-          <w:sz w:val="20"/>
-          <w:szCs w:val="20"/>
-          <w:bdr w:val="nil"/>
-          <w:lang w:val="hr-HR" w:eastAsia="es-MX"/>
-        </w:rPr>
-        <w:t xml:space="preserve">+5 as the second horizon, the ceiling test would fail and the floor test would fail the confirmation criterion. Ceiling closes carry a one-day effect, and floor closes a one-day effect plus some later drift. These tests support H</w:t>
-      </w:r>
-      <w:r>
-        <w:rPr>
-          <w:rFonts w:asciiTheme="minorHAnsi" w:eastAsia="Georgia" w:hAnsiTheme="minorHAnsi" w:cstheme="minorHAnsi"/>
-          <w:color w:val="000000"/>
-          <w:sz w:val="20"/>
-          <w:szCs w:val="20"/>
-          <w:bdr w:val="nil"/>
-          <w:vertAlign w:val="subscript"/>
-          <w:lang w:val="hr-HR" w:eastAsia="es-MX"/>
-        </w:rPr>
-        <w:t xml:space="preserve">1</w:t>
-      </w:r>
-      <w:r>
-        <w:rPr>
-          <w:rFonts w:asciiTheme="minorHAnsi" w:eastAsia="Georgia" w:hAnsiTheme="minorHAnsi" w:cstheme="minorHAnsi"/>
-          <w:color w:val="000000"/>
-          <w:sz w:val="20"/>
-          <w:szCs w:val="20"/>
-          <w:bdr w:val="nil"/>
-          <w:lang w:val="hr-HR" w:eastAsia="es-MX"/>
-        </w:rPr>
-        <w:t xml:space="preserve">: limit closes predict the next day’s abnormal return, whereas none of the 22 characteristics passes the same screen at its weekly horizon.</w:t>
+        <w:t xml:space="preserve">= −1.7), which is not significant at the 5% level.</w:t>
       </w:r>
     </w:p>
     <w:p>
@@ -10061,6 +10429,51 @@
           <w:lang w:val="hr-HR" w:eastAsia="es-MX"/>
         </w:rPr>
       </w:pPr>
+      <w:r>
+        <w:rPr>
+          <w:rFonts w:asciiTheme="minorHAnsi" w:eastAsia="Georgia" w:hAnsiTheme="minorHAnsi" w:cstheme="minorHAnsi"/>
+          <w:color w:val="000000"/>
+          <w:sz w:val="20"/>
+          <w:szCs w:val="20"/>
+          <w:bdr w:val="nil"/>
+          <w:lang w:val="hr-HR" w:eastAsia="es-MX"/>
+        </w:rPr>
+        <w:t xml:space="preserve">Figure 2 plots the three next-day measures against the size of the day-</w:t>
+      </w:r>
+      <w:r>
+        <w:rPr>
+          <w:rFonts w:asciiTheme="minorHAnsi" w:eastAsia="Georgia" w:hAnsiTheme="minorHAnsi" w:cstheme="minorHAnsi"/>
+          <w:i/>
+          <w:color w:val="000000"/>
+          <w:sz w:val="20"/>
+          <w:szCs w:val="20"/>
+          <w:bdr w:val="nil"/>
+          <w:lang w:val="hr-HR" w:eastAsia="es-MX"/>
+        </w:rPr>
+        <w:t xml:space="preserve">d</w:t>
+      </w:r>
+      <w:r>
+        <w:rPr>
+          <w:rFonts w:asciiTheme="minorHAnsi" w:eastAsia="Georgia" w:hAnsiTheme="minorHAnsi" w:cstheme="minorHAnsi"/>
+          <w:color w:val="000000"/>
+          <w:sz w:val="20"/>
+          <w:szCs w:val="20"/>
+          <w:bdr w:val="nil"/>
+          <w:lang w:val="hr-HR" w:eastAsia="es-MX"/>
+        </w:rPr>
+        <w:t xml:space="preserve"> </w:t>
+      </w:r>
+      <w:r>
+        <w:rPr>
+          <w:rFonts w:asciiTheme="minorHAnsi" w:eastAsia="Georgia" w:hAnsiTheme="minorHAnsi" w:cstheme="minorHAnsi"/>
+          <w:color w:val="000000"/>
+          <w:sz w:val="20"/>
+          <w:szCs w:val="20"/>
+          <w:bdr w:val="nil"/>
+          <w:lang w:val="hr-HR" w:eastAsia="es-MX"/>
+        </w:rPr>
+        <w:t xml:space="preserve">move. Inside the band the close-to-close relation is negative, a short-term reversal. At the limit the relation breaks, and the overnight gap jumps up at the ceiling and down at the floor.</w:t>
+      </w:r>
     </w:p>
     <w:p>
       <w:pPr>
@@ -10068,14 +10481,15 @@
         <w:tabs>
           <w:tab w:val="left" w:pos="1740"/>
         </w:tabs>
-        <w:spacing w:after="0"/>
-        <w:jc w:val="center"/>
+        <w:spacing w:after="0" w:line="240" w:lineRule="auto"/>
+        <w:ind w:firstLine="567"/>
+        <w:jc w:val="both"/>
         <w:rPr>
           <w:rFonts w:asciiTheme="minorHAnsi" w:eastAsia="Georgia" w:hAnsiTheme="minorHAnsi" w:cstheme="minorHAnsi"/>
           <w:bCs/>
           <w:color w:val="000000"/>
-          <w:sz w:val="18"/>
-          <w:szCs w:val="18"/>
+          <w:sz w:val="20"/>
+          <w:szCs w:val="20"/>
           <w:u w:color="000000"/>
           <w:bdr w:val="nil"/>
           <w:lang w:val="hr-HR" w:eastAsia="es-MX"/>
@@ -10084,34 +10498,32 @@
       <w:r>
         <w:rPr>
           <w:rFonts w:asciiTheme="minorHAnsi" w:eastAsia="Georgia" w:hAnsiTheme="minorHAnsi" w:cstheme="minorHAnsi"/>
-          <w:b/>
-          <w:bCs/>
-          <w:color w:val="632423" w:themeColor="accent2" w:themeShade="80"/>
-          <w:sz w:val="18"/>
-          <w:szCs w:val="18"/>
-          <w:u w:color="000000"/>
-          <w:bdr w:val="nil"/>
-          <w:lang w:val="hr-HR" w:eastAsia="es-MX"/>
-        </w:rPr>
-        <w:t xml:space="preserve">Table 2</w:t>
-      </w:r>
-      <w:r>
-        <w:rPr>
-          <w:rFonts w:asciiTheme="minorHAnsi" w:eastAsia="Georgia" w:hAnsiTheme="minorHAnsi" w:cstheme="minorHAnsi"/>
-          <w:color w:val="000000"/>
-          <w:sz w:val="18"/>
-          <w:szCs w:val="18"/>
-          <w:bdr w:val="nil"/>
-          <w:lang w:val="hr-HR" w:eastAsia="es-MX"/>
-        </w:rPr>
-        <w:t xml:space="preserve"> decomposes the next-day return as in Equation (5). After a ceiling close the overnight gap is 2.24% (two-way-clustered</w:t>
-      </w:r>
-      <w:r>
-        <w:rPr>
-          <w:rFonts w:asciiTheme="minorHAnsi" w:eastAsia="Georgia" w:hAnsiTheme="minorHAnsi" w:cstheme="minorHAnsi"/>
-          <w:color w:val="000000"/>
-          <w:sz w:val="18"/>
-          <w:szCs w:val="18"/>
+          <w:color w:val="000000"/>
+          <w:sz w:val="20"/>
+          <w:szCs w:val="20"/>
+          <w:bdr w:val="nil"/>
+          <w:lang w:val="hr-HR" w:eastAsia="es-MX"/>
+        </w:rPr>
+        <w:t xml:space="preserve">Table 3 quantifies the break. Ceiling closers have a gap 2.66 percentage points larger than stocks that rose 5% to 6.5% (</w:t>
+      </w:r>
+      <w:r>
+        <w:rPr>
+          <w:rFonts w:asciiTheme="minorHAnsi" w:eastAsia="Georgia" w:hAnsiTheme="minorHAnsi" w:cstheme="minorHAnsi"/>
+          <w:i/>
+          <w:color w:val="000000"/>
+          <w:sz w:val="20"/>
+          <w:szCs w:val="20"/>
+          <w:bdr w:val="nil"/>
+          <w:lang w:val="hr-HR" w:eastAsia="es-MX"/>
+        </w:rPr>
+        <w:t xml:space="preserve">t</w:t>
+      </w:r>
+      <w:r>
+        <w:rPr>
+          <w:rFonts w:asciiTheme="minorHAnsi" w:eastAsia="Georgia" w:hAnsiTheme="minorHAnsi" w:cstheme="minorHAnsi"/>
+          <w:color w:val="000000"/>
+          <w:sz w:val="20"/>
+          <w:szCs w:val="20"/>
           <w:bdr w:val="nil"/>
           <w:lang w:val="hr-HR" w:eastAsia="es-MX"/>
         </w:rPr>
@@ -10120,10 +10532,21 @@
       <w:r>
         <w:rPr>
           <w:rFonts w:asciiTheme="minorHAnsi" w:eastAsia="Georgia" w:hAnsiTheme="minorHAnsi" w:cstheme="minorHAnsi"/>
+          <w:color w:val="000000"/>
+          <w:sz w:val="20"/>
+          <w:szCs w:val="20"/>
+          <w:bdr w:val="nil"/>
+          <w:lang w:val="hr-HR" w:eastAsia="es-MX"/>
+        </w:rPr>
+        <w:t xml:space="preserve">= 14.0) and an intraday return 0.31 points lower. Floor closers have a gap 1.59 points lower than stocks that fell 5% to 6.5% (</w:t>
+      </w:r>
+      <w:r>
+        <w:rPr>
+          <w:rFonts w:asciiTheme="minorHAnsi" w:eastAsia="Georgia" w:hAnsiTheme="minorHAnsi" w:cstheme="minorHAnsi"/>
           <w:i/>
           <w:color w:val="000000"/>
-          <w:sz w:val="18"/>
-          <w:szCs w:val="18"/>
+          <w:sz w:val="20"/>
+          <w:szCs w:val="20"/>
           <w:bdr w:val="nil"/>
           <w:lang w:val="hr-HR" w:eastAsia="es-MX"/>
         </w:rPr>
@@ -10133,8 +10556,8 @@
         <w:rPr>
           <w:rFonts w:asciiTheme="minorHAnsi" w:eastAsia="Georgia" w:hAnsiTheme="minorHAnsi" w:cstheme="minorHAnsi"/>
           <w:color w:val="000000"/>
-          <w:sz w:val="18"/>
-          <w:szCs w:val="18"/>
+          <w:sz w:val="20"/>
+          <w:szCs w:val="20"/>
           <w:bdr w:val="nil"/>
           <w:lang w:val="hr-HR" w:eastAsia="es-MX"/>
         </w:rPr>
@@ -10144,20 +10567,20 @@
         <w:rPr>
           <w:rFonts w:asciiTheme="minorHAnsi" w:eastAsia="Georgia" w:hAnsiTheme="minorHAnsi" w:cstheme="minorHAnsi"/>
           <w:color w:val="000000"/>
-          <w:sz w:val="18"/>
-          <w:szCs w:val="18"/>
-          <w:bdr w:val="nil"/>
-          <w:lang w:val="hr-HR" w:eastAsia="es-MX"/>
-        </w:rPr>
-        <w:t xml:space="preserve">= 9.7) and the intraday return is −0.54% (</w:t>
+          <w:sz w:val="20"/>
+          <w:szCs w:val="20"/>
+          <w:bdr w:val="nil"/>
+          <w:lang w:val="hr-HR" w:eastAsia="es-MX"/>
+        </w:rPr>
+        <w:t xml:space="preserve">= −9.7). Because the event rule requires a close at the day’s high (low), we repeat the comparison with stocks that also closed there. The ceiling gap is then 3.14 points larger (</w:t>
       </w:r>
       <w:r>
         <w:rPr>
           <w:rFonts w:asciiTheme="minorHAnsi" w:eastAsia="Georgia" w:hAnsiTheme="minorHAnsi" w:cstheme="minorHAnsi"/>
           <w:i/>
           <w:color w:val="000000"/>
-          <w:sz w:val="18"/>
-          <w:szCs w:val="18"/>
+          <w:sz w:val="20"/>
+          <w:szCs w:val="20"/>
           <w:bdr w:val="nil"/>
           <w:lang w:val="hr-HR" w:eastAsia="es-MX"/>
         </w:rPr>
@@ -10167,8 +10590,8 @@
         <w:rPr>
           <w:rFonts w:asciiTheme="minorHAnsi" w:eastAsia="Georgia" w:hAnsiTheme="minorHAnsi" w:cstheme="minorHAnsi"/>
           <w:color w:val="000000"/>
-          <w:sz w:val="18"/>
-          <w:szCs w:val="18"/>
+          <w:sz w:val="20"/>
+          <w:szCs w:val="20"/>
           <w:bdr w:val="nil"/>
           <w:lang w:val="hr-HR" w:eastAsia="es-MX"/>
         </w:rPr>
@@ -10178,46 +10601,35 @@
         <w:rPr>
           <w:rFonts w:asciiTheme="minorHAnsi" w:eastAsia="Georgia" w:hAnsiTheme="minorHAnsi" w:cstheme="minorHAnsi"/>
           <w:color w:val="000000"/>
-          <w:sz w:val="18"/>
-          <w:szCs w:val="18"/>
-          <w:bdr w:val="nil"/>
-          <w:lang w:val="hr-HR" w:eastAsia="es-MX"/>
-        </w:rPr>
-        <w:t xml:space="preserve">= −3.5): the session reverses about 24% of the gap, and the close-to-close effect is positive because the gap exceeds the giveback. The effect sits in the opening auction, as H</w:t>
-      </w:r>
-      <w:r>
-        <w:rPr>
-          <w:rFonts w:asciiTheme="minorHAnsi" w:eastAsia="Georgia" w:hAnsiTheme="minorHAnsi" w:cstheme="minorHAnsi"/>
-          <w:color w:val="000000"/>
-          <w:sz w:val="18"/>
-          <w:szCs w:val="18"/>
+          <w:sz w:val="20"/>
+          <w:szCs w:val="20"/>
+          <w:bdr w:val="nil"/>
+          <w:lang w:val="hr-HR" w:eastAsia="es-MX"/>
+        </w:rPr>
+        <w:t xml:space="preserve">= 14.5) and the floor gap 1.81 points lower, so a strong close does not explain the contrast, which supports H</w:t>
+      </w:r>
+      <w:r>
+        <w:rPr>
+          <w:rFonts w:asciiTheme="minorHAnsi" w:eastAsia="Georgia" w:hAnsiTheme="minorHAnsi" w:cstheme="minorHAnsi"/>
+          <w:color w:val="000000"/>
+          <w:sz w:val="20"/>
+          <w:szCs w:val="20"/>
           <w:bdr w:val="nil"/>
           <w:vertAlign w:val="subscript"/>
           <w:lang w:val="hr-HR" w:eastAsia="es-MX"/>
         </w:rPr>
-        <w:t xml:space="preserve">2</w:t>
-      </w:r>
-      <w:r>
-        <w:rPr>
-          <w:rFonts w:asciiTheme="minorHAnsi" w:eastAsia="Georgia" w:hAnsiTheme="minorHAnsi" w:cstheme="minorHAnsi"/>
-          <w:color w:val="000000"/>
-          <w:sz w:val="18"/>
-          <w:szCs w:val="18"/>
-          <w:bdr w:val="nil"/>
-          <w:lang w:val="hr-HR" w:eastAsia="es-MX"/>
-        </w:rPr>
-        <w:t xml:space="preserve"> </w:t>
-      </w:r>
-      <w:r>
-        <w:rPr>
-          <w:rFonts w:asciiTheme="minorHAnsi" w:eastAsia="Georgia" w:hAnsiTheme="minorHAnsi" w:cstheme="minorHAnsi"/>
-          <w:color w:val="000000"/>
-          <w:sz w:val="18"/>
-          <w:szCs w:val="18"/>
-          <w:bdr w:val="nil"/>
-          <w:lang w:val="hr-HR" w:eastAsia="es-MX"/>
-        </w:rPr>
-        <w:t xml:space="preserve">predicts. A stock that closes at its ceiling may carry unfilled buy orders into the night; those orders and any overnight news would set the opening price, and the intraday reversal suggests that part of that price reflects transient demand.</w:t>
+        <w:t xml:space="preserve">3</w:t>
+      </w:r>
+      <w:r>
+        <w:rPr>
+          <w:rFonts w:asciiTheme="minorHAnsi" w:eastAsia="Georgia" w:hAnsiTheme="minorHAnsi" w:cstheme="minorHAnsi"/>
+          <w:color w:val="000000"/>
+          <w:sz w:val="20"/>
+          <w:szCs w:val="20"/>
+          <w:bdr w:val="nil"/>
+          <w:lang w:val="hr-HR" w:eastAsia="es-MX"/>
+        </w:rPr>
+        <w:t xml:space="preserve">. Against 3% to 5% moves, the ceiling gap is 2.40 percentage points larger and the floor gap 1.14 points lower. The comparison is an association around a rule-based threshold, and we make no regression-discontinuity claim: the design has no bandwidth choice, manipulation test, or covariate-balance check, and stocks that reach the limit may differ in news content.</w:t>
       </w:r>
     </w:p>
     <w:p>
@@ -10248,7 +10660,18 @@
           <w:bdr w:val="nil"/>
           <w:lang w:val="hr-HR" w:eastAsia="es-MX"/>
         </w:rPr>
-        <w:t xml:space="preserve">After a floor close the gap is −0.97% (</w:t>
+        <w:t xml:space="preserve">Three readings fit the pattern, and our data do not separate them: (1) demand or supply that the limit blocked on day</w:t>
+      </w:r>
+      <w:r>
+        <w:rPr>
+          <w:rFonts w:asciiTheme="minorHAnsi" w:eastAsia="Georgia" w:hAnsiTheme="minorHAnsi" w:cstheme="minorHAnsi"/>
+          <w:color w:val="000000"/>
+          <w:sz w:val="20"/>
+          <w:szCs w:val="20"/>
+          <w:bdr w:val="nil"/>
+          <w:lang w:val="hr-HR" w:eastAsia="es-MX"/>
+        </w:rPr>
+        <w:t xml:space="preserve"> </w:t>
       </w:r>
       <w:r>
         <w:rPr>
@@ -10260,6 +10683,74 @@
           <w:bdr w:val="nil"/>
           <w:lang w:val="hr-HR" w:eastAsia="es-MX"/>
         </w:rPr>
+        <w:t xml:space="preserve">d</w:t>
+      </w:r>
+      <w:r>
+        <w:rPr>
+          <w:rFonts w:asciiTheme="minorHAnsi" w:eastAsia="Georgia" w:hAnsiTheme="minorHAnsi" w:cstheme="minorHAnsi"/>
+          <w:color w:val="000000"/>
+          <w:sz w:val="20"/>
+          <w:szCs w:val="20"/>
+          <w:bdr w:val="nil"/>
+          <w:lang w:val="hr-HR" w:eastAsia="es-MX"/>
+        </w:rPr>
+        <w:t xml:space="preserve"> </w:t>
+      </w:r>
+      <w:r>
+        <w:rPr>
+          <w:rFonts w:asciiTheme="minorHAnsi" w:eastAsia="Georgia" w:hAnsiTheme="minorHAnsi" w:cstheme="minorHAnsi"/>
+          <w:color w:val="000000"/>
+          <w:sz w:val="20"/>
+          <w:szCs w:val="20"/>
+          <w:bdr w:val="nil"/>
+          <w:lang w:val="hr-HR" w:eastAsia="es-MX"/>
+        </w:rPr>
+        <w:t xml:space="preserve">clears at the next opening, the delayed price discovery of Kim and Rhee (1997); (2) news and retail attention persist overnight and produce the overnight gain and intraday reversal of attention-grabbing stocks (Berkman et al., 2012), with or without a limit; and (3) the opening auction overshoots and corrects within the day. Lacking announcements, order books, and limit-free stock-days, we run two partial checks. First, the ceiling gap rises across terciles of day-</w:t>
+      </w:r>
+      <w:r>
+        <w:rPr>
+          <w:rFonts w:asciiTheme="minorHAnsi" w:eastAsia="Georgia" w:hAnsiTheme="minorHAnsi" w:cstheme="minorHAnsi"/>
+          <w:i/>
+          <w:color w:val="000000"/>
+          <w:sz w:val="20"/>
+          <w:szCs w:val="20"/>
+          <w:bdr w:val="nil"/>
+          <w:lang w:val="hr-HR" w:eastAsia="es-MX"/>
+        </w:rPr>
+        <w:t xml:space="preserve">d</w:t>
+      </w:r>
+      <w:r>
+        <w:rPr>
+          <w:rFonts w:asciiTheme="minorHAnsi" w:eastAsia="Georgia" w:hAnsiTheme="minorHAnsi" w:cstheme="minorHAnsi"/>
+          <w:color w:val="000000"/>
+          <w:sz w:val="20"/>
+          <w:szCs w:val="20"/>
+          <w:bdr w:val="nil"/>
+          <w:lang w:val="hr-HR" w:eastAsia="es-MX"/>
+        </w:rPr>
+        <w:t xml:space="preserve"> </w:t>
+      </w:r>
+      <w:r>
+        <w:rPr>
+          <w:rFonts w:asciiTheme="minorHAnsi" w:eastAsia="Georgia" w:hAnsiTheme="minorHAnsi" w:cstheme="minorHAnsi"/>
+          <w:color w:val="000000"/>
+          <w:sz w:val="20"/>
+          <w:szCs w:val="20"/>
+          <w:bdr w:val="nil"/>
+          <w:lang w:val="hr-HR" w:eastAsia="es-MX"/>
+        </w:rPr>
+        <w:t xml:space="preserve">volume relative to its prior 60-day mean (1.97%, 2.16%, and 2.63%) and of the prior 20-day return (1.41%, 2.18%, and 3.16%), which fits readings (1) and (2) alike, and stays positive and significant in the lowest tercile of each proxy (</w:t>
+      </w:r>
+      <w:r>
+        <w:rPr>
+          <w:rFonts w:asciiTheme="minorHAnsi" w:eastAsia="Georgia" w:hAnsiTheme="minorHAnsi" w:cstheme="minorHAnsi"/>
+          <w:i/>
+          <w:color w:val="000000"/>
+          <w:sz w:val="20"/>
+          <w:szCs w:val="20"/>
+          <w:bdr w:val="nil"/>
+          <w:lang w:val="hr-HR" w:eastAsia="es-MX"/>
+        </w:rPr>
         <w:t xml:space="preserve">t</w:t>
       </w:r>
       <w:r>
@@ -10282,19 +10773,7 @@
           <w:bdr w:val="nil"/>
           <w:lang w:val="hr-HR" w:eastAsia="es-MX"/>
         </w:rPr>
-        <w:t xml:space="preserve">= −4.6) and the intraday return is a weak reversal of 0.30%. The ceiling gap holds for exact limit hits (2.79%) and for the first day of a streak of exact hits (2.39%). Near hits show a smaller gap (1.67%) and no significant intraday return, but their median day-</w:t>
-      </w:r>
-      <w:r>
-        <w:rPr>
-          <w:rFonts w:asciiTheme="minorHAnsi" w:eastAsia="Georgia" w:hAnsiTheme="minorHAnsi" w:cstheme="minorHAnsi"/>
-          <w:i/>
-          <w:color w:val="000000"/>
-          <w:sz w:val="20"/>
-          <w:szCs w:val="20"/>
-          <w:bdr w:val="nil"/>
-          <w:lang w:val="hr-HR" w:eastAsia="es-MX"/>
-        </w:rPr>
-        <w:t xml:space="preserve">d</w:t>
+        <w:t xml:space="preserve">= 4.8 and 4.2). For floors the gap moves from −1.20% to −0.68% across volume terciles and is not monotone in the prior return, so the attention reading does not carry over. Second, the comparison with stocks that closed at their high removes selection on the shape of the close but not on news. The intraday giveback fits readings (2) and (3) at least as well as permanent price discovery, so</w:t>
       </w:r>
       <w:r>
         <w:rPr>
@@ -10316,19 +10795,29 @@
           <w:bdr w:val="nil"/>
           <w:lang w:val="hr-HR" w:eastAsia="es-MX"/>
         </w:rPr>
-        <w:t xml:space="preserve">return is 6.89% against 6.90% for exact hits, and 83% of their closes are not multiples of the tick size. This points to later price adjustment by the vendor rather than to closes below the limit. The split is therefore weighted toward higher-priced stocks, where the tick is coarser, and we do not read the difference as a gradient toward the limit. The gap appears in both halves of the sample, on days locked at one price from open to close, and, for ceilings, in each tercile of 60-day average dollar volume (1.52% in the most liquid). Against same-date controls the ceiling gap is 2.70% and the floor close-to-close return −1.65%, so the floor effect depends on the benchmark. Floor events cluster on market-wide down days (740 of 2,111 remain without days on which the market fell more than 2%), and the floor gap is not significant in the least liquid tercile (</w:t>
-      </w:r>
-      <w:r>
-        <w:rPr>
-          <w:rFonts w:asciiTheme="minorHAnsi" w:eastAsia="Georgia" w:hAnsiTheme="minorHAnsi" w:cstheme="minorHAnsi"/>
-          <w:i/>
-          <w:color w:val="000000"/>
-          <w:sz w:val="20"/>
-          <w:szCs w:val="20"/>
-          <w:bdr w:val="nil"/>
-          <w:lang w:val="hr-HR" w:eastAsia="es-MX"/>
-        </w:rPr>
-        <w:t xml:space="preserve">t</w:t>
+        <w:t xml:space="preserve">“</w:t>
+      </w:r>
+      <w:r>
+        <w:rPr>
+          <w:rFonts w:asciiTheme="minorHAnsi" w:eastAsia="Georgia" w:hAnsiTheme="minorHAnsi" w:cstheme="minorHAnsi"/>
+          <w:color w:val="000000"/>
+          <w:sz w:val="20"/>
+          <w:szCs w:val="20"/>
+          <w:bdr w:val="nil"/>
+          <w:lang w:val="hr-HR" w:eastAsia="es-MX"/>
+        </w:rPr>
+        <w:t xml:space="preserve">break at the limit</w:t>
+      </w:r>
+      <w:r>
+        <w:rPr>
+          <w:rFonts w:asciiTheme="minorHAnsi" w:eastAsia="Georgia" w:hAnsiTheme="minorHAnsi" w:cstheme="minorHAnsi"/>
+          <w:color w:val="000000"/>
+          <w:sz w:val="20"/>
+          <w:szCs w:val="20"/>
+          <w:bdr w:val="nil"/>
+          <w:lang w:val="hr-HR" w:eastAsia="es-MX"/>
+        </w:rPr>
+        <w:t xml:space="preserve">”</w:t>
       </w:r>
       <w:r>
         <w:rPr>
@@ -10350,282 +10839,8 @@
           <w:bdr w:val="nil"/>
           <w:lang w:val="hr-HR" w:eastAsia="es-MX"/>
         </w:rPr>
-        <w:t xml:space="preserve">= −1.0).</w:t>
-      </w:r>
-    </w:p>
-    <w:p>
-      <w:pPr>
-        <w:tabs>
-          <w:tab w:val="left" w:pos="1740"/>
-        </w:tabs>
-        <w:spacing w:after="0" w:line="240" w:lineRule="auto"/>
-        <w:ind w:firstLine="567"/>
-        <w:jc w:val="both"/>
-        <w:rPr>
-          <w:rFonts w:asciiTheme="minorHAnsi" w:eastAsia="Georgia" w:hAnsiTheme="minorHAnsi" w:cstheme="minorHAnsi"/>
-          <w:bCs/>
-          <w:color w:val="000000"/>
-          <w:sz w:val="20"/>
-          <w:szCs w:val="20"/>
-          <w:u w:color="000000"/>
-          <w:bdr w:val="nil"/>
-          <w:lang w:val="hr-HR" w:eastAsia="es-MX"/>
-        </w:rPr>
-      </w:pPr>
-      <w:r>
-        <w:rPr>
-          <w:rFonts w:asciiTheme="minorHAnsi" w:eastAsia="Georgia" w:hAnsiTheme="minorHAnsi" w:cstheme="minorHAnsi"/>
-          <w:color w:val="000000"/>
-          <w:sz w:val="20"/>
-          <w:szCs w:val="20"/>
-          <w:bdr w:val="nil"/>
-          <w:lang w:val="hr-HR" w:eastAsia="es-MX"/>
-        </w:rPr>
-        <w:t xml:space="preserve">An outside buyer cannot capture the close-to-close continuation: a buyer who wants a stock at its ceiling joins a queue at the close, so the first obtainable price is the next open, which already contains the gap. From that open the ceiling return through the fifth close is −0.75% against the market (</w:t>
-      </w:r>
-      <w:r>
-        <w:rPr>
-          <w:rFonts w:asciiTheme="minorHAnsi" w:eastAsia="Georgia" w:hAnsiTheme="minorHAnsi" w:cstheme="minorHAnsi"/>
-          <w:i/>
-          <w:color w:val="000000"/>
-          <w:sz w:val="20"/>
-          <w:szCs w:val="20"/>
-          <w:bdr w:val="nil"/>
-          <w:lang w:val="hr-HR" w:eastAsia="es-MX"/>
-        </w:rPr>
-        <w:t xml:space="preserve">t</w:t>
-      </w:r>
-      <w:r>
-        <w:rPr>
-          <w:rFonts w:asciiTheme="minorHAnsi" w:eastAsia="Georgia" w:hAnsiTheme="minorHAnsi" w:cstheme="minorHAnsi"/>
-          <w:color w:val="000000"/>
-          <w:sz w:val="20"/>
-          <w:szCs w:val="20"/>
-          <w:bdr w:val="nil"/>
-          <w:lang w:val="hr-HR" w:eastAsia="es-MX"/>
-        </w:rPr>
-        <w:t xml:space="preserve"> </w:t>
-      </w:r>
-      <w:r>
-        <w:rPr>
-          <w:rFonts w:asciiTheme="minorHAnsi" w:eastAsia="Georgia" w:hAnsiTheme="minorHAnsi" w:cstheme="minorHAnsi"/>
-          <w:color w:val="000000"/>
-          <w:sz w:val="20"/>
-          <w:szCs w:val="20"/>
-          <w:bdr w:val="nil"/>
-          <w:lang w:val="hr-HR" w:eastAsia="es-MX"/>
-        </w:rPr>
-        <w:t xml:space="preserve">= −2.7) and −0.53% against same-date controls (</w:t>
-      </w:r>
-      <w:r>
-        <w:rPr>
-          <w:rFonts w:asciiTheme="minorHAnsi" w:eastAsia="Georgia" w:hAnsiTheme="minorHAnsi" w:cstheme="minorHAnsi"/>
-          <w:i/>
-          <w:color w:val="000000"/>
-          <w:sz w:val="20"/>
-          <w:szCs w:val="20"/>
-          <w:bdr w:val="nil"/>
-          <w:lang w:val="hr-HR" w:eastAsia="es-MX"/>
-        </w:rPr>
-        <w:t xml:space="preserve">t</w:t>
-      </w:r>
-      <w:r>
-        <w:rPr>
-          <w:rFonts w:asciiTheme="minorHAnsi" w:eastAsia="Georgia" w:hAnsiTheme="minorHAnsi" w:cstheme="minorHAnsi"/>
-          <w:color w:val="000000"/>
-          <w:sz w:val="20"/>
-          <w:szCs w:val="20"/>
-          <w:bdr w:val="nil"/>
-          <w:lang w:val="hr-HR" w:eastAsia="es-MX"/>
-        </w:rPr>
-        <w:t xml:space="preserve"> </w:t>
-      </w:r>
-      <w:r>
-        <w:rPr>
-          <w:rFonts w:asciiTheme="minorHAnsi" w:eastAsia="Georgia" w:hAnsiTheme="minorHAnsi" w:cstheme="minorHAnsi"/>
-          <w:color w:val="000000"/>
-          <w:sz w:val="20"/>
-          <w:szCs w:val="20"/>
-          <w:bdr w:val="nil"/>
-          <w:lang w:val="hr-HR" w:eastAsia="es-MX"/>
-        </w:rPr>
-        <w:t xml:space="preserve">= −1.8), which supports H</w:t>
-      </w:r>
-      <w:r>
-        <w:rPr>
-          <w:rFonts w:asciiTheme="minorHAnsi" w:eastAsia="Georgia" w:hAnsiTheme="minorHAnsi" w:cstheme="minorHAnsi"/>
-          <w:color w:val="000000"/>
-          <w:sz w:val="20"/>
-          <w:szCs w:val="20"/>
-          <w:bdr w:val="nil"/>
-          <w:vertAlign w:val="subscript"/>
-          <w:lang w:val="hr-HR" w:eastAsia="es-MX"/>
-        </w:rPr>
-        <w:t xml:space="preserve">4</w:t>
-      </w:r>
-      <w:r>
-        <w:rPr>
-          <w:rFonts w:asciiTheme="minorHAnsi" w:eastAsia="Georgia" w:hAnsiTheme="minorHAnsi" w:cstheme="minorHAnsi"/>
-          <w:color w:val="000000"/>
-          <w:sz w:val="20"/>
-          <w:szCs w:val="20"/>
-          <w:bdr w:val="nil"/>
-          <w:lang w:val="hr-HR" w:eastAsia="es-MX"/>
-        </w:rPr>
-        <w:t xml:space="preserve">; a holder who sells at the next open avoids the intraday giveback. These figures use quoted prices and ignore achievable fills: 522 ceiling events were locked at one price all day, and some of these stocks opened at the limit the next day, where a buyer may be rationed. After floor closes, prices fall a further 0.82% from the next open to the fifth close against the market (</w:t>
-      </w:r>
-      <w:r>
-        <w:rPr>
-          <w:rFonts w:asciiTheme="minorHAnsi" w:eastAsia="Georgia" w:hAnsiTheme="minorHAnsi" w:cstheme="minorHAnsi"/>
-          <w:i/>
-          <w:color w:val="000000"/>
-          <w:sz w:val="20"/>
-          <w:szCs w:val="20"/>
-          <w:bdr w:val="nil"/>
-          <w:lang w:val="hr-HR" w:eastAsia="es-MX"/>
-        </w:rPr>
-        <w:t xml:space="preserve">t</w:t>
-      </w:r>
-      <w:r>
-        <w:rPr>
-          <w:rFonts w:asciiTheme="minorHAnsi" w:eastAsia="Georgia" w:hAnsiTheme="minorHAnsi" w:cstheme="minorHAnsi"/>
-          <w:color w:val="000000"/>
-          <w:sz w:val="20"/>
-          <w:szCs w:val="20"/>
-          <w:bdr w:val="nil"/>
-          <w:lang w:val="hr-HR" w:eastAsia="es-MX"/>
-        </w:rPr>
-        <w:t xml:space="preserve"> </w:t>
-      </w:r>
-      <w:r>
-        <w:rPr>
-          <w:rFonts w:asciiTheme="minorHAnsi" w:eastAsia="Georgia" w:hAnsiTheme="minorHAnsi" w:cstheme="minorHAnsi"/>
-          <w:color w:val="000000"/>
-          <w:sz w:val="20"/>
-          <w:szCs w:val="20"/>
-          <w:bdr w:val="nil"/>
-          <w:lang w:val="hr-HR" w:eastAsia="es-MX"/>
-        </w:rPr>
-        <w:t xml:space="preserve">= −1.7), which is not significant at the 5% level.</w:t>
-      </w:r>
-    </w:p>
-    <w:p>
-      <w:pPr>
-        <w:tabs>
-          <w:tab w:val="left" w:pos="1740"/>
-        </w:tabs>
-        <w:spacing w:before="60" w:after="0"/>
-        <w:jc w:val="center"/>
-        <w:rPr>
-          <w:rFonts w:asciiTheme="minorHAnsi" w:eastAsia="Georgia" w:hAnsiTheme="minorHAnsi" w:cstheme="minorHAnsi"/>
-          <w:bCs/>
-          <w:color w:val="000000"/>
-          <w:sz w:val="20"/>
-          <w:szCs w:val="20"/>
-          <w:u w:color="000000"/>
-          <w:bdr w:val="nil"/>
-          <w:lang w:val="hr-HR" w:eastAsia="es-MX"/>
-        </w:rPr>
-      </w:pPr>
-      <w:r>
-        <w:rPr>
-          <w:rFonts w:asciiTheme="minorHAnsi" w:eastAsia="Georgia" w:hAnsiTheme="minorHAnsi" w:cstheme="minorHAnsi"/>
-          <w:b/>
-          <w:bCs/>
-          <w:color w:val="632423" w:themeColor="accent2" w:themeShade="80"/>
-          <w:sz w:val="18"/>
-          <w:szCs w:val="18"/>
-          <w:u w:color="000000"/>
-          <w:bdr w:val="nil"/>
-          <w:lang w:val="hr-HR" w:eastAsia="es-MX"/>
-        </w:rPr>
-        <w:t xml:space="preserve">Figure 2</w:t>
-      </w:r>
-      <w:r>
-        <w:rPr>
-          <w:rFonts w:asciiTheme="minorHAnsi" w:eastAsia="Georgia" w:hAnsiTheme="minorHAnsi" w:cstheme="minorHAnsi"/>
-          <w:color w:val="000000"/>
-          <w:sz w:val="18"/>
-          <w:szCs w:val="18"/>
-          <w:bdr w:val="nil"/>
-          <w:lang w:val="hr-HR" w:eastAsia="es-MX"/>
-        </w:rPr>
-        <w:t xml:space="preserve"> plots the three next-day measures against the size of the day-</w:t>
-      </w:r>
-      <w:r>
-        <w:rPr>
-          <w:rFonts w:asciiTheme="minorHAnsi" w:eastAsia="Georgia" w:hAnsiTheme="minorHAnsi" w:cstheme="minorHAnsi"/>
-          <w:i/>
-          <w:color w:val="000000"/>
-          <w:sz w:val="18"/>
-          <w:szCs w:val="18"/>
-          <w:bdr w:val="nil"/>
-          <w:lang w:val="hr-HR" w:eastAsia="es-MX"/>
-        </w:rPr>
-        <w:t xml:space="preserve">d</w:t>
-      </w:r>
-      <w:r>
-        <w:rPr>
-          <w:rFonts w:asciiTheme="minorHAnsi" w:eastAsia="Georgia" w:hAnsiTheme="minorHAnsi" w:cstheme="minorHAnsi"/>
-          <w:color w:val="000000"/>
-          <w:sz w:val="18"/>
-          <w:szCs w:val="18"/>
-          <w:bdr w:val="nil"/>
-          <w:lang w:val="hr-HR" w:eastAsia="es-MX"/>
-        </w:rPr>
-        <w:t xml:space="preserve"> </w:t>
-      </w:r>
-      <w:r>
-        <w:rPr>
-          <w:rFonts w:asciiTheme="minorHAnsi" w:eastAsia="Georgia" w:hAnsiTheme="minorHAnsi" w:cstheme="minorHAnsi"/>
-          <w:color w:val="000000"/>
-          <w:sz w:val="18"/>
-          <w:szCs w:val="18"/>
-          <w:bdr w:val="nil"/>
-          <w:lang w:val="hr-HR" w:eastAsia="es-MX"/>
-        </w:rPr>
-        <w:t xml:space="preserve">move. Inside the band the close-to-close relation is negative, a short-term reversal. At the limit the relation breaks, and the overnight gap jumps up at the ceiling and down at the floor.</w:t>
-      </w:r>
-    </w:p>
-    <w:p>
-      <w:pPr>
-        <w:tabs>
-          <w:tab w:val="left" w:pos="1740"/>
-        </w:tabs>
-        <w:spacing w:after="0" w:line="240" w:lineRule="auto"/>
-        <w:ind w:firstLine="567"/>
-        <w:jc w:val="both"/>
-        <w:rPr>
-          <w:rFonts w:asciiTheme="minorHAnsi" w:eastAsia="Georgia" w:hAnsiTheme="minorHAnsi" w:cstheme="minorHAnsi"/>
-          <w:bCs/>
-          <w:color w:val="000000"/>
-          <w:sz w:val="20"/>
-          <w:szCs w:val="20"/>
-          <w:u w:color="000000"/>
-          <w:bdr w:val="nil"/>
-          <w:lang w:val="hr-HR" w:eastAsia="es-MX"/>
-        </w:rPr>
-      </w:pPr>
-    </w:p>
-    <w:p>
-      <w:pPr>
-        <w:tabs>
-          <w:tab w:val="left" w:pos="1740"/>
-        </w:tabs>
-        <w:spacing w:after="0" w:line="240" w:lineRule="auto"/>
-        <w:ind w:firstLine="567"/>
-        <w:jc w:val="both"/>
-        <w:rPr>
-          <w:rFonts w:asciiTheme="minorHAnsi" w:eastAsia="Georgia" w:hAnsiTheme="minorHAnsi" w:cstheme="minorHAnsi"/>
-          <w:bCs/>
-          <w:color w:val="000000"/>
-          <w:sz w:val="20"/>
-          <w:szCs w:val="20"/>
-          <w:u w:color="000000"/>
-          <w:bdr w:val="nil"/>
-          <w:lang w:val="hr-HR" w:eastAsia="es-MX"/>
-        </w:rPr>
-      </w:pPr>
+        <w:t xml:space="preserve">is a description and delayed price discovery one hypothesis. Testing the magnet effect (Chen et al., 2024; Cho et al., 2003) needs intraday prices, which we lack.</w:t>
+      </w:r>
     </w:p>
     <w:p>
       <w:pPr>
@@ -10633,175 +10848,6 @@
         <w:tabs>
           <w:tab w:val="left" w:pos="1740"/>
         </w:tabs>
-        <w:spacing w:after="0"/>
-        <w:jc w:val="center"/>
-        <w:rPr>
-          <w:rFonts w:asciiTheme="minorHAnsi" w:eastAsia="Georgia" w:hAnsiTheme="minorHAnsi" w:cstheme="minorHAnsi"/>
-          <w:bCs/>
-          <w:color w:val="000000"/>
-          <w:sz w:val="18"/>
-          <w:szCs w:val="18"/>
-          <w:u w:color="000000"/>
-          <w:bdr w:val="nil"/>
-          <w:lang w:val="hr-HR" w:eastAsia="es-MX"/>
-        </w:rPr>
-      </w:pPr>
-      <w:r>
-        <w:rPr>
-          <w:rFonts w:asciiTheme="minorHAnsi" w:eastAsia="Georgia" w:hAnsiTheme="minorHAnsi" w:cstheme="minorHAnsi"/>
-          <w:b/>
-          <w:bCs/>
-          <w:color w:val="632423" w:themeColor="accent2" w:themeShade="80"/>
-          <w:sz w:val="18"/>
-          <w:szCs w:val="18"/>
-          <w:u w:color="000000"/>
-          <w:bdr w:val="nil"/>
-          <w:lang w:val="hr-HR" w:eastAsia="es-MX"/>
-        </w:rPr>
-        <w:t xml:space="preserve">Table 3</w:t>
-      </w:r>
-      <w:r>
-        <w:rPr>
-          <w:rFonts w:asciiTheme="minorHAnsi" w:eastAsia="Georgia" w:hAnsiTheme="minorHAnsi" w:cstheme="minorHAnsi"/>
-          <w:color w:val="000000"/>
-          <w:sz w:val="18"/>
-          <w:szCs w:val="18"/>
-          <w:bdr w:val="nil"/>
-          <w:lang w:val="hr-HR" w:eastAsia="es-MX"/>
-        </w:rPr>
-        <w:t xml:space="preserve"> quantifies the break. Ceiling closers have a gap 2.66 percentage points larger than stocks that rose 5% to 6.5% (</w:t>
-      </w:r>
-      <w:r>
-        <w:rPr>
-          <w:rFonts w:asciiTheme="minorHAnsi" w:eastAsia="Georgia" w:hAnsiTheme="minorHAnsi" w:cstheme="minorHAnsi"/>
-          <w:i/>
-          <w:color w:val="000000"/>
-          <w:sz w:val="18"/>
-          <w:szCs w:val="18"/>
-          <w:bdr w:val="nil"/>
-          <w:lang w:val="hr-HR" w:eastAsia="es-MX"/>
-        </w:rPr>
-        <w:t xml:space="preserve">t</w:t>
-      </w:r>
-      <w:r>
-        <w:rPr>
-          <w:rFonts w:asciiTheme="minorHAnsi" w:eastAsia="Georgia" w:hAnsiTheme="minorHAnsi" w:cstheme="minorHAnsi"/>
-          <w:color w:val="000000"/>
-          <w:sz w:val="18"/>
-          <w:szCs w:val="18"/>
-          <w:bdr w:val="nil"/>
-          <w:lang w:val="hr-HR" w:eastAsia="es-MX"/>
-        </w:rPr>
-        <w:t xml:space="preserve"> </w:t>
-      </w:r>
-      <w:r>
-        <w:rPr>
-          <w:rFonts w:asciiTheme="minorHAnsi" w:eastAsia="Georgia" w:hAnsiTheme="minorHAnsi" w:cstheme="minorHAnsi"/>
-          <w:color w:val="000000"/>
-          <w:sz w:val="18"/>
-          <w:szCs w:val="18"/>
-          <w:bdr w:val="nil"/>
-          <w:lang w:val="hr-HR" w:eastAsia="es-MX"/>
-        </w:rPr>
-        <w:t xml:space="preserve">= 14.0) and an intraday return 0.31 points lower. Floor closers have a gap 1.59 points lower than stocks that fell 5% to 6.5% (</w:t>
-      </w:r>
-      <w:r>
-        <w:rPr>
-          <w:rFonts w:asciiTheme="minorHAnsi" w:eastAsia="Georgia" w:hAnsiTheme="minorHAnsi" w:cstheme="minorHAnsi"/>
-          <w:i/>
-          <w:color w:val="000000"/>
-          <w:sz w:val="18"/>
-          <w:szCs w:val="18"/>
-          <w:bdr w:val="nil"/>
-          <w:lang w:val="hr-HR" w:eastAsia="es-MX"/>
-        </w:rPr>
-        <w:t xml:space="preserve">t</w:t>
-      </w:r>
-      <w:r>
-        <w:rPr>
-          <w:rFonts w:asciiTheme="minorHAnsi" w:eastAsia="Georgia" w:hAnsiTheme="minorHAnsi" w:cstheme="minorHAnsi"/>
-          <w:color w:val="000000"/>
-          <w:sz w:val="18"/>
-          <w:szCs w:val="18"/>
-          <w:bdr w:val="nil"/>
-          <w:lang w:val="hr-HR" w:eastAsia="es-MX"/>
-        </w:rPr>
-        <w:t xml:space="preserve"> </w:t>
-      </w:r>
-      <w:r>
-        <w:rPr>
-          <w:rFonts w:asciiTheme="minorHAnsi" w:eastAsia="Georgia" w:hAnsiTheme="minorHAnsi" w:cstheme="minorHAnsi"/>
-          <w:color w:val="000000"/>
-          <w:sz w:val="18"/>
-          <w:szCs w:val="18"/>
-          <w:bdr w:val="nil"/>
-          <w:lang w:val="hr-HR" w:eastAsia="es-MX"/>
-        </w:rPr>
-        <w:t xml:space="preserve">= −9.7). Because the event rule requires a close at the day’s high (low), we repeat the comparison with stocks that also closed there. The ceiling gap is then 3.14 points larger (</w:t>
-      </w:r>
-      <w:r>
-        <w:rPr>
-          <w:rFonts w:asciiTheme="minorHAnsi" w:eastAsia="Georgia" w:hAnsiTheme="minorHAnsi" w:cstheme="minorHAnsi"/>
-          <w:i/>
-          <w:color w:val="000000"/>
-          <w:sz w:val="18"/>
-          <w:szCs w:val="18"/>
-          <w:bdr w:val="nil"/>
-          <w:lang w:val="hr-HR" w:eastAsia="es-MX"/>
-        </w:rPr>
-        <w:t xml:space="preserve">t</w:t>
-      </w:r>
-      <w:r>
-        <w:rPr>
-          <w:rFonts w:asciiTheme="minorHAnsi" w:eastAsia="Georgia" w:hAnsiTheme="minorHAnsi" w:cstheme="minorHAnsi"/>
-          <w:color w:val="000000"/>
-          <w:sz w:val="18"/>
-          <w:szCs w:val="18"/>
-          <w:bdr w:val="nil"/>
-          <w:lang w:val="hr-HR" w:eastAsia="es-MX"/>
-        </w:rPr>
-        <w:t xml:space="preserve"> </w:t>
-      </w:r>
-      <w:r>
-        <w:rPr>
-          <w:rFonts w:asciiTheme="minorHAnsi" w:eastAsia="Georgia" w:hAnsiTheme="minorHAnsi" w:cstheme="minorHAnsi"/>
-          <w:color w:val="000000"/>
-          <w:sz w:val="18"/>
-          <w:szCs w:val="18"/>
-          <w:bdr w:val="nil"/>
-          <w:lang w:val="hr-HR" w:eastAsia="es-MX"/>
-        </w:rPr>
-        <w:t xml:space="preserve">= 14.5) and the floor gap 1.81 points lower, so a strong close does not explain the contrast, which supports H</w:t>
-      </w:r>
-      <w:r>
-        <w:rPr>
-          <w:rFonts w:asciiTheme="minorHAnsi" w:eastAsia="Georgia" w:hAnsiTheme="minorHAnsi" w:cstheme="minorHAnsi"/>
-          <w:color w:val="000000"/>
-          <w:sz w:val="18"/>
-          <w:szCs w:val="18"/>
-          <w:bdr w:val="nil"/>
-          <w:vertAlign w:val="subscript"/>
-          <w:lang w:val="hr-HR" w:eastAsia="es-MX"/>
-        </w:rPr>
-        <w:t xml:space="preserve">3</w:t>
-      </w:r>
-      <w:r>
-        <w:rPr>
-          <w:rFonts w:asciiTheme="minorHAnsi" w:eastAsia="Georgia" w:hAnsiTheme="minorHAnsi" w:cstheme="minorHAnsi"/>
-          <w:color w:val="000000"/>
-          <w:sz w:val="18"/>
-          <w:szCs w:val="18"/>
-          <w:bdr w:val="nil"/>
-          <w:lang w:val="hr-HR" w:eastAsia="es-MX"/>
-        </w:rPr>
-        <w:t xml:space="preserve">. Against 3% to 5% moves, the ceiling gap is 2.40 percentage points larger and the floor gap 1.14 points lower. The comparison is an association around a rule-based threshold, and we make no regression-discontinuity claim: the design has no bandwidth choice, manipulation test, or covariate-balance check, and stocks that reach the limit may differ in news content.</w:t>
-      </w:r>
-    </w:p>
-    <w:p>
-      <w:pPr>
-        <w:tabs>
-          <w:tab w:val="left" w:pos="1740"/>
-        </w:tabs>
         <w:spacing w:after="0" w:line="240" w:lineRule="auto"/>
         <w:ind w:firstLine="567"/>
         <w:jc w:val="both"/>
@@ -10825,251 +10871,7 @@
           <w:bdr w:val="nil"/>
           <w:lang w:val="hr-HR" w:eastAsia="es-MX"/>
         </w:rPr>
-        <w:t xml:space="preserve">Three readings fit the pattern, and our data do not separate them: (1) demand or supply that the limit blocked on day</w:t>
-      </w:r>
-      <w:r>
-        <w:rPr>
-          <w:rFonts w:asciiTheme="minorHAnsi" w:eastAsia="Georgia" w:hAnsiTheme="minorHAnsi" w:cstheme="minorHAnsi"/>
-          <w:color w:val="000000"/>
-          <w:sz w:val="20"/>
-          <w:szCs w:val="20"/>
-          <w:bdr w:val="nil"/>
-          <w:lang w:val="hr-HR" w:eastAsia="es-MX"/>
-        </w:rPr>
-        <w:t xml:space="preserve"> </w:t>
-      </w:r>
-      <w:r>
-        <w:rPr>
-          <w:rFonts w:asciiTheme="minorHAnsi" w:eastAsia="Georgia" w:hAnsiTheme="minorHAnsi" w:cstheme="minorHAnsi"/>
-          <w:i/>
-          <w:color w:val="000000"/>
-          <w:sz w:val="20"/>
-          <w:szCs w:val="20"/>
-          <w:bdr w:val="nil"/>
-          <w:lang w:val="hr-HR" w:eastAsia="es-MX"/>
-        </w:rPr>
-        <w:t xml:space="preserve">d</w:t>
-      </w:r>
-      <w:r>
-        <w:rPr>
-          <w:rFonts w:asciiTheme="minorHAnsi" w:eastAsia="Georgia" w:hAnsiTheme="minorHAnsi" w:cstheme="minorHAnsi"/>
-          <w:color w:val="000000"/>
-          <w:sz w:val="20"/>
-          <w:szCs w:val="20"/>
-          <w:bdr w:val="nil"/>
-          <w:lang w:val="hr-HR" w:eastAsia="es-MX"/>
-        </w:rPr>
-        <w:t xml:space="preserve"> </w:t>
-      </w:r>
-      <w:r>
-        <w:rPr>
-          <w:rFonts w:asciiTheme="minorHAnsi" w:eastAsia="Georgia" w:hAnsiTheme="minorHAnsi" w:cstheme="minorHAnsi"/>
-          <w:color w:val="000000"/>
-          <w:sz w:val="20"/>
-          <w:szCs w:val="20"/>
-          <w:bdr w:val="nil"/>
-          <w:lang w:val="hr-HR" w:eastAsia="es-MX"/>
-        </w:rPr>
-        <w:t xml:space="preserve">clears at the next opening, the delayed price discovery of Kim and Rhee (1997); (2) news and retail attention persist overnight and produce the overnight gain and intraday reversal of attention-grabbing stocks (Berkman et al., 2012), with or without a limit; and (3) the opening auction overshoots and corrects within the day. Lacking announcements, order books, and limit-free stock-days, we run two partial checks. First, the ceiling gap rises across terciles of day-</w:t>
-      </w:r>
-      <w:r>
-        <w:rPr>
-          <w:rFonts w:asciiTheme="minorHAnsi" w:eastAsia="Georgia" w:hAnsiTheme="minorHAnsi" w:cstheme="minorHAnsi"/>
-          <w:i/>
-          <w:color w:val="000000"/>
-          <w:sz w:val="20"/>
-          <w:szCs w:val="20"/>
-          <w:bdr w:val="nil"/>
-          <w:lang w:val="hr-HR" w:eastAsia="es-MX"/>
-        </w:rPr>
-        <w:t xml:space="preserve">d</w:t>
-      </w:r>
-      <w:r>
-        <w:rPr>
-          <w:rFonts w:asciiTheme="minorHAnsi" w:eastAsia="Georgia" w:hAnsiTheme="minorHAnsi" w:cstheme="minorHAnsi"/>
-          <w:color w:val="000000"/>
-          <w:sz w:val="20"/>
-          <w:szCs w:val="20"/>
-          <w:bdr w:val="nil"/>
-          <w:lang w:val="hr-HR" w:eastAsia="es-MX"/>
-        </w:rPr>
-        <w:t xml:space="preserve"> </w:t>
-      </w:r>
-      <w:r>
-        <w:rPr>
-          <w:rFonts w:asciiTheme="minorHAnsi" w:eastAsia="Georgia" w:hAnsiTheme="minorHAnsi" w:cstheme="minorHAnsi"/>
-          <w:color w:val="000000"/>
-          <w:sz w:val="20"/>
-          <w:szCs w:val="20"/>
-          <w:bdr w:val="nil"/>
-          <w:lang w:val="hr-HR" w:eastAsia="es-MX"/>
-        </w:rPr>
-        <w:t xml:space="preserve">volume relative to its prior 60-day mean (1.97%, 2.16%, and 2.63%) and of the prior 20-day return (1.41%, 2.18%, and 3.16%), which fits readings (1) and (2) alike, and stays positive and significant in the lowest tercile of each proxy (</w:t>
-      </w:r>
-      <w:r>
-        <w:rPr>
-          <w:rFonts w:asciiTheme="minorHAnsi" w:eastAsia="Georgia" w:hAnsiTheme="minorHAnsi" w:cstheme="minorHAnsi"/>
-          <w:i/>
-          <w:color w:val="000000"/>
-          <w:sz w:val="20"/>
-          <w:szCs w:val="20"/>
-          <w:bdr w:val="nil"/>
-          <w:lang w:val="hr-HR" w:eastAsia="es-MX"/>
-        </w:rPr>
-        <w:t xml:space="preserve">t</w:t>
-      </w:r>
-      <w:r>
-        <w:rPr>
-          <w:rFonts w:asciiTheme="minorHAnsi" w:eastAsia="Georgia" w:hAnsiTheme="minorHAnsi" w:cstheme="minorHAnsi"/>
-          <w:color w:val="000000"/>
-          <w:sz w:val="20"/>
-          <w:szCs w:val="20"/>
-          <w:bdr w:val="nil"/>
-          <w:lang w:val="hr-HR" w:eastAsia="es-MX"/>
-        </w:rPr>
-        <w:t xml:space="preserve"> </w:t>
-      </w:r>
-      <w:r>
-        <w:rPr>
-          <w:rFonts w:asciiTheme="minorHAnsi" w:eastAsia="Georgia" w:hAnsiTheme="minorHAnsi" w:cstheme="minorHAnsi"/>
-          <w:color w:val="000000"/>
-          <w:sz w:val="20"/>
-          <w:szCs w:val="20"/>
-          <w:bdr w:val="nil"/>
-          <w:lang w:val="hr-HR" w:eastAsia="es-MX"/>
-        </w:rPr>
-        <w:t xml:space="preserve">= 4.8 and 4.2). For floors the gap moves from −1.20% to −0.68% across volume terciles and is not monotone in the prior return, so the attention reading does not carry over. Second, the comparison with stocks that closed at their high removes selection on the shape of the close but not on news. The intraday giveback fits readings (2) and (3) at least as well as permanent price discovery, so</w:t>
-      </w:r>
-      <w:r>
-        <w:rPr>
-          <w:rFonts w:asciiTheme="minorHAnsi" w:eastAsia="Georgia" w:hAnsiTheme="minorHAnsi" w:cstheme="minorHAnsi"/>
-          <w:color w:val="000000"/>
-          <w:sz w:val="20"/>
-          <w:szCs w:val="20"/>
-          <w:bdr w:val="nil"/>
-          <w:lang w:val="hr-HR" w:eastAsia="es-MX"/>
-        </w:rPr>
-        <w:t xml:space="preserve"> </w:t>
-      </w:r>
-      <w:r>
-        <w:rPr>
-          <w:rFonts w:asciiTheme="minorHAnsi" w:eastAsia="Georgia" w:hAnsiTheme="minorHAnsi" w:cstheme="minorHAnsi"/>
-          <w:color w:val="000000"/>
-          <w:sz w:val="20"/>
-          <w:szCs w:val="20"/>
-          <w:bdr w:val="nil"/>
-          <w:lang w:val="hr-HR" w:eastAsia="es-MX"/>
-        </w:rPr>
-        <w:t xml:space="preserve">“</w:t>
-      </w:r>
-      <w:r>
-        <w:rPr>
-          <w:rFonts w:asciiTheme="minorHAnsi" w:eastAsia="Georgia" w:hAnsiTheme="minorHAnsi" w:cstheme="minorHAnsi"/>
-          <w:color w:val="000000"/>
-          <w:sz w:val="20"/>
-          <w:szCs w:val="20"/>
-          <w:bdr w:val="nil"/>
-          <w:lang w:val="hr-HR" w:eastAsia="es-MX"/>
-        </w:rPr>
-        <w:t xml:space="preserve">break at the limit</w:t>
-      </w:r>
-      <w:r>
-        <w:rPr>
-          <w:rFonts w:asciiTheme="minorHAnsi" w:eastAsia="Georgia" w:hAnsiTheme="minorHAnsi" w:cstheme="minorHAnsi"/>
-          <w:color w:val="000000"/>
-          <w:sz w:val="20"/>
-          <w:szCs w:val="20"/>
-          <w:bdr w:val="nil"/>
-          <w:lang w:val="hr-HR" w:eastAsia="es-MX"/>
-        </w:rPr>
-        <w:t xml:space="preserve">”</w:t>
-      </w:r>
-      <w:r>
-        <w:rPr>
-          <w:rFonts w:asciiTheme="minorHAnsi" w:eastAsia="Georgia" w:hAnsiTheme="minorHAnsi" w:cstheme="minorHAnsi"/>
-          <w:color w:val="000000"/>
-          <w:sz w:val="20"/>
-          <w:szCs w:val="20"/>
-          <w:bdr w:val="nil"/>
-          <w:lang w:val="hr-HR" w:eastAsia="es-MX"/>
-        </w:rPr>
-        <w:t xml:space="preserve"> </w:t>
-      </w:r>
-      <w:r>
-        <w:rPr>
-          <w:rFonts w:asciiTheme="minorHAnsi" w:eastAsia="Georgia" w:hAnsiTheme="minorHAnsi" w:cstheme="minorHAnsi"/>
-          <w:color w:val="000000"/>
-          <w:sz w:val="20"/>
-          <w:szCs w:val="20"/>
-          <w:bdr w:val="nil"/>
-          <w:lang w:val="hr-HR" w:eastAsia="es-MX"/>
-        </w:rPr>
-        <w:t xml:space="preserve">is a description and delayed price discovery one hypothesis. Testing the magnet effect (Chen et al., 2024; Cho et al., 2003) needs intraday prices, which we lack.</w:t>
-      </w:r>
-    </w:p>
-    <w:p>
-      <w:pPr>
-        <w:tabs>
-          <w:tab w:val="left" w:pos="1740"/>
-        </w:tabs>
-        <w:spacing w:after="0" w:line="240" w:lineRule="auto"/>
-        <w:ind w:firstLine="567"/>
-        <w:jc w:val="both"/>
-        <w:rPr>
-          <w:rFonts w:asciiTheme="minorHAnsi" w:eastAsia="Georgia" w:hAnsiTheme="minorHAnsi" w:cstheme="minorHAnsi"/>
-          <w:bCs/>
-          <w:color w:val="000000"/>
-          <w:sz w:val="20"/>
-          <w:szCs w:val="20"/>
-          <w:u w:color="000000"/>
-          <w:bdr w:val="nil"/>
-          <w:lang w:val="hr-HR" w:eastAsia="es-MX"/>
-        </w:rPr>
-      </w:pPr>
-    </w:p>
-    <w:p>
-      <w:pPr>
-        <w:keepNext/>
-        <w:tabs>
-          <w:tab w:val="left" w:pos="1740"/>
-        </w:tabs>
-        <w:spacing w:after="0"/>
-        <w:jc w:val="center"/>
-        <w:rPr>
-          <w:rFonts w:asciiTheme="minorHAnsi" w:eastAsia="Georgia" w:hAnsiTheme="minorHAnsi" w:cstheme="minorHAnsi"/>
-          <w:bCs/>
-          <w:color w:val="000000"/>
-          <w:sz w:val="18"/>
-          <w:szCs w:val="18"/>
-          <w:u w:color="000000"/>
-          <w:bdr w:val="nil"/>
-          <w:lang w:val="hr-HR" w:eastAsia="es-MX"/>
-        </w:rPr>
-      </w:pPr>
-      <w:r>
-        <w:rPr>
-          <w:rFonts w:asciiTheme="minorHAnsi" w:eastAsia="Georgia" w:hAnsiTheme="minorHAnsi" w:cstheme="minorHAnsi"/>
-          <w:b/>
-          <w:bCs/>
-          <w:color w:val="632423" w:themeColor="accent2" w:themeShade="80"/>
-          <w:sz w:val="18"/>
-          <w:szCs w:val="18"/>
-          <w:u w:color="000000"/>
-          <w:bdr w:val="nil"/>
-          <w:lang w:val="hr-HR" w:eastAsia="es-MX"/>
-        </w:rPr>
-        <w:t xml:space="preserve">Table 4</w:t>
-      </w:r>
-      <w:r>
-        <w:rPr>
-          <w:rFonts w:asciiTheme="minorHAnsi" w:eastAsia="Georgia" w:hAnsiTheme="minorHAnsi" w:cstheme="minorHAnsi"/>
-          <w:color w:val="000000"/>
-          <w:sz w:val="18"/>
-          <w:szCs w:val="18"/>
-          <w:bdr w:val="nil"/>
-          <w:lang w:val="hr-HR" w:eastAsia="es-MX"/>
-        </w:rPr>
-        <w:t xml:space="preserve"> splits the events at 5 May 2025, when HOSE moved to the KRX platform.</w:t>
+        <w:t xml:space="preserve">Table 4 splits the events at 5 May 2025, when HOSE moved to the KRX platform.</w:t>
       </w:r>
     </w:p>
     <w:p>

</xml_diff>

<commit_message>
Paper C MSJ: apply screened language edits (academic_writing_style tense rules, US dates, the HOSE), acronym check, fix Unicode in table notes; log accepted and rejected edits
Co-Authored-By: Claude Opus 5.5 <noreply@anthropic.com>
Claude-Session: https://claude.ai/code/session_011zPDaCYE4jmmpoRvPu4SUX
</commit_message>
<xml_diff>
--- a/paper2/final/MSJ/Manuscript_MSJ.docx
+++ b/paper2/final/MSJ/Manuscript_MSJ.docx
@@ -1210,7 +1210,7 @@
           <w:bdr w:val="nil"/>
           <w:lang w:val="hr-HR" w:eastAsia="es-MX"/>
         </w:rPr>
-        <w:t xml:space="preserve">A daily price limit prevents a stock from moving beyond a fixed band within one trading day. Exchanges in Tokyo, Taipei, Seoul, Shenzhen, and Ho Chi Minh City have used limits to cool markets after large shocks, and economists ask whether a limit protects prices or postpones their adjustments. The question is sharpest where limit closes are common and call auctions set opening and closing prices. The Ho Chi Minh Stock Exchange (HOSE) has both features: one 7% band applies to all stocks, and about 2.0% of stock-days in our event window close at the upper limit (a ceiling close; Section 2.2) and about 1.4% at the lower limit (a floor close).</w:t>
+        <w:t xml:space="preserve">A daily price limit prevents stocks from moving beyond a fixed band within a single trading day. Exchanges in Tokyo, Taipei, Seoul, Shenzhen, and Ho Chi Minh City have used limits to cool markets after large shocks, and economists ask whether a limit protects prices or postpones adjustment. The question is sharpest where limit closes are common and call auctions set opening and closing prices. The Ho Chi Minh Stock Exchange (HOSE) has both features: one 7% band applies to all stocks, and about 2.0% of stock-days in our event window close at the upper limit (a ceiling close; Section 2.2) and about 1.4% at the lower limit (a floor close).</w:t>
       </w:r>
     </w:p>
     <w:p>
@@ -1241,7 +1241,7 @@
           <w:bdr w:val="nil"/>
           <w:lang w:val="hr-HR" w:eastAsia="es-MX"/>
         </w:rPr>
-        <w:t xml:space="preserve">Studies on band changes document the effects on volatility, liquidity, and crash risk (Jia et al., 2024; Lien et al., 2019; Qi, 2023), and account-level data show that large investors buy on the limit day and sell on the next (Chen et al., 2019). Among the studies identified by the search described in Supplementary Material S1, only Huang et al. (2001) described the overnight-then-intraday pattern after limit hits, and the records we could access have no magnitudes. None measures the overnight gap and intraday return after a limit close against a benchmark, places the limit result in a family of tests that controls for the other price-based signals a researcher could have examined, or examines the 2025 move of the HOSE to a new trading platform.</w:t>
+        <w:t xml:space="preserve">Studies on band changes have documented the effects on volatility, liquidity, and crash risk (Jia et al., 2024; Lien et al., 2019; Qi, 2023), and account-level data have shown that large investors buy on the limit day and sell on the next (Chen et al., 2019). Among the studies identified by the search described in Supplementary Material S1, only Huang et al. (2001) described the overnight-then-intraday pattern after limit hits, and the records we could access had no magnitudes. None measures the overnight gap and intraday return after a limit close against a benchmark, places the limit result in a family of tests that controls for other price-based signals a researcher could have examined, or examines the 2025 move of the HOSE to a new trading platform.</w:t>
       </w:r>
     </w:p>
     <w:p>
@@ -1272,7 +1272,7 @@
           <w:bdr w:val="nil"/>
           <w:lang w:val="hr-HR" w:eastAsia="es-MX"/>
         </w:rPr>
-        <w:t xml:space="preserve">We estimate the abnormal return after the ceiling and floor close on the HOSE, split it into overnight gap and intraday return, and test whether an outside buyer can capture it. We place the four limit tests in a family of 26 tests with 22 price- and volume-based characteristics and control the false discovery rate (FDR; Benjamini &amp; Hochberg, 1995; Harvey et al., 2016).</w:t>
+        <w:t xml:space="preserve">We estimate the abnormal return after the ceiling and floor close on the HOSE, split it into an overnight gap and an intraday return, and test whether an outside buyer can capture it. We place the four limit tests in a family of 26 tests with 22 price- and volume-based characteristics and control the false discovery rate (FDR; Benjamini &amp; Hochberg, 1995; Harvey et al., 2016).</w:t>
       </w:r>
     </w:p>
     <w:p>
@@ -1303,7 +1303,7 @@
           <w:bdr w:val="nil"/>
           <w:lang w:val="hr-HR" w:eastAsia="es-MX"/>
         </w:rPr>
-        <w:t xml:space="preserve">We make three contributions. First, we measure the overnight gap and the intraday return after limit closes, a pattern that Huang et al. (2001) describe qualitatively for Taiwan, and show that the ceiling effect is a gap of 2.2%, of which the following session reverses 24%. Second, we show that the ceiling gap is 2.7 percentage points larger than after rises of 5% to 6.5% that stop short of the limit, and that the contrast survives when the comparison stocks also close at their daily high. Third, we show that all four limit tests survive a multiplicity-controlled family in which no characteristic survives and that a buyer at the next open loses 0.7% against the market by the fifth close. We also split the events at the 2025 platform change.</w:t>
+        <w:t xml:space="preserve">This study makes three contributions. First, we measure the overnight gap and the intraday return after limit closes, a pattern that Huang et al. (2001) describe qualitatively for Taiwan, and show that the ceiling effect is a gap of 2.2%, of which the following session reverses 24%. Second, we show that the ceiling gap is 2.7 percentage points larger than after rises of 5% to 6.5% that stop short of the limit, and that the contrast survives when the comparison stocks also close at their daily high. Third, we show that all four limit tests survive a multiplicity-controlled family in which no characteristic survives and that a buyer at the next open loses 0.7% against the market by the fifth close. We also split the events at the 2025 platform change.</w:t>
       </w:r>
     </w:p>
     <w:p>
@@ -1425,7 +1425,7 @@
           <w:bdr w:val="nil"/>
           <w:lang w:val="hr-HR" w:eastAsia="es-MX"/>
         </w:rPr>
-        <w:t xml:space="preserve">Models predict protection or distortion, depending on the source of the shock. Brennan (1986) rationalizes limits in futures markets, Kodres and O’Brien (1994) show that well-chosen limits can be Pareto superior when fundamental news drives prices because they partly insure traders against implementation risk, and Greenwald and Stein (1991) link crashes to imperfect transactional mechanisms. Subrahmanyam (1994) shows that halts can advance trades in time and raise price variability, and in the model of Chen et al. (2024), volatility rises as the price nears a circuit breaker, a magnet effect. A limit that only delays adjustment leaves a predictable next-day continuation, which the return after a limit close can reveal.</w:t>
+        <w:t xml:space="preserve">Models predict protection or distortion depending on the source of the shock. Brennan (1986) rationalized limits in futures markets, Kodres and O’Brien (1994) showed that well-chosen limits can be Pareto superior when fundamental news drives prices because they partly insure traders against implementation risk, and Greenwald and Stein (1991) linked crashes to imperfect transactional mechanisms. Subrahmanyam (1994) showed that halts can advance trades in time and raise price variability. In the model of Chen et al. (2024), volatility rises as the price nears a circuit breaker, a magnet effect. A limit that only delays adjustment leaves a predictable next-day continuation, which the return after a limit close can reveal.</w:t>
       </w:r>
     </w:p>
     <w:p>
@@ -1479,7 +1479,7 @@
           <w:bdr w:val="nil"/>
           <w:lang w:val="hr-HR" w:eastAsia="es-MX"/>
         </w:rPr>
-        <w:t xml:space="preserve">Kim and Rhee (1997) find support in Tokyo for three criticisms of limits: they spill volatility into later days, delay price discovery, and interfere with trading. Bildik and Gülay (2006) find the same in Istanbul, with stronger evidence from price locks than from limit moves alone. Chen (1993) finds that serial correlation falls as the Taiwanese limit widens, which implies delayed adjustment under the narrower limit. Berkman and Lee (2002) examine volatility and trading activity around a revision of the Korean limit system. Huang et al. (2001) report for Taiwan that the overnight overreaction after limit hits reverses during the following day, the timing pattern we test. Cho et al. (2003) find a magnet effect: prices accelerate toward the upper limit in five-minute Taiwanese datasets. Kim and Limpaphayom (2000) show that small, volatile, high-volume stocks hit limits more often, whereas Deb et al. (2013) argue that rigid limits in Tokyo can disrupt price discovery and liquidity provision.</w:t>
+        <w:t xml:space="preserve">Kim and Rhee (1997) found support in Tokyo for three criticisms of limits: they spill volatility into later days, delay price discovery, and interfere with trading. Bildik and Gülay (2006) found the same result in Istanbul, with stronger evidence from price locks than from limit moves alone. Chen (1993) found that serial correlation decreases as the Taiwanese limit widens, which implies delayed adjustment under the narrower limit. Berkman and Lee (2002) examined volatility and trading activity around the revision of the Korean limit system. Huang et al. (2001) reported for Taiwan that the overnight overreaction after limit hits reverses the following day, the timing pattern we test. Cho et al. (2003) found a magnet effect: prices accelerate toward the upper limit in five-minute Taiwanese datasets. Kim and Limpaphayom (2000) showed that small, volatile, and high-volume stocks hit limits more often, whereas Deb et al. (2013) argued that rigid limits in Tokyo can disrupt price discovery and liquidity provision.</w:t>
       </w:r>
     </w:p>
     <w:p>
@@ -1533,7 +1533,7 @@
           <w:bdr w:val="nil"/>
           <w:lang w:val="hr-HR" w:eastAsia="es-MX"/>
         </w:rPr>
-        <w:t xml:space="preserve">After ChiNext widened its band from 10% to 20% in August 2020, Qi (2023) confirms delayed price discovery, volatility spillover, and trading interference, stronger at the lower limit and with no magnet effect; Zhang et al. (2022) find higher liquidity, volatility, and probability of informed trading; and Jia et al. (2024) find lower crash risk. Wider bands raised spreads and intraday volatility but improved execution quality in Taiwan (Lien et al., 2019) and raised intraday realized variance in Korea (Kim &amp; Jun, 2019). In Shenzhen account data, large investors buy on the day a stock hits the 10% upper limit and sell the next day, and their limit-day net buying predicts stronger long-run reversal (Chen et al., 2019). Stocks with large limit exposure attract attention and earn lower future returns, most where retail investors hold many shares (Lin et al., 2023), and stocks with frequent upper-limit hits also earn lower future returns (Zeng et al., 2024). Liang and Hu (2025) forecast limit hits; the record we could access reports no returns after the hit.</w:t>
+        <w:t xml:space="preserve">After ChiNext widened its band from 10% to 20% in August 2020, Qi (2023) confirmed delayed price discovery, volatility spillover, and trading interference, stronger at the lower limit and with no magnet effect. Zhang et al. (2022) found higher liquidity, volatility, and probability of informed trading, and Jia et al. (2024) found lower crash risk. Wider bands raised spreads and intraday volatility but improved execution quality in Taiwan (Lien et al., 2019) and raised intraday realized variance in Korea (Kim &amp; Jun, 2019). In Shenzhen account data, large investors buy on the day a stock hits the 10% upper limit and sell the next day, and their limit-day net buying predicts a stronger long-run reversal (Chen et al., 2019). Stocks with large limit exposures attract attention and earn lower future returns, especially where retail investors hold many shares (Lin et al., 2023), and stocks with frequent upper-limit hits also earn lower future returns (Zeng et al., 2024). Liang and Hu (2025) forecast limit hits; the record we could access reports no returns after the hit.</w:t>
       </w:r>
     </w:p>
     <w:p>
@@ -1587,7 +1587,7 @@
           <w:bdr w:val="nil"/>
           <w:lang w:val="hr-HR" w:eastAsia="es-MX"/>
         </w:rPr>
-        <w:t xml:space="preserve">Kelly and Clark (2011) show for index funds that overnight and intraday returns differ. In U.S. stocks, positive overnight returns are followed by intraday reversals, concentrated among stocks with recent retail attention (Berkman et al., 2012). Aboody et al. (2018) tie overnight persistence to sentiment, Lou et al. (2019) find overnight and intraday continuation with an offsetting cross-period reversal, Akbas et al. (2022) find that persistent positive-overnight, negative-daytime patterns predict higher returns, Bogousslavsky (2021) links the split to margin and lending costs, and Lu et al. (2023) link it to market makers who absorb retail imbalances near the open. In China, overnight returns are negative on average, which Qiao and Dam (2020) link to the T+1 rule that bars selling shares on the day of purchase; the lottery-like anomaly arises mainly overnight (Gu et al., 2025); day-night anomalies concentrate at the open and close (Qiu et al., 2025); and small retail investors show weak stock selection (Jones et al., 2025).</w:t>
+        <w:t xml:space="preserve">Kelly and Clark (2011) showed that overnight and intraday returns differ for index funds. In U.S. stocks, positive overnight returns are followed by intraday reversals, concentrated among stocks with recent retail attention (Berkman et al., 2012). Aboody et al. (2018) tied overnight persistence to sentiment, Lou et al. (2019) found overnight and intraday continuation with an offsetting cross-period reversal, Akbas et al. (2022) found that persistent positive-overnight and negative-daytime patterns predict higher returns, Bogousslavsky (2021) linked the split to margin and lending costs, and Lu et al. (2023) linked it to market makers who absorb retail imbalances near the open. In China, overnight returns are negative on average, which Qiao and Dam (2020) linked to the T+1 rule that bars selling shares on the day of purchase; the lottery-like anomaly arises mainly overnight (Gu et al., 2025); day-night anomalies concentrate at the open and close (Qiu et al., 2025); and small retail investors show weak stock selection (Jones et al., 2025).</w:t>
       </w:r>
     </w:p>
     <w:p>
@@ -1641,7 +1641,7 @@
           <w:bdr w:val="nil"/>
           <w:lang w:val="hr-HR" w:eastAsia="es-MX"/>
         </w:rPr>
-        <w:t xml:space="preserve">Harvey et al. (2016) argue that a new factor needs a</w:t>
+        <w:t xml:space="preserve">Harvey et al. (2016) argued that a new factor needs a</w:t>
       </w:r>
       <w:r>
         <w:rPr>
@@ -1675,7 +1675,7 @@
           <w:bdr w:val="nil"/>
           <w:lang w:val="hr-HR" w:eastAsia="es-MX"/>
         </w:rPr>
-        <w:t xml:space="preserve">-statistic above 3.0, Harvey and Liu (2020) tie the hurdle to a chosen FDR, Chordia et al. (2020) put multiple-testing thresholds for cross-sectional regressions near 3.4, and Hou et al. (2020) find that, with microcaps mitigated, 65% of 452 anomalies fail the single-test hurdle of 1.96. Petersen (2009) compares standard-error estimators for panel data, which motivates our alternative clusters, and Gutierrez and Kelley (2008) study weekly returns, the frequency of our regressions. For Vietnam, Huang et al. (2023) find a size effect and an earnings-to-price effect; our search (Supplementary Material S1) identified no peer-reviewed study of post-limit returns on HOSE.</w:t>
+        <w:t xml:space="preserve">-statistic above 3.0, Harvey and Liu (2020) tied the hurdle to a chosen FDR, Chordia et al. (2020) put multiple-testing thresholds for cross-sectional regressions near 3.4, and Hou et al. (2020) found that with microcaps mitigated, 65% of 452 anomalies fail the single-test hurdle of 1.96. Petersen (2009) compared standard-error estimators for panel data, which motivates our alternative clusters, and Gutierrez and Kelley (2008) studied weekly returns, the frequency of our regressions. For Vietnam, Huang et al. (2023) found a size effect and an earnings-to-price effect; our search (Supplementary Material S1) identified no peer-reviewed study of post-limit returns on the HOSE.</w:t>
       </w:r>
     </w:p>
     <w:p>
@@ -1729,7 +1729,7 @@
           <w:bdr w:val="nil"/>
           <w:lang w:val="hr-HR" w:eastAsia="es-MX"/>
         </w:rPr>
-        <w:t xml:space="preserve">These studies compare band regimes, sort stocks by limit exposure, or split overnight and intraday returns for all stocks. Among the studies our search identified, only Huang et al. (2001) link limit hits to the overnight-intraday split, and none controls for multiple testing or uses the 2025 platform change. If a limit delays price discovery, a ceiling close predicts a positive next-day abnormal return and a floor close a negative one (H</w:t>
+        <w:t xml:space="preserve">These studies compared band regimes, sorted stocks by limit exposure, or split overnight and intraday returns for all stocks. Among the studies our search identified, only Huang et al. (2001) linked limit hits to the overnight-intraday split, and none controlled for multiple testing or used the 2025 platform change. If a limit delays price discovery, a ceiling close predicts a positive next-day abnormal return, and a floor close predicts a negative one (H</w:t>
       </w:r>
       <w:r>
         <w:rPr>
@@ -1752,7 +1752,7 @@
           <w:bdr w:val="nil"/>
           <w:lang w:val="hr-HR" w:eastAsia="es-MX"/>
         </w:rPr>
-        <w:t xml:space="preserve">). If the opening auction absorbs the blocked demand, the effect concentrates in the overnight gap (H</w:t>
+        <w:t xml:space="preserve">). If the opening auction absorbs blocked demand, the effect concentrates in the overnight gap (H</w:t>
       </w:r>
       <w:r>
         <w:rPr>
@@ -1775,7 +1775,7 @@
           <w:bdr w:val="nil"/>
           <w:lang w:val="hr-HR" w:eastAsia="es-MX"/>
         </w:rPr>
-        <w:t xml:space="preserve">). If the limit itself drives the gap, the gap after a limit close exceeds the gap after moves of similar size that stop short of the limit (H</w:t>
+        <w:t xml:space="preserve">). If the limit itself drives the gap, the gap after a limit close exceeds the gap after moves of a similar size that stop short of the limit (H</w:t>
       </w:r>
       <w:r>
         <w:rPr>
@@ -1798,7 +1798,7 @@
           <w:bdr w:val="nil"/>
           <w:lang w:val="hr-HR" w:eastAsia="es-MX"/>
         </w:rPr>
-        <w:t xml:space="preserve">). An investor who buys at the next open earns no positive abnormal return through the fifth trading day (H</w:t>
+        <w:t xml:space="preserve">). An investor who buys at the next open earns no positive abnormal returns through the fifth trading day (H</w:t>
       </w:r>
       <w:r>
         <w:rPr>
@@ -2009,7 +2009,7 @@
           <w:bdr w:val="nil"/>
           <w:lang w:val="hr-HR" w:eastAsia="es-MX"/>
         </w:rPr>
-        <w:t xml:space="preserve">On 24 September 2026, we downloaded daily open, high, low, close, and volume series for all HOSE-listed stocks with the vnstock Python library (version 4.0.4; source Vietcap Securities, VCI). A listing file from the same source and date (743 rows, all instrument types) defines the universe. The retrieval returned 405 HOSE stock files with records through 23 September 2026, and we use the 519 trading days from 21 August 2024. Prices are in thousand dong. The vendor does not document corporate-action adjustment, and the files contain no market capitalization, order book, investor type, or news.</w:t>
+        <w:t xml:space="preserve">On September 24, 2026, we downloaded daily open, high, low, close, and volume series for all HOSE-listed stocks with the vnstock Python library (version 4.0.4; source Vietcap Securities, VCI). A listing file from the same source and date (743 rows for all instrument types) defines the universe. The retrieval returned 405 HOSE stock files with records through September 23, 2026, and we used the 519 trading days from August 21, 2024. Prices are in thousand dong. The vendor does not document corporate-action adjustment, and the files contain no market capitalization, order book, investor type, or news.</w:t>
       </w:r>
     </w:p>
     <w:p>
@@ -2063,7 +2063,7 @@
           <w:bdr w:val="nil"/>
           <w:lang w:val="hr-HR" w:eastAsia="es-MX"/>
         </w:rPr>
-        <w:t xml:space="preserve">We keep the 347 stocks with at least 95% non-missing closes, 178,773 stock-days in all. The daily close-to-close return has a mean of 0.018%, a median of 0.00%, and a standard deviation of 2.10%. Dollar volume (price times shares traded, in dong) is skewed, with a median of 2.6 billion dong per stock-day and a mean of 51.2 billion. The stocks span 18 two-digit Industry Classification Benchmark sectors; the largest holds 15% of them.</w:t>
+        <w:t xml:space="preserve">We kept the 347 stocks with at least 95% non-missing closes, 178,773 stock-days in all. The daily close-to-close return has a mean of 0.018%, a median of 0.00%, and a standard deviation of 2.10%. Dollar volume (price times shares traded, in dong) is skewed, with a median of 2.6 billion dong per stock-day and a mean of 51.2 billion. The stocks span 18 two-digit Industry Classification Benchmark sectors; the largest holds 15% of them.</w:t>
       </w:r>
     </w:p>
     <w:p>
@@ -2117,7 +2117,7 @@
           <w:bdr w:val="nil"/>
           <w:lang w:val="hr-HR" w:eastAsia="es-MX"/>
         </w:rPr>
-        <w:t xml:space="preserve">HOSE sets a daily price limit of 7% around the reference price, the previous close on normal trading days (Ho Chi Minh City Securities Corporation [HSC], 2025). On 5 May 2025, HOSE moved to the trading platform of the Korea Exchange (KRX). The band stayed unchanged, but at-the-open and at-the-close orders lost their priority over limit orders in the opening and closing call auctions (HSC, 2025; Viet Nam News, 2025), whose prices define our events and gaps. Treating the band, tick sizes, and reference-price rule as assumptions, we check the band against the data: 1.98% of stock-days fall between +6.5% and +7.1% and 1.30% between −7.1% and −6.5%, against 0.29% between +6.0% and +6.5%, a pile-up consistent with a 7% band.</w:t>
+        <w:t xml:space="preserve">The HOSE sets a daily price limit of 7% around the reference price, the previous close on normal trading days (Ho Chi Minh City Securities Corporation [HSC], 2025). On May 5, 2025, the HOSE moved to the trading platform of the Korea Exchange (KRX). The band remained unchanged, but at-the-open and at-the-close orders lost their priority over limit orders in the opening and closing call auctions (HSC, 2025; Viet Nam News, 2025), whose prices define our events and gaps. Treating the band, tick sizes, and reference-price rule as assumptions, we check the band against the data: 1.98% of stock-days fall between +6.5% and +7.1% and 1.30% between −7.1% and −6.5%, against 0.29% between +6.0% and +6.5%, a pile-up consistent with a 7% band.</w:t>
       </w:r>
     </w:p>
     <w:p>
@@ -2784,7 +2784,7 @@
           <w:bdr w:val="nil"/>
           <w:lang w:val="hr-HR" w:eastAsia="es-MX"/>
         </w:rPr>
-        <w:t xml:space="preserve">, and a floor event has</w:t>
+        <w:t xml:space="preserve">, whereas a floor event has</w:t>
       </w:r>
       <w:r>
         <w:rPr>
@@ -2927,7 +2927,7 @@
           <w:bdr w:val="nil"/>
           <w:lang w:val="hr-HR" w:eastAsia="es-MX"/>
         </w:rPr>
-        <w:t xml:space="preserve">. The event window runs from day 61, once a 60-day volume history exists, to five days before the sample end. The market return weights stocks by dollar volume,</w:t>
+        <w:t xml:space="preserve">. The event window runs from day 61, when a 60-day volume history exists, to five days before the sample end. The market return weights stocks by dollar volume,</w:t>
       </w:r>
     </w:p>
     <w:p>
@@ -4041,7 +4041,7 @@
           <w:bdr w:val="nil"/>
           <w:lang w:val="hr-HR" w:eastAsia="es-MX"/>
         </w:rPr>
-        <w:t xml:space="preserve">below 10, from 10 to below 50, and from 50 upward. Other events are near hits (see Section 4.1 on vendor price adjustment).</w:t>
+        <w:t xml:space="preserve">below 10, from 10 to below 50, and from 50 upward. Other events are near hits (see Section 4.1, vendor price adjustment).</w:t>
       </w:r>
     </w:p>
     <w:p>
@@ -5236,7 +5236,7 @@
           <w:bdr w:val="nil"/>
           <w:lang w:val="hr-HR" w:eastAsia="es-MX"/>
         </w:rPr>
-        <w:t xml:space="preserve">and abnormal values subtract the market counterpart of each component, the same-interval return across stocks weighted with</w:t>
+        <w:t xml:space="preserve">and abnormal values subtract the market counterpart of each component, the same-interval return across stocks weighted by</w:t>
       </w:r>
       <w:r>
         <w:rPr>
@@ -5688,7 +5688,7 @@
           <w:bdr w:val="nil"/>
           <w:lang w:val="hr-HR" w:eastAsia="es-MX"/>
         </w:rPr>
-        <w:t xml:space="preserve">The event definition uses only returns and the close-at-high (close-at-low) condition, which proportional price adjustment by the vendor leaves unchanged except on ex-dates; the exact-hit split is a diagnostic only (Section 4.1). Event counts differ across exhibits because each outcome needs different data. Table 1 requires returns on all five days after the event (3,187 ceiling and 2,105 floor events). Tables 2 to 4 require the open and close of day</w:t>
+        <w:t xml:space="preserve">The event definition uses only returns and the close-at-high (close-at-low) condition, which proportional price adjustment by the vendor leaves unchanged except on ex-dates; the exact-hit split is a diagnostic only (Section 4.1). Event counts differ across exhibits because each outcome requires different data. Table 1 requires returns on all five days after the event (3,187 ceiling and 2,105 floor events). Tables 2 to 4 require the opening and closing prices of day</w:t>
       </w:r>
       <w:r>
         <w:rPr>
@@ -5768,7 +5768,7 @@
           <w:bdr w:val="nil"/>
           <w:lang w:val="hr-HR" w:eastAsia="es-MX"/>
         </w:rPr>
-        <w:t xml:space="preserve">+5 close, and the control benchmark requires at least 30 control stocks on the date (3,100 and 2,047 events). Figure 2 uses event days up to the second-to-last trading day (3,220 ceiling events). No event is dropped for any other reason.</w:t>
+        <w:t xml:space="preserve">+5 closing price, and the control benchmark requires at least 30 control stocks on the date (3,100 and 2,047 events). Figure 2 uses event days up to the second-to-last trading day (3,220 ceiling events). No event was dropped for any other reason.</w:t>
       </w:r>
     </w:p>
     <w:p>
@@ -6356,7 +6356,7 @@
           <w:bdr w:val="nil"/>
           <w:lang w:val="hr-HR" w:eastAsia="es-MX"/>
         </w:rPr>
-        <w:t xml:space="preserve">indexes clusters: event dates, ISO calendar weeks, or blocks of ten consecutive trading days. The family</w:t>
+        <w:t xml:space="preserve">indexes clusters: event dates, calendar weeks (ISO 8601), or blocks of ten consecutive trading days. The family</w:t>
       </w:r>
       <w:r>
         <w:rPr>
@@ -6445,7 +6445,7 @@
           <w:bdr w:val="nil"/>
           <w:lang w:val="hr-HR" w:eastAsia="es-MX"/>
         </w:rPr>
-        <w:t xml:space="preserve">, and take a normal reference; Table 1</w:t>
+        <w:t xml:space="preserve">, and take a normal reference. Table 1</w:t>
       </w:r>
       <w:r>
         <w:rPr>
@@ -7056,7 +7056,7 @@
           <w:bdr w:val="nil"/>
           <w:lang w:val="hr-HR" w:eastAsia="es-MX"/>
         </w:rPr>
-        <w:t xml:space="preserve">(five-trading-day periods, not the calendar weeks used for clustering), each followed by a non-overlapping five-day holding period. Each week we rank-normalize each characteristic</w:t>
+        <w:t xml:space="preserve">(five-trading-day periods, not the calendar weeks used for clustering), each followed by a non-overlapping five-day holding period. Each week, we rank-normalize each characteristic</w:t>
       </w:r>
       <w:r>
         <w:rPr>
@@ -7710,7 +7710,7 @@
           <w:bdr w:val="nil"/>
           <w:lang w:val="hr-HR" w:eastAsia="es-MX"/>
         </w:rPr>
-        <w:t xml:space="preserve">with weekly intercept</w:t>
+        <w:t xml:space="preserve">with a weekly intercept</w:t>
       </w:r>
       <w:r>
         <w:rPr>
@@ -7906,7 +7906,7 @@
           <w:bdr w:val="nil"/>
           <w:lang w:val="hr-HR" w:eastAsia="es-MX"/>
         </w:rPr>
-        <w:t xml:space="preserve">uses Newey and West (1987) standard errors (four lags, Bartlett weights, no prewhitening) and 78 degrees of freedom. Supplementary Material S1 defines the 22 momentum, reversal, risk, liquidity, volume, and intraday characteristics. We also report long–short spreads between the extreme quintiles, before and after a cost of 25 basis points per unit of traded value. The minimum detectable effect at 80% power and a 5% two-sided level is</w:t>
+        <w:t xml:space="preserve">uses Newey and West’s (1987) standard errors (four lags, Bartlett weights, and no prewhitening) and 78 degrees of freedom. Supplementary Material S1 defines the 22 momentum, reversal, risk, liquidity, volume, and intraday characteristics. We also report long–short spreads between the extreme quintiles before and after a cost of 25 basis points per unit of traded value. The minimum detectable effect (MDE) at 80% power and a 5% two-sided level is</w:t>
       </w:r>
       <w:r>
         <w:rPr>
@@ -8579,7 +8579,7 @@
           <w:bdr w:val="nil"/>
           <w:lang w:val="hr-HR" w:eastAsia="es-MX"/>
         </w:rPr>
-        <w:t xml:space="preserve">and we also report Holm (1979) adjustments and the |</w:t>
+        <w:t xml:space="preserve">We also report Holm’s (1979) adjustments and the |</w:t>
       </w:r>
       <w:r>
         <w:rPr>
@@ -8645,7 +8645,7 @@
           <w:bdr w:val="nil"/>
           <w:lang w:val="hr-HR" w:eastAsia="es-MX"/>
         </w:rPr>
-        <w:t xml:space="preserve">, which controls the FDR at 5%; if its signs agree in the discovery half (the first 39 weeks, or events up to the median event date) and the confirmation half; and if its confirmation-half |</w:t>
+        <w:t xml:space="preserve">, which controls the FDR at 5%; if its signs agree in the discovery half (the first 39 weeks or events up to the median event date) and the confirmation half; and if its confirmation-half |</w:t>
       </w:r>
       <w:r>
         <w:rPr>
@@ -8668,7 +8668,7 @@
           <w:bdr w:val="nil"/>
           <w:lang w:val="hr-HR" w:eastAsia="es-MX"/>
         </w:rPr>
-        <w:t xml:space="preserve">| exceeds 1.96. Lookbacks overlap the discovery half, so the confirmation half is not a strict hold-out, and the weekly regressions (from day 120) and event window (from day 61) cover different spans. We place the four event tests and the 22 characteristics in one family because the analysis plan treated all 26 as candidate predictors of short-horizon returns examined on the same data, so the limit result pays for every candidate signal in the plan; Section 3 reports the event tests under alternative family definitions.</w:t>
+        <w:t xml:space="preserve">| exceeds 1.96. Lookbacks overlap with the discovery half, so the confirmation half is not a strict hold-out, and the weekly regressions (from day 120) and event window (from day 61) cover different spans. We place the four event tests and the 22 characteristics in one family because the analysis plan treated all 26 as candidate predictors of short-horizon returns examined on the same data, so the limit result pays for every candidate signal in the plan. Section 3 reports the event tests under alternative family definitions.</w:t>
       </w:r>
     </w:p>
     <w:p>
@@ -8722,7 +8722,7 @@
           <w:bdr w:val="nil"/>
           <w:lang w:val="hr-HR" w:eastAsia="es-MX"/>
         </w:rPr>
-        <w:t xml:space="preserve">We fixed the family, estimators, multiplicity control, and survival rule in a written analysis plan before computing results. A version-control time stamp dates the plan before the first analysis code, but no external registry holds it and we had examined related data in earlier work, so it gives no independent confirmation. We departed from it by reading its ambiguous second horizon as days</w:t>
+        <w:t xml:space="preserve">We fixed the family, estimators, multiplicity control, and survival rule in a written analysis plan before computing the results. A version-control time stamp dates the plan before the first analysis code, but no external registry holds it, and we had examined related data in earlier work, so it gives no independent confirmation. We departed from it by reading its ambiguous second horizon as days</w:t>
       </w:r>
       <w:r>
         <w:rPr>
@@ -8926,7 +8926,7 @@
           <w:bdr w:val="nil"/>
           <w:lang w:val="hr-HR" w:eastAsia="es-MX"/>
         </w:rPr>
-        <w:t xml:space="preserve">rest on them: the decomposition, next-open returns, control group, sub-limit comparison, exact hits, two-way clustering, subsamples, terciles, platform split, and outlier exclusion. We also screened several candidate ideas on the same data before choosing this one, so effect sizes may be overstated.</w:t>
+        <w:t xml:space="preserve">rest on them: decomposition, next-open returns, control group, sub-limit comparison, exact hits, two-way clustering, subsamples, terciles, platform split, and outlier exclusion. We also screened several candidate ideas on the same data before choosing this one, so the effect sizes may be overstated.</w:t>
       </w:r>
     </w:p>
     <w:p>
@@ -8980,7 +8980,7 @@
           <w:bdr w:val="nil"/>
           <w:lang w:val="hr-HR" w:eastAsia="es-MX"/>
         </w:rPr>
-        <w:t xml:space="preserve">We use R 4.3.3 (packages sandwich 3.1.0, lmtest 0.9.40, and ggplot2 3.4.4). One script reproduces every number, table, and figure; code, data, and output tables are public (Section 6.5).</w:t>
+        <w:t xml:space="preserve">We use R 4.3.3 (packages sandwich 3.1.0, lmtest 0.9.40, and ggplot2 3.4.4). One script reproduces every number, table, and figure; the code, data, and output tables are public (Section 6.5).</w:t>
       </w:r>
     </w:p>
     <w:p>
@@ -9077,7 +9077,7 @@
           <w:bdr w:val="nil"/>
           <w:lang w:val="hr-HR" w:eastAsia="es-MX"/>
         </w:rPr>
-        <w:t xml:space="preserve">The event sample holds 3,187 ceiling events on 446 dates and 2,105 floor events on 319 dates. Limit closes cluster in market episodes, so our standard errors allow dependence across dates, weeks, 10-day blocks, and stocks.</w:t>
+        <w:t xml:space="preserve">The event sample contains 3,187 ceiling events on 446 dates and 2,105 floor events on 319 dates. Limit closes cluster in market episodes, so our standard errors allow dependence across dates, weeks, 10-day blocks, and stocks.</w:t>
       </w:r>
     </w:p>
     <w:p>
@@ -9278,7 +9278,7 @@
           <w:bdr w:val="nil"/>
           <w:lang w:val="hr-HR" w:eastAsia="es-MX"/>
         </w:rPr>
-        <w:t xml:space="preserve">of 1.17 and 1.14). After the 25-basis-point cost, 18 of the 22 long–short quintile spreads are negative. With 79 weekly cross-sections, the MDE at 80% power is 0.12 to 0.31 percentage points per week per standard deviation, so the null excludes only large effects. With eight Newey–West lags the largest |</w:t>
+        <w:t xml:space="preserve">of 1.17 and 1.14). After the 25-basis-point cost, 18 of the 22 long–short quintile spreads are negative. With 79 weekly cross-sections, the MDE at 80% power is 0.12 to 0.31 percentage points per week per standard deviation; therefore, the null excludes only large effects. With eight Newey–West lags, the largest |</w:t>
       </w:r>
       <w:r>
         <w:rPr>
@@ -9332,7 +9332,7 @@
           <w:bdr w:val="nil"/>
           <w:lang w:val="hr-HR" w:eastAsia="es-MX"/>
         </w:rPr>
-        <w:t xml:space="preserve">Without market capitalization or accounting data, we cannot test the size and earnings-to-price effects that Huang et al. (2023) find in Vietnam, so our null does not contradict theirs. A short sample, which leaves a premium of a tenth of a percentage point per week below the MDE, and limits that censor the highs and lows of range-based characteristics can each produce the null, and we draw no conclusion about market efficiency from it.</w:t>
+        <w:t xml:space="preserve">Without market capitalization or accounting data, we cannot test the size and earnings-to-price effects that Huang et al. (2023) found in Vietnam; therefore, our null result does not contradict theirs. A short sample, which leaves a premium of a tenth of a percentage point per week below the MDE, and limits that censor the highs and lows of range-based characteristics can each produce the null, and we draw no conclusion about market efficiency.</w:t>
       </w:r>
     </w:p>
     <w:p>
@@ -9364,7 +9364,7 @@
           <w:bdr w:val="nil"/>
           <w:lang w:val="hr-HR" w:eastAsia="es-MX"/>
         </w:rPr>
-        <w:t xml:space="preserve">Table 1 reports the event tests. Ceiling closes earn a market-adjusted return of 1.66% on day</w:t>
+        <w:t xml:space="preserve">Table 1 presents the results of the event tests. Ceiling closes earn a market-adjusted return of 1.66% on day</w:t>
       </w:r>
       <w:r>
         <w:rPr>
@@ -9500,7 +9500,7 @@
           <w:bdr w:val="nil"/>
           <w:lang w:val="hr-HR" w:eastAsia="es-MX"/>
         </w:rPr>
-        <w:t xml:space="preserve">-values of at most 0.0004), keep their signs in both halves, and exceed |</w:t>
+        <w:t xml:space="preserve">-values of at most 0.0004), maintain their signs in both halves, and exceed |</w:t>
       </w:r>
       <w:r>
         <w:rPr>
@@ -9602,7 +9602,7 @@
           <w:bdr w:val="nil"/>
           <w:lang w:val="hr-HR" w:eastAsia="es-MX"/>
         </w:rPr>
-        <w:t xml:space="preserve">= −2.22 with week clusters), and all four tests survive the rule re-applied with week-clustered statistics.</w:t>
+        <w:t xml:space="preserve">= −2.22 with week clusters), and all four tests survive the rule reapplied with week-clustered statistics.</w:t>
       </w:r>
     </w:p>
     <w:p>
@@ -9701,7 +9701,7 @@
           <w:bdr w:val="nil"/>
           <w:lang w:val="hr-HR" w:eastAsia="es-MX"/>
         </w:rPr>
-        <w:t xml:space="preserve">+5 the ceiling return is −0.24% (</w:t>
+        <w:t xml:space="preserve">+5, the ceiling return is −0.24% (</w:t>
       </w:r>
       <w:r>
         <w:rPr>
@@ -9950,7 +9950,7 @@
           <w:bdr w:val="nil"/>
           <w:lang w:val="hr-HR" w:eastAsia="es-MX"/>
         </w:rPr>
-        <w:t xml:space="preserve">+5 as the second horizon, the ceiling test would fail and the floor test would fail the confirmation criterion. Ceiling closes carry a one-day effect, and floor closes a one-day effect plus some later drift. These tests support H</w:t>
+        <w:t xml:space="preserve">+5 as the second horizon, the ceiling test would fail, and the floor test would fail the confirmation criterion. Ceiling closes carry a one-day effect, whereas floor closes carry a one-day effect plus some later drift. These tests support H</w:t>
       </w:r>
       <w:r>
         <w:rPr>
@@ -10005,7 +10005,7 @@
           <w:bdr w:val="nil"/>
           <w:lang w:val="hr-HR" w:eastAsia="es-MX"/>
         </w:rPr>
-        <w:t xml:space="preserve">Table 2 decomposes the next-day return as in Equation (5). After a ceiling close the overnight gap is 2.24% (two-way-clustered</w:t>
+        <w:t xml:space="preserve">Table 2 decomposes the next-day return, as in Equation (5). After a ceiling close, the overnight gap is 2.24% (two-way-clustered</w:t>
       </w:r>
       <w:r>
         <w:rPr>
@@ -10084,7 +10084,7 @@
           <w:bdr w:val="nil"/>
           <w:lang w:val="hr-HR" w:eastAsia="es-MX"/>
         </w:rPr>
-        <w:t xml:space="preserve">= −3.5): the session reverses about 24% of the gap, and the close-to-close effect is positive because the gap exceeds the giveback. The effect sits in the opening auction, as H</w:t>
+        <w:t xml:space="preserve">= −3.5): the session reverses about 24% of the gap, and the close-to-close effect is positive because the gap exceeds the giveback. The effect occurs in the opening auction, as H</w:t>
       </w:r>
       <w:r>
         <w:rPr>
@@ -10149,7 +10149,7 @@
           <w:bdr w:val="nil"/>
           <w:lang w:val="hr-HR" w:eastAsia="es-MX"/>
         </w:rPr>
-        <w:t xml:space="preserve">After a floor close the gap is −0.97% (</w:t>
+        <w:t xml:space="preserve">After a floor close, the gap is −0.97% (</w:t>
       </w:r>
       <w:r>
         <w:rPr>
@@ -10183,7 +10183,7 @@
           <w:bdr w:val="nil"/>
           <w:lang w:val="hr-HR" w:eastAsia="es-MX"/>
         </w:rPr>
-        <w:t xml:space="preserve">= −4.6) and the intraday return is a weak reversal of 0.30%. The ceiling gap holds for exact limit hits (2.79%) and for the first day of a streak of exact hits (2.39%). Near hits show a smaller gap (1.67%) and no significant intraday return, but their median day-</w:t>
+        <w:t xml:space="preserve">= −4.6), and the intraday return is a weak reversal of 0.30%. The ceiling gap holds for exact limit hits (2.79%) and for the first day of a streak of exact hits (2.39%). Near hits show a smaller gap (1.67%) and no significant intraday return, but their median day-</w:t>
       </w:r>
       <w:r>
         <w:rPr>
@@ -10217,7 +10217,7 @@
           <w:bdr w:val="nil"/>
           <w:lang w:val="hr-HR" w:eastAsia="es-MX"/>
         </w:rPr>
-        <w:t xml:space="preserve">return is 6.89% against 6.90% for exact hits, and 83% of their closes are not multiples of the tick size. This points to later price adjustment by the vendor rather than to closes below the limit. The split is therefore weighted toward higher-priced stocks, where the tick is coarser, and we do not read the difference as a gradient toward the limit. The gap appears in both halves of the sample, on days locked at one price from open to close, and, for ceilings, in each tercile of 60-day average dollar volume (1.52% in the most liquid). Against same-date controls the ceiling gap is 2.70% and the floor close-to-close return −1.65%, so the floor effect depends on the benchmark. Floor events cluster on market-wide down days (740 of 2,111 remain without days on which the market fell more than 2%), and the floor gap is not significant in the least liquid tercile (</w:t>
+        <w:t xml:space="preserve">return is 6.89% compared with 6.90% for exact hits, and 83% of their closes are not multiples of the tick size. This points to later price adjustment by the vendor rather than closing below the limit. Therefore, the split is weighted toward higher-priced stocks, where the tick is coarser, and we do not read the difference as a gradient toward the limit. The gap appears in both halves of the sample, on days locked at one price from open to close, and, for ceilings, in each tercile of the 60-day average dollar volume (1.52% in the most liquid). Against same-date controls, the ceiling gap is 2.70% and the floor close-to-close return is −1.65%, so the floor effect depends on the benchmark. Floor events cluster on market-wide down days (740 of 2,111 remain without days on which the market fell by more than 2%), and the floor gap is not significant in the least liquid tercile (</w:t>
       </w:r>
       <w:r>
         <w:rPr>
@@ -10282,7 +10282,7 @@
           <w:bdr w:val="nil"/>
           <w:lang w:val="hr-HR" w:eastAsia="es-MX"/>
         </w:rPr>
-        <w:t xml:space="preserve">An outside buyer cannot capture the close-to-close continuation: a buyer who wants a stock at its ceiling joins a queue at the close, so the first obtainable price is the next open, which already contains the gap. From that open the ceiling return through the fifth close is −0.75% against the market (</w:t>
+        <w:t xml:space="preserve">An outside buyer cannot capture the close-to-close continuation: a buyer who wants a stock at its ceiling joins a queue at the close, so the first obtainable price is the next open, which already contains the gap. From that open, the ceiling return through the fifth close is −0.75% against the market (</w:t>
       </w:r>
       <w:r>
         <w:rPr>
@@ -10472,7 +10472,7 @@
           <w:bdr w:val="nil"/>
           <w:lang w:val="hr-HR" w:eastAsia="es-MX"/>
         </w:rPr>
-        <w:t xml:space="preserve">move. Inside the band the close-to-close relation is negative, a short-term reversal. At the limit the relation breaks, and the overnight gap jumps up at the ceiling and down at the floor.</w:t>
+        <w:t xml:space="preserve">move. Inside the band, the close-to-close relation is negative, a short-term reversal. At the limit, the relation breaks, and the overnight gap jumps up at the ceiling and down at the floor.</w:t>
       </w:r>
     </w:p>
     <w:p>
@@ -10572,7 +10572,7 @@
           <w:bdr w:val="nil"/>
           <w:lang w:val="hr-HR" w:eastAsia="es-MX"/>
         </w:rPr>
-        <w:t xml:space="preserve">= −9.7). Because the event rule requires a close at the day’s high (low), we repeat the comparison with stocks that also closed there. The ceiling gap is then 3.14 points larger (</w:t>
+        <w:t xml:space="preserve">= −9.7). Because the event rule requires a close at the day’s high (low), we repeat the comparison with stocks that also closed at their high (low). The ceiling gap is then 3.14 points larger (</w:t>
       </w:r>
       <w:r>
         <w:rPr>
@@ -10773,7 +10773,7 @@
           <w:bdr w:val="nil"/>
           <w:lang w:val="hr-HR" w:eastAsia="es-MX"/>
         </w:rPr>
-        <w:t xml:space="preserve">= 4.8 and 4.2). For floors the gap moves from −1.20% to −0.68% across volume terciles and is not monotone in the prior return, so the attention reading does not carry over. Second, the comparison with stocks that closed at their high removes selection on the shape of the close but not on news. The intraday giveback fits readings (2) and (3) at least as well as permanent price discovery, so</w:t>
+        <w:t xml:space="preserve">= 4.8 and 4.2). For floors, the gap moves from −1.20% to −0.68% across volume terciles and is not monotone in the prior return, so the attention reading does not carry over. Second, the comparison with stocks that closed at their high removes selection on the shape of the close, but not on news. The intraday giveback fits readings (2) and (3) at least as well as permanent price discovery, so</w:t>
       </w:r>
       <w:r>
         <w:rPr>
@@ -10839,7 +10839,7 @@
           <w:bdr w:val="nil"/>
           <w:lang w:val="hr-HR" w:eastAsia="es-MX"/>
         </w:rPr>
-        <w:t xml:space="preserve">is a description and delayed price discovery one hypothesis. Testing the magnet effect (Chen et al., 2024; Cho et al., 2003) needs intraday prices, which we lack.</w:t>
+        <w:t xml:space="preserve">is a description and delayed price discovery one hypothesis. Testing the magnet effect (Chen et al., 2024; Cho et al., 2003) requires intraday prices, which we lack.</w:t>
       </w:r>
     </w:p>
     <w:p>
@@ -10871,7 +10871,7 @@
           <w:bdr w:val="nil"/>
           <w:lang w:val="hr-HR" w:eastAsia="es-MX"/>
         </w:rPr>
-        <w:t xml:space="preserve">Table 4 splits the events at 5 May 2025, when HOSE moved to the KRX platform.</w:t>
+        <w:t xml:space="preserve">Table 4 splits the events on May 5, 2025, when the HOSE moved to the KRX platform.</w:t>
       </w:r>
     </w:p>
     <w:p>
@@ -11026,7 +11026,7 @@
           <w:bdr w:val="nil"/>
           <w:lang w:val="hr-HR" w:eastAsia="es-MX"/>
         </w:rPr>
-        <w:t xml:space="preserve">+5 exists only before the move (−1.73% before, −0.15% after). The change coincides with a different market period, and the post-change sample holds 71% of the ceiling events and 58% of the floor events. Before the change neither the ceiling close-to-close return (</w:t>
+        <w:t xml:space="preserve">+5 exists only before the move (−1.73% before, −0.15% after). The change coincides with a different market period, and the post-change sample accounts for 71% of the ceiling events and 58% of the floor events. Before the change, neither the ceiling close-to-close return (</w:t>
       </w:r>
       <w:r>
         <w:rPr>
@@ -11125,7 +11125,7 @@
           <w:bdr w:val="nil"/>
           <w:lang w:val="hr-HR" w:eastAsia="es-MX"/>
         </w:rPr>
-        <w:t xml:space="preserve">Because the events are unbalanced in time, Table 5 reports them by calendar quarter. The ceiling gap is positive and significant in each of the 8 quarters (</w:t>
+        <w:t xml:space="preserve">Because the events are unbalanced in time, Table 5 reports them by calendar quarter. The ceiling gap is positive and significant in each of the eight quarters (</w:t>
       </w:r>
       <w:r>
         <w:rPr>
@@ -11159,7 +11159,7 @@
           <w:bdr w:val="nil"/>
           <w:lang w:val="hr-HR" w:eastAsia="es-MX"/>
         </w:rPr>
-        <w:t xml:space="preserve">from 2.5 to 16.8); its weakest quarter, 2025-Q2, contains the platform change. The floor gap is negative in every quarter and significant at the 5% level in 7 of them. Placebo break dates on the first trading day of each month from January 2025 to April 2026 give ceiling-gap differences between −0.45 and 0.72 percentage points (|</w:t>
+        <w:t xml:space="preserve">from 2.5 to 16.8); its weakest quarter, 2025-Q2, contains the platform change. The floor gap is negative in every quarter and significant at the 5% level in seven of them. Placebo break dates on the first trading day of each month from January 2025 to April 2026 give ceiling-gap differences between −0.45 and 0.72 percentage points (|</w:t>
       </w:r>
       <w:r>
         <w:rPr>
@@ -11182,7 +11182,7 @@
           <w:bdr w:val="nil"/>
           <w:lang w:val="hr-HR" w:eastAsia="es-MX"/>
         </w:rPr>
-        <w:t xml:space="preserve">| at most 1.4); the split at 5 May 2025 gives the largest difference, 0.85 points, but it is not significant either (</w:t>
+        <w:t xml:space="preserve">| at most 1.4); the split at May 5, 2025, gives the largest difference, 0.85 points, but it is not significant either (</w:t>
       </w:r>
       <w:r>
         <w:rPr>
@@ -11216,7 +11216,7 @@
           <w:bdr w:val="nil"/>
           <w:lang w:val="hr-HR" w:eastAsia="es-MX"/>
         </w:rPr>
-        <w:t xml:space="preserve">= 1.6). The floor-gap difference is positive at the 4 placebo dates before the platform change and negative at 11 of the 11 later ones, and the split at 5 May 2025 gives −0.95 points (</w:t>
+        <w:t xml:space="preserve">= 1.6). The floor-gap difference is positive at the four placebo dates before the platform change and negative at 11 of the 11 later ones, and the split at May 5, 2025, gives −0.95 points (</w:t>
       </w:r>
       <w:r>
         <w:rPr>
@@ -11250,7 +11250,7 @@
           <w:bdr w:val="nil"/>
           <w:lang w:val="hr-HR" w:eastAsia="es-MX"/>
         </w:rPr>
-        <w:t xml:space="preserve">= −3.2), close to the differences at the placebo dates that follow it. Table 5 shows no trend in the floor gap; the pattern coincides with the weak floor gap in 2025-Q2 (−0.34%), the quarter with the most floor events (802), so the placebo dates cannot separate a break at the platform change from a shift specific to that quarter. A difference-in-differences regression that compares limit closes with 5–6.5% movers that also closed at the extreme points the same way for the ceiling (repository table C31): the excess ceiling gap was 2.91 percentage points before the change (</w:t>
+        <w:t xml:space="preserve">= −3.2), close to the differences at the placebo dates that follow it. Table 5 shows no trend in the floor gap; the pattern coincides with the weak floor gap in 2025-Q2 (−0.34%), the quarter with the most floor events (802). Therefore, the placebo dates cannot separate a break at the platform change from a shift specific to that quarter. A difference-in-differences regression that compares limit closes with 5–6.5% movers that also closed at the extreme points the same way for the ceiling (repository table C31): the excess ceiling gap was 2.91 percentage points before the change (</w:t>
       </w:r>
       <w:r>
         <w:rPr>
@@ -11386,7 +11386,7 @@
           <w:bdr w:val="nil"/>
           <w:lang w:val="hr-HR" w:eastAsia="es-MX"/>
         </w:rPr>
-        <w:t xml:space="preserve">= −1.5). The break at the limit is therefore present before the change and does not depend on the post-change period, although the significance of the raw ceiling close-to-close return and of the raw floor gap does (Table 4). Like the split in Table 4, these comparisons describe timing and do not identify an effect of the auction rules.</w:t>
+        <w:t xml:space="preserve">= −1.5). The break at the limit is therefore present before the change and does not depend on the post-change period, although the significance of the raw ceiling close-to-close return and of the raw floor gap does (Table 4). As with the split in Table 4, these comparisons describe timing and do not identify an effect of the auction rules.</w:t>
       </w:r>
     </w:p>
     <w:p>
@@ -12182,7 +12182,7 @@
           <w:bdr w:val="nil"/>
           <w:lang w:val="hr-HR" w:eastAsia="es-MX"/>
         </w:rPr>
-        <w:t xml:space="preserve">Our decomposition adds timing to the evidence of Kim and Rhee (1997): on HOSE the continuation after ceiling closes arrives at the next opening and ends after the first day, and the intraday giveback is a one-day analogue of the cross-period reversal in Lou et al. (2019). A pure attention reading must explain the contrast with stocks that moved almost as far, including those that also closed at their high, and a gap-only reading cannot explain the pre-change post-open drift after floor closes.</w:t>
+        <w:t xml:space="preserve">Our decomposition adds timing to the evidence of Kim and Rhee (1997): on the HOSE, the continuation after ceiling closes arrives at the next opening and ends after the first day, and the intraday giveback is a one-day analogue of the cross-period reversal in Lou et al. (2019). A pure attention reading must explain the contrast with stocks that moved almost as far, including those that also closed at their high, and a gap-only reading cannot explain the pre-change post-open drift after floor closes.</w:t>
       </w:r>
     </w:p>
     <w:p>
@@ -12278,7 +12278,7 @@
           <w:bdr w:val="nil"/>
           <w:lang w:val="hr-HR" w:eastAsia="es-MX"/>
         </w:rPr>
-        <w:t xml:space="preserve">. The floor results after at-the-open orders lost priority (Table 4) fit auction design shaping how the opening absorbs overnight pressure, but the market period changed at the same time; a band change on HOSE, like the ChiNext widening that Qi (2023) studies, would give a natural experiment.</w:t>
+        <w:t xml:space="preserve">. The floor results after at-the-open orders lost priority (Table 4) fit auction design shaping how the opening absorbs overnight pressure, but the market period changed at the same time; a band change on the HOSE, like the ChiNext widening that Qi (2023) studied, would give a natural experiment.</w:t>
       </w:r>
     </w:p>
     <w:p>
@@ -12340,7 +12340,7 @@
           <w:bdr w:val="nil"/>
           <w:lang w:val="hr-HR" w:eastAsia="es-MX"/>
         </w:rPr>
-        <w:t xml:space="preserve">The estimates describe what follows limit closes on HOSE in 2024 to 2026. They cannot show what the limit does to price discovery: the band does not vary, no period lacks a limit, and we measure none of the benefits a limit is meant to deliver. For investors, buying ceiling stocks at the quoted next open lost money against the market by the fifth close, excluding costs and rationing at the open.</w:t>
+        <w:t xml:space="preserve">The estimates describe what follows limit closes on the HOSE from 2024 to 2026. They cannot show what the limit does to price discovery: the band does not vary, no period lacks a limit, and we measure none of the benefits a limit is meant to deliver. For investors, buying ceiling stocks at the quoted next open lost money against the market by the fifth close, excluding costs and rationing at the open.</w:t>
       </w:r>
     </w:p>
     <w:p>
@@ -12439,7 +12439,7 @@
           <w:bdr w:val="nil"/>
           <w:lang w:val="hr-HR" w:eastAsia="es-MX"/>
         </w:rPr>
-        <w:t xml:space="preserve">The sample covers 519 trading days on one exchange, with one platform change and a period of market stress. (ii) Without order-book, investor-type, announcement, or news data, we infer the unfilled-demand mechanism and cannot separate it from selection on news. (iii) The 7% band, reference price, and platform change come from brokerage and press descriptions, checked against returns but not against exchange circulars; tick sizes, reference prices on corporate-action days, and wider bands for first-day listings and resumed trading are assumptions. (iv) The vendor appears to adjust earlier prices for later corporate actions. For stocks priced at 10 thousand dong or more, 25%, 31%, and 58% of 2024, 2025, and 2026 closes are tick multiples, against 100% below 10 thousand dong (an uninformative check, since the 0.01 tick equals the two-decimal resolution of the files), and near hits make up 62% of ceiling events for the higher-priced stocks against 23% for the others. Proportional adjustment leaves returns (except on ex-dates), the close-at-high rule, and locked days unchanged but makes the exact-hit classification of Equation (3) unreliable, so we treat that split as a data check, not a measure of distance to the limit. The listing snapshot excludes stocks delisted before the download. (v) Events in one market episode may depend on each other beyond our clustering, and we computed no calendar-time portfolio estimates or standard errors robust to both cross-sectional and serial dependence. (vi) Several characteristics (5-day return, MAX, MIN, move frequency, overnight return) share inputs with the event definition, and the Corwin–Schultz spread and range volatility use limit-censored highs and lows. (vii) The floor effect depends on the benchmark, and we built no beta- and size-matched control for the five-day outcome. (viii) The characteristic tests have limited power, and effect sizes may carry winner’s-curse bias from choosing this question among several screened on the same data.</w:t>
+        <w:t xml:space="preserve">The sample covers 519 trading days on one exchange, with one platform change and a period of market stress. (ii) Without order-book, investor-type, announcement, or news data, we infer the unfilled-demand mechanism and cannot separate it from selection on news. (iii) The 7% band, reference price, and platform change come from brokerage and press descriptions, checked against returns but not against exchange circulars; tick sizes, reference prices on corporate-action days, and wider bands for first-day listings and resumed trading are assumptions. (iv) The vendor appears to adjust earlier prices for later corporate actions. For stocks priced at 10 thousand dong or more, 25%, 31%, and 58% of 2024, 2025, and 2026 closes are tick multiples, against 100% below 10 thousand dong (an uninformative check, since the 0.01 tick equals the two-decimal resolution of the files), and near hits make up 62% of ceiling events for the higher-priced stocks against 23% for the others. Proportional adjustment leaves returns (except on ex-dates), the close-at-high rule, and locked days unchanged but makes the exact-hit classification of Equation (3) unreliable, so we treat that split as a data check, not a measure of distance to the limit. The listing snapshot excludes stocks delisted before the download. (v) Events in one market episode may depend on each other beyond our clustering, and we computed no calendar-time portfolio estimates or standard errors robust to both cross-sectional and serial dependence. (vi) Several characteristics (5-day return, largest and smallest daily returns, move frequency, and overnight return) share inputs with the event definition, and the Corwin–Schultz spread and range volatility use limit-censored highs and lows. (vii) The floor effect depends on the benchmark, and we built no beta- and size-matched control for the five-day outcome. (viii) The characteristic tests have limited power, and effect sizes may carry winner’s-curse bias from choosing this question among several screened on the same data.</w:t>
       </w:r>
     </w:p>
     <w:p>
@@ -13097,7 +13097,7 @@
           <w:bdr w:val="nil"/>
           <w:lang w:val="hr-HR" w:eastAsia="es-MX"/>
         </w:rPr>
-        <w:t xml:space="preserve">The price files (vnstock 4.0.4, source VCI, retrieved on 24 September 2026), the R code, and the output tables are available at</w:t>
+        <w:t xml:space="preserve">The price files (vnstock 4.0.4, source VCI, retrieved on September 24, 2026), the R code, and the output tables are available at</w:t>
       </w:r>
       <w:r>
         <w:rPr>
@@ -19255,7 +19255,7 @@
           <w:bdr w:val="nil"/>
           <w:lang w:val="hr-HR" w:eastAsia="es-MX"/>
         </w:rPr>
-        <w:t xml:space="preserve">&lt;U+2212&gt; 1) and a</w:t>
+        <w:t xml:space="preserve">− 1) and a</w:t>
       </w:r>
       <w:r>
         <w:rPr>
@@ -19345,7 +19345,7 @@
           <w:bdr w:val="nil"/>
           <w:lang w:val="hr-HR" w:eastAsia="es-MX"/>
         </w:rPr>
-        <w:t xml:space="preserve">&lt;U+2212&gt; 1 degrees of freedom;</w:t>
+        <w:t xml:space="preserve">− 1 degrees of freedom;</w:t>
       </w:r>
       <w:r>
         <w:rPr>
@@ -22063,7 +22063,7 @@
           <w:bdr w:val="nil"/>
           <w:lang w:val="hr-HR" w:eastAsia="es-MX"/>
         </w:rPr>
-        <w:t xml:space="preserve">) or same-date controls in the same liquidity tercile. Crash days have a market return below &lt;U+2212&gt;2%. Components compound, so they need not sum.</w:t>
+        <w:t xml:space="preserve">) or same-date controls in the same liquidity tercile. Crash days have a market return below −2%. Components compound, so they need not sum.</w:t>
       </w:r>
     </w:p>
     <w:p>
@@ -23448,7 +23448,7 @@
           <w:bdr w:val="nil"/>
           <w:lang w:val="hr-HR" w:eastAsia="es-MX"/>
         </w:rPr>
-        <w:t xml:space="preserve">Differences in percentage points from same-direction moves of 3&lt;U+2013&gt;5% or 5&lt;U+2013&gt;6.5% that did not close at the limit; market-adjusted returns; date-clustered</w:t>
+        <w:t xml:space="preserve">Differences in percentage points from same-direction moves of 3–5% or 5–6.5% that did not close at the limit; market-adjusted returns; date-clustered</w:t>
       </w:r>
       <w:r>
         <w:rPr>
@@ -23547,7 +23547,7 @@
           <w:bdr w:val="nil"/>
           <w:lang w:val="hr-HR" w:eastAsia="es-MX"/>
         </w:rPr>
-        <w:t xml:space="preserve"> Returns before and after the KRX platform change of 5 May 2025</w:t>
+        <w:t xml:space="preserve"> Returns before and after the KRX platform change of May 5, 2025</w:t>
       </w:r>
     </w:p>
     <w:tbl>

</xml_diff>

<commit_message>
Paper C MSJ round 5b: full-text results of Kim & Rhee (1997), Huang et al. (2001), Qi (2023) in Table 6 and text; integrity fixes F1-F4 (Le 2012, p-value convention wording, last abstract-only phrase, S1)
Co-Authored-By: Claude Opus 5.5 <noreply@anthropic.com>
Claude-Session: https://claude.ai/code/session_011zPDaCYE4jmmpoRvPu4SUX
</commit_message>
<xml_diff>
--- a/paper2/final/MSJ/Manuscript_MSJ.docx
+++ b/paper2/final/MSJ/Manuscript_MSJ.docx
@@ -844,7 +844,7 @@
                 <wp:positionV relativeFrom="paragraph">
                   <wp:posOffset>45085</wp:posOffset>
                 </wp:positionV>
-                <wp:extent cx="6477000" cy="3327400"/>
+                <wp:extent cx="6477000" cy="3352800"/>
                 <wp:effectExtent l="0" t="0" r="12700" b="12700"/>
                 <wp:wrapTopAndBottom/>
                 <wp:docPr id="23" name="Caixa de texto 23"/>
@@ -856,7 +856,7 @@
                       <wps:spPr>
                         <a:xfrm>
                           <a:off x="0" y="0"/>
-                          <a:ext cx="6477000" cy="3327400"/>
+                          <a:ext cx="6477000" cy="3352800"/>
                         </a:xfrm>
                         <a:prstGeom prst="rect">
                           <a:avLst/>
@@ -922,7 +922,7 @@
                                 <w:szCs w:val="20"/>
                                 <w:lang w:val="en-US"/>
                               </w:rPr>
-                              <w:t xml:space="preserve"> Daily price limits are meant to cool markets, but they may also delay price discovery. We examine what happens after a stock closes at its daily limit on the Ho Chi Minh Stock Exchange, a market dominated by individual investors that applies one 7% band and sets opening and closing prices by call auction. Using daily prices for 347 stocks from August 2024 to September 2026, we split the next-day abnormal return after limit closes into an overnight gap and an intraday return. We compare limit closes with stocks that rose or fell almost as far, and we test the limit effect together with a broad set of price- and volume-based characteristics under false discovery rate control. The limit tests survive this control, whereas none of the characteristics does. After a ceiling close, the stock opens on average 2.2% above the market, and the following session gives back about 24% of this gap. The gap is 2.7 percentage points larger than after rises that stop short of the limit, and the difference remains when those stocks also closed at their daily high. An investor who buys at the next opening cannot capture the effect and loses 0.7% against the market by the fifth close. Floor closes are followed by a negative gap whose size depends on the benchmark. The ceiling gap appears in every calendar quarter and before the exchange changed its trading platform in 2025. The pattern is consistent with delayed price discovery, but news, investor attention, and auction overshooting may also contribute, and data on news and order books are needed to separate them. For market design, the results suggest that the opening auction absorbs much of the price adjustment that the 7% band postpones.</w:t>
+                              <w:t xml:space="preserve"> Daily price limits are meant to cool markets, but they may also delay price discovery. We examine what happens after a stock closes at its daily limit on the Ho Chi Minh Stock Exchange, a market dominated by individual investors that applies one 7% band and sets opening and closing prices by call auction. Using daily prices for 347 stocks from August 2024 to September 2026, we split the next-day abnormal return after limit closes into an overnight gap and an intraday return. We compare limit closes with stocks that rose or fell almost as far, and we test the limit effect together with a broad set of price- and volume-based characteristics under false discovery rate control. The limit tests survive this control, whereas none of the lower-powered characteristic tests does. After a ceiling close, the stock opens on average 2.2% above the market, and the following session gives back about 24% of this gap. The gap is 2.7 percentage points larger than after rises that stop short of the limit, and the difference remains when those stocks also closed at their daily high. An investor who buys at the next opening cannot capture the effect and loses 0.7% against the market by the fifth close. Floor closes are followed by a negative gap whose size depends on the benchmark. The ceiling gap appears in every calendar quarter and before the exchange changed its trading platform in 2025. The pattern is consistent with delayed price discovery, but news, investor attention, and auction overshooting may also contribute, and data on news and order books are needed to separate them. For market design, the results suggest that the opening auction absorbs much of the price adjustment that the 7% band postpones.</w:t>
                             </w:r>
                           </w:p>
                           <w:p>
@@ -1010,7 +1010,7 @@
                 <v:stroke joinstyle="miter"/>
                 <v:path gradientshapeok="t" o:connecttype="rect"/>
               </v:shapetype>
-              <v:shape id="Caixa de texto 23" o:spid="_x0000_s1026" type="#_x0000_t202" style="position:absolute;margin-left:0;margin-top:3.55pt;width:510pt;height:262pt;z-index:251658240;visibility:visible;mso-wrap-style:square;mso-width-percent:0;mso-height-percent:0;mso-wrap-distance-left:9pt;mso-wrap-distance-top:0;mso-wrap-distance-right:9pt;mso-wrap-distance-bottom:0;mso-position-horizontal:left;mso-position-horizontal-relative:margin;mso-position-vertical:absolute;mso-position-vertical-relative:text;mso-width-percent:0;mso-height-percent:0;mso-width-relative:margin;mso-height-relative:margin;v-text-anchor:top" o:gfxdata="UEsDBBQABgAIAAAAIQC2gziS/gAAAOEBAAATAAAAW0NvbnRlbnRfVHlwZXNdLnhtbJSRQU7DMBBF 90jcwfIWJU67QAgl6YK0S0CoHGBkTxKLZGx5TGhvj5O2G0SRWNoz/78nu9wcxkFMGNg6quQqL6RA 0s5Y6ir5vt9lD1JwBDIwOMJKHpHlpr69KfdHjyxSmriSfYz+USnWPY7AufNIadK6MEJMx9ApD/oD OlTrorhX2lFEilmcO2RdNtjC5xDF9pCuTyYBB5bi6bQ4syoJ3g9WQ0ymaiLzg5KdCXlKLjvcW893 SUOqXwnz5DrgnHtJTxOsQfEKIT7DmDSUCaxw7Rqn8787ZsmRM9e2VmPeBN4uqYvTtW7jvijg9N/y JsXecLq0q+WD6m8AAAD//wMAUEsDBBQABgAIAAAAIQA4/SH/1gAAAJQBAAALAAAAX3JlbHMvLnJl bHOkkMFqwzAMhu+DvYPRfXGawxijTi+j0GvpHsDYimMaW0Yy2fr2M4PBMnrbUb/Q94l/f/hMi1qR JVI2sOt6UJgd+ZiDgffL8ekFlFSbvV0oo4EbChzGx4f9GRdb25HMsYhqlCwG5lrLq9biZkxWOiqY 22YiTra2kYMu1l1tQD30/bPm3wwYN0x18gb45AdQl1tp5j/sFB2T0FQ7R0nTNEV3j6o9feQzro1i OWA14Fm+Q8a1a8+Bvu/d/dMb2JY5uiPbhG/ktn4cqGU/er3pcvwCAAD//wMAUEsDBBQABgAIAAAA IQDIsxWdmwIAAM4FAAAOAAAAZHJzL2Uyb0RvYy54bWysVFtv0zAUfkfiP1h+Z0kvuxAtncrGENLY Jja0Z9exWwvHx9huk/LrOXaSthvwMMRLcnzu5zuX84u21mQjnFdgSjo6yikRhkOlzLKk3x6v351R 4gMzFdNgREm3wtOL2ds3540txBhWoCvhCDoxvmhsSVch2CLLPF+JmvkjsMKgUIKrWcCnW2aVYw16 r3U2zvOTrAFXWQdceI/cq05IZ8m/lIKHOym9CESXFHML6evSdxG/2eycFUvH7ErxPg32D1nUTBkM unN1xQIja6d+c1Ur7sCDDEcc6gykVFykGrCaUf6imocVsyLVguB4u4PJ/z+3/HbzYO8dCe0HaLGB EZDG+sIjM9bTSlfHP2ZKUI4QbnewiTYQjsyT6elpnqOIo2w8mkxO8IF+sr25dT58ElCTSJTUYV8S XGxz40OnOqjEaB60qq6V1ukRZ0Fcakc2DLvIOBcmjJO5XtdfoOr4OA1dWFYgG7vesc8GNmaTpip6 Srk9C6INabCSyXGeHD+Tebdc7MKfTUbH+ce+vAM1dK9NTFekqevL2kOZqLDVIupo81VIoqqE6F9r TM1IflE7aklE5DWGvf4+q9cYd3UMkcGEnXGtDLgOpuetqb4PKctOH3E+qDuSoV20/YgtoNri5Dno ltJbfq1wOm6YD/fM4RbiROFlCXf4kRqwPdBTlKzA/fwTP+rjcqCUkga3uqT+x5o5QYn+bHBt3o+m 03gG0mN6fDrGhzuULA4lZl1fAo7cCG+Y5YmM+kEPpHRQP+EBmseoKGKGY+yShoG8DN2twQPGxXye lHDxLQs35sHy6Dp2J87+Y/vEnO0XJOBu3cKw/6x4sSedbrQ0MF8HkCotUQS4Q7UHHo9GGvX+wMWr dPhOWvszPPsFAAD//wMAUEsDBBQABgAIAAAAIQDWYp9Z3wAAAAwBAAAPAAAAZHJzL2Rvd25yZXYu eG1sTI/bSsNAEIbvBd9hGcE7u0lbbEkzKVHxShCtPsA2OznY7GzIbtv49p1e6c3A8PMfvnw7uV6d aAydZ4R0loAirrztuEH4/np9WIMK0bA1vWdC+KUA2+L2JjeZ9Wf+pNMuNkpCOGQGoY1xyLQOVUvO hJkfiEWr/ehMlHdstB3NWcJdr+dJ8qid6VgaWjPQc0vVYXd0CD+trXV4eivL6n2ecr368OtDiXh/ N71s5JQbUJGm+OeAK4Psh0KG7f2RbVA9gtBEhFUK6iom0ghqj7BYLlLQRa7/QxQXAAAA//8DAFBL AQItABQABgAIAAAAIQC2gziS/gAAAOEBAAATAAAAAAAAAAAAAAAAAAAAAABbQ29udGVudF9UeXBl c10ueG1sUEsBAi0AFAAGAAgAAAAhADj9If/WAAAAlAEAAAsAAAAAAAAAAAAAAAAALwEAAF9yZWxz Ly5yZWxzUEsBAi0AFAAGAAgAAAAhAMizFZ2bAgAAzgUAAA4AAAAAAAAAAAAAAAAALgIAAGRycy9l Mm9Eb2MueG1sUEsBAi0AFAAGAAgAAAAhANZin1nfAAAADAEAAA8AAAAAAAAAAAAAAAAA9QQAAGRy cy9kb3ducmV2LnhtbFBLBQYAAAAABAAEAPMAAAABBgAAAAA= " fillcolor="#f2dbdb [661]" strokecolor="#83150e" strokeweight=".5pt">
+              <v:shape id="Caixa de texto 23" o:spid="_x0000_s1026" type="#_x0000_t202" style="position:absolute;margin-left:0;margin-top:3.55pt;width:510pt;height:264pt;z-index:251658240;visibility:visible;mso-wrap-style:square;mso-width-percent:0;mso-height-percent:0;mso-wrap-distance-left:9pt;mso-wrap-distance-top:0;mso-wrap-distance-right:9pt;mso-wrap-distance-bottom:0;mso-position-horizontal:left;mso-position-horizontal-relative:margin;mso-position-vertical:absolute;mso-position-vertical-relative:text;mso-width-percent:0;mso-height-percent:0;mso-width-relative:margin;mso-height-relative:margin;v-text-anchor:top" o:gfxdata="UEsDBBQABgAIAAAAIQC2gziS/gAAAOEBAAATAAAAW0NvbnRlbnRfVHlwZXNdLnhtbJSRQU7DMBBF 90jcwfIWJU67QAgl6YK0S0CoHGBkTxKLZGx5TGhvj5O2G0SRWNoz/78nu9wcxkFMGNg6quQqL6RA 0s5Y6ir5vt9lD1JwBDIwOMJKHpHlpr69KfdHjyxSmriSfYz+USnWPY7AufNIadK6MEJMx9ApD/oD OlTrorhX2lFEilmcO2RdNtjC5xDF9pCuTyYBB5bi6bQ4syoJ3g9WQ0ymaiLzg5KdCXlKLjvcW893 SUOqXwnz5DrgnHtJTxOsQfEKIT7DmDSUCaxw7Rqn8787ZsmRM9e2VmPeBN4uqYvTtW7jvijg9N/y JsXecLq0q+WD6m8AAAD//wMAUEsDBBQABgAIAAAAIQA4/SH/1gAAAJQBAAALAAAAX3JlbHMvLnJl bHOkkMFqwzAMhu+DvYPRfXGawxijTi+j0GvpHsDYimMaW0Yy2fr2M4PBMnrbUb/Q94l/f/hMi1qR JVI2sOt6UJgd+ZiDgffL8ekFlFSbvV0oo4EbChzGx4f9GRdb25HMsYhqlCwG5lrLq9biZkxWOiqY 22YiTra2kYMu1l1tQD30/bPm3wwYN0x18gb45AdQl1tp5j/sFB2T0FQ7R0nTNEV3j6o9feQzro1i OWA14Fm+Q8a1a8+Bvu/d/dMb2JY5uiPbhG/ktn4cqGU/er3pcvwCAAD//wMAUEsDBBQABgAIAAAA IQDIsxWdmwIAAM4FAAAOAAAAZHJzL2Uyb0RvYy54bWysVFtv0zAUfkfiP1h+Z0kvuxAtncrGENLY Jja0Z9exWwvHx9huk/LrOXaSthvwMMRLcnzu5zuX84u21mQjnFdgSjo6yikRhkOlzLKk3x6v351R 4gMzFdNgREm3wtOL2ds3540txBhWoCvhCDoxvmhsSVch2CLLPF+JmvkjsMKgUIKrWcCnW2aVYw16 r3U2zvOTrAFXWQdceI/cq05IZ8m/lIKHOym9CESXFHML6evSdxG/2eycFUvH7ErxPg32D1nUTBkM unN1xQIja6d+c1Ur7sCDDEcc6gykVFykGrCaUf6imocVsyLVguB4u4PJ/z+3/HbzYO8dCe0HaLGB EZDG+sIjM9bTSlfHP2ZKUI4QbnewiTYQjsyT6elpnqOIo2w8mkxO8IF+sr25dT58ElCTSJTUYV8S XGxz40OnOqjEaB60qq6V1ukRZ0Fcakc2DLvIOBcmjJO5XtdfoOr4OA1dWFYgG7vesc8GNmaTpip6 Srk9C6INabCSyXGeHD+Tebdc7MKfTUbH+ce+vAM1dK9NTFekqevL2kOZqLDVIupo81VIoqqE6F9r TM1IflE7aklE5DWGvf4+q9cYd3UMkcGEnXGtDLgOpuetqb4PKctOH3E+qDuSoV20/YgtoNri5Dno ltJbfq1wOm6YD/fM4RbiROFlCXf4kRqwPdBTlKzA/fwTP+rjcqCUkga3uqT+x5o5QYn+bHBt3o+m 03gG0mN6fDrGhzuULA4lZl1fAo7cCG+Y5YmM+kEPpHRQP+EBmseoKGKGY+yShoG8DN2twQPGxXye lHDxLQs35sHy6Dp2J87+Y/vEnO0XJOBu3cKw/6x4sSedbrQ0MF8HkCotUQS4Q7UHHo9GGvX+wMWr dPhOWvszPPsFAAD//wMAUEsDBBQABgAIAAAAIQDWYp9Z3wAAAAwBAAAPAAAAZHJzL2Rvd25yZXYu eG1sTI/bSsNAEIbvBd9hGcE7u0lbbEkzKVHxShCtPsA2OznY7GzIbtv49p1e6c3A8PMfvnw7uV6d aAydZ4R0loAirrztuEH4/np9WIMK0bA1vWdC+KUA2+L2JjeZ9Wf+pNMuNkpCOGQGoY1xyLQOVUvO hJkfiEWr/ehMlHdstB3NWcJdr+dJ8qid6VgaWjPQc0vVYXd0CD+trXV4eivL6n2ecr368OtDiXh/ N71s5JQbUJGm+OeAK4Psh0KG7f2RbVA9gtBEhFUK6iom0ghqj7BYLlLQRa7/QxQXAAAA//8DAFBL AQItABQABgAIAAAAIQC2gziS/gAAAOEBAAATAAAAAAAAAAAAAAAAAAAAAABbQ29udGVudF9UeXBl c10ueG1sUEsBAi0AFAAGAAgAAAAhADj9If/WAAAAlAEAAAsAAAAAAAAAAAAAAAAALwEAAF9yZWxz Ly5yZWxzUEsBAi0AFAAGAAgAAAAhAMizFZ2bAgAAzgUAAA4AAAAAAAAAAAAAAAAALgIAAGRycy9l Mm9Eb2MueG1sUEsBAi0AFAAGAAgAAAAhANZin1nfAAAADAEAAA8AAAAAAAAAAAAAAAAA9QQAAGRy cy9kb3ducmV2LnhtbFBLBQYAAAAABAAEAPMAAAABBgAAAAA= " fillcolor="#f2dbdb [661]" strokecolor="#83150e" strokeweight=".5pt">
                 <v:textbox>
                   <w:txbxContent>
                     <w:p>
@@ -1045,7 +1045,7 @@
                           <w:szCs w:val="20"/>
                           <w:lang w:val="en-US"/>
                         </w:rPr>
-                        <w:t xml:space="preserve"> Daily price limits are meant to cool markets, but they may also delay price discovery. We examine what happens after a stock closes at its daily limit on the Ho Chi Minh Stock Exchange, a market dominated by individual investors that applies one 7% band and sets opening and closing prices by call auction. Using daily prices for 347 stocks from August 2024 to September 2026, we split the next-day abnormal return after limit closes into an overnight gap and an intraday return. We compare limit closes with stocks that rose or fell almost as far, and we test the limit effect together with a broad set of price- and volume-based characteristics under false discovery rate control. The limit tests survive this control, whereas none of the characteristics does. After a ceiling close, the stock opens on average 2.2% above the market, and the following session gives back about 24% of this gap. The gap is 2.7 percentage points larger than after rises that stop short of the limit, and the difference remains when those stocks also closed at their daily high. An investor who buys at the next opening cannot capture the effect and loses 0.7% against the market by the fifth close. Floor closes are followed by a negative gap whose size depends on the benchmark. The ceiling gap appears in every calendar quarter and before the exchange changed its trading platform in 2025. The pattern is consistent with delayed price discovery, but news, investor attention, and auction overshooting may also contribute, and data on news and order books are needed to separate them. For market design, the results suggest that the opening auction absorbs much of the price adjustment that the 7% band postpones.</w:t>
+                        <w:t xml:space="preserve"> Daily price limits are meant to cool markets, but they may also delay price discovery. We examine what happens after a stock closes at its daily limit on the Ho Chi Minh Stock Exchange, a market dominated by individual investors that applies one 7% band and sets opening and closing prices by call auction. Using daily prices for 347 stocks from August 2024 to September 2026, we split the next-day abnormal return after limit closes into an overnight gap and an intraday return. We compare limit closes with stocks that rose or fell almost as far, and we test the limit effect together with a broad set of price- and volume-based characteristics under false discovery rate control. The limit tests survive this control, whereas none of the lower-powered characteristic tests does. After a ceiling close, the stock opens on average 2.2% above the market, and the following session gives back about 24% of this gap. The gap is 2.7 percentage points larger than after rises that stop short of the limit, and the difference remains when those stocks also closed at their daily high. An investor who buys at the next opening cannot capture the effect and loses 0.7% against the market by the fifth close. Floor closes are followed by a negative gap whose size depends on the benchmark. The ceiling gap appears in every calendar quarter and before the exchange changed its trading platform in 2025. The pattern is consistent with delayed price discovery, but news, investor attention, and auction overshooting may also contribute, and data on news and order books are needed to separate them. For market design, the results suggest that the opening auction absorbs much of the price adjustment that the 7% band postpones.</w:t>
                       </w:r>
                     </w:p>
                     <w:p>
@@ -1241,7 +1241,7 @@
           <w:bdr w:val="nil"/>
           <w:lang w:val="hr-HR" w:eastAsia="es-MX"/>
         </w:rPr>
-        <w:t xml:space="preserve">Studies on band changes have documented effects on volatility, liquidity, and crash risk (Jia et al., 2024; Lien et al., 2019; Qi, 2023), and account-level data have shown that large investors buy on the limit day and sell on the next (Chen et al., 2019). For Vietnam, Le (2018) evaluated how narrower bands after 2008 affected stock price risk, and Farber et al. (2006) documented clusters and sequences of limit hits in the early years of the market. Huang et al. (2001) reported for Taiwan that the overnight overreaction after limit hits reverses on the following day. Less is known about three questions. How large are the overnight gap and the intraday reversal after a limit close relative to a benchmark? Does the limit effect remain once the many other price-based signals that a researcher could test are taken into account? How does the pattern behave around the 2025 move of the HOSE to a new trading platform?</w:t>
+        <w:t xml:space="preserve">Studies on band changes have documented effects on volatility, liquidity, and crash risk (Jia et al., 2024; Lien et al., 2019; Qi, 2023), and account-level data have shown that large investors buy on the limit day and sell on the next (Chen et al., 2019). For Vietnam, Le (2012) evaluated how narrower bands after 2008 affected stock price risk, and Farber et al. (2006) documented clusters and sequences of limit hits in the early years of the market. In Taiwan, which also had a 7% band, Huang et al. (2001) found that one-day up-limit closes gained 1.18% overnight and gave back 0.77% in the next session. Less is known about three questions. How large are the overnight gap and the intraday reversal after a limit close relative to a benchmark? Does the limit effect remain once the many other price-based signals that a researcher could test are taken into account? How does the pattern behave around the 2025 move of the HOSE to a new trading platform?</w:t>
       </w:r>
     </w:p>
     <w:p>
@@ -1533,7 +1533,7 @@
           <w:bdr w:val="nil"/>
           <w:lang w:val="hr-HR" w:eastAsia="es-MX"/>
         </w:rPr>
-        <w:t xml:space="preserve">After ChiNext widened its band from 10% to 20% in August 2020, Qi (2023) confirmed delayed price discovery, volatility spillover, and trading interference, stronger at the lower limit and with no magnet effect. Zhang et al. (2022) found higher liquidity, volatility, and probability of informed trading, and Jia et al. (2024) found lower crash risk. Wider bands raised spreads and intraday volatility but improved execution quality in Taiwan (Lien et al., 2019) and raised intraday realized variance in Korea (Kim &amp; Jun, 2019). In Shenzhen account data, large investors buy on the day a stock hits the 10% upper limit and sell the next day, and their limit-day net buying predicts a stronger long-run reversal (Chen et al., 2019). Stocks with large limit exposures attract attention and earn lower future returns, especially where retail investors hold many shares (Lin et al., 2023), and stocks with frequent upper-limit hits also earn lower future returns (Zeng et al., 2024). Liang and Hu (2025) forecast limit hits; the record we could access reports no returns after the hit.</w:t>
+        <w:t xml:space="preserve">After ChiNext widened its band from 10% to 20% in August 2020, Qi (2023) confirmed delayed price discovery, volatility spillover, and trading interference, stronger at the lower limit and with no magnet effect. Zhang et al. (2022) found higher liquidity, volatility, and probability of informed trading, and Jia et al. (2024) found lower crash risk. Wider bands raised spreads and intraday volatility but improved execution quality in Taiwan (Lien et al., 2019) and raised intraday realized variance in Korea (Kim &amp; Jun, 2019). In Shenzhen account data, large investors buy on the day a stock hits the 10% upper limit and sell the next day, and their limit-day net buying predicts a stronger long-run reversal (Chen et al., 2019). Stocks with large limit exposures attract attention and earn lower future returns, especially where retail investors hold many shares (Lin et al., 2023), and stocks with frequent upper-limit hits also earn lower future returns (Zeng et al., 2024). Liang and Hu (2025) forecast limit hits.</w:t>
       </w:r>
     </w:p>
     <w:p>
@@ -7463,7 +7463,7 @@
           <w:bdr w:val="nil"/>
           <w:lang w:val="hr-HR" w:eastAsia="es-MX"/>
         </w:rPr>
-        <w:t xml:space="preserve">-values follow the analysis plan, which fixed the normal reference before any result was computed, so changing them after seeing the results would weaken the multiplicity control. Table 1 adds the small-sample factor and the</w:t>
+        <w:t xml:space="preserve">-values keep the convention of the first computation of the planned tests; the analysis plan specified date-clustered standard errors but not the reference distribution, and we did not change the convention after seeing the results, so that the multiplicity control is not tuned to them. Table 1 adds the small-sample factor and the</w:t>
       </w:r>
       <w:r>
         <w:rPr>
@@ -7508,7 +7508,7 @@
           <w:bdr w:val="nil"/>
           <w:lang w:val="hr-HR" w:eastAsia="es-MX"/>
         </w:rPr>
-        <w:t xml:space="preserve">reference as a more conservative check. Under these settings, the four event tests still survive a Bonferroni correction in families of up to 683 tests (Section 3), so the choice does not change any conclusion. Two-way clustering by date and stock follows Cameron et al. (2011), without the factor and with the variance bounded below at 10</w:t>
+        <w:t xml:space="preserve">reference as a more conservative check. Under these settings, the four event tests still survive a Bonferroni correction in families of up to 683 tests with date clusters and 125 with calendar-week clusters (Section 3), so the choice does not change any conclusion. Two-way clustering by date and stock follows Cameron et al. (2011), without the factor and with the variance bounded below at 10</w:t>
       </w:r>
       <w:r>
         <w:rPr>
@@ -9789,7 +9789,7 @@
           <w:bdr w:val="nil"/>
           <w:lang w:val="hr-HR" w:eastAsia="es-MX"/>
         </w:rPr>
-        <w:t xml:space="preserve">We use R 4.3.3 (packages sandwich 3.1.0, lmtest 0.9.40, and ggplot2 3.4.4). One script reproduces every number, table, and figure; the code, data, and output tables are public (Section 6.5).</w:t>
+        <w:t xml:space="preserve">One R 4.3.3 script (packages sandwich, lmtest, and ggplot2) reproduces every number, table, and figure; code, data, and output tables are public (Section 6.5).</w:t>
       </w:r>
     </w:p>
     <w:p>
@@ -9886,7 +9886,7 @@
           <w:bdr w:val="nil"/>
           <w:lang w:val="hr-HR" w:eastAsia="es-MX"/>
         </w:rPr>
-        <w:t xml:space="preserve">The event sample contains 3,187 ceiling events on 446 dates and 2,105 floor events on 319 dates. Limit closes cluster in market episodes, so our standard errors allow dependence across dates, weeks, 10-day blocks, and stocks.</w:t>
+        <w:t xml:space="preserve">The event sample contains 3,187 ceiling events on 446 dates and 2,105 floor events on 319 dates.</w:t>
       </w:r>
     </w:p>
     <w:p>
@@ -11043,7 +11043,7 @@
           <w:bdr w:val="nil"/>
           <w:lang w:val="hr-HR" w:eastAsia="es-MX"/>
         </w:rPr>
-        <w:t xml:space="preserve">The ceiling gap is robust across subsamples. It appears in both halves of the sample and on days locked at one price from open to close. It also appears in each tercile of the 60-day average dollar volume; in the most liquid tercile it is 1.52%. Against same-date controls, the ceiling gap is 2.70%.</w:t>
+        <w:t xml:space="preserve">The ceiling gap appears in both halves of the sample and on days locked at one price from open to close. It also appears in each tercile of the 60-day average dollar volume; in the most liquid tercile it is 1.52%. Against same-date controls, the ceiling gap is 2.70%.</w:t>
       </w:r>
     </w:p>
     <w:p>
@@ -11517,7 +11517,7 @@
           <w:bdr w:val="nil"/>
           <w:lang w:val="hr-HR" w:eastAsia="es-MX"/>
         </w:rPr>
-        <w:t xml:space="preserve">. The contrast is smaller against 3% to 5% moves: 2.40 percentage points for ceilings and 1.14 points for floors. The comparison is an association around a rule-based threshold, and we make no regression-discontinuity claim. The design has no bandwidth choice, manipulation test, or covariate-balance check, and stocks that reach the limit may differ in news content.</w:t>
+        <w:t xml:space="preserve">. The comparison is an association around a rule-based threshold, not a regression-discontinuity design, and stocks that reach the limit may differ in news content.</w:t>
       </w:r>
     </w:p>
     <w:p>
@@ -12078,7 +12078,7 @@
           <w:bdr w:val="nil"/>
           <w:lang w:val="hr-HR" w:eastAsia="es-MX"/>
         </w:rPr>
-        <w:t xml:space="preserve">from 2.5 to 16.8). Its weakest quarter, 2025-Q2, contains the platform change. The floor gap is negative in every quarter and significant at the 5% level in seven of them.</w:t>
+        <w:t xml:space="preserve">from 2.5 to 16.8). The floor gap is negative in every quarter and significant at the 5% level in seven of them.</w:t>
       </w:r>
     </w:p>
     <w:p>
@@ -12367,7 +12367,7 @@
           <w:bdr w:val="nil"/>
           <w:lang w:val="hr-HR" w:eastAsia="es-MX"/>
         </w:rPr>
-        <w:t xml:space="preserve">= −1.5). The break at the limit is therefore present before the change and does not depend on the post-change period, although the significance of the raw ceiling close-to-close return and of the raw floor gap does (Table 4). As with the split in Table 4, these comparisons describe timing and do not identify an effect of the auction rules.</w:t>
+        <w:t xml:space="preserve">= −1.5). The break at the limit is therefore present before the change and does not depend on the post-change period, although the significance of the raw ceiling close-to-close return and of the raw floor gap does (Table 4). These comparisons describe timing, not an effect of the auction rules.</w:t>
       </w:r>
     </w:p>
     <w:p>
@@ -13201,7 +13201,7 @@
           <w:bdr w:val="nil"/>
           <w:lang w:val="hr-HR" w:eastAsia="es-MX"/>
         </w:rPr>
-        <w:t xml:space="preserve">Our decomposition adds timing to the evidence of Kim and Rhee (1997): on the HOSE, the continuation after ceiling closes arrives at the next opening and ends after the first day, and the intraday giveback is a one-day analogue of the cross-period reversal in Lou et al. (2019). A pure attention reading must explain the contrast with stocks that moved almost as far, including those that also closed at their high, and a gap-only reading cannot explain the pre-change post-open drift after floor closes.</w:t>
+        <w:t xml:space="preserve">Our ceiling gap is larger than the 1.18% that Huang et al. (2001) reported for Taiwan, and the following session reverses a smaller share of it (about 24% against about two thirds). Our decomposition also adds timing to the evidence of Kim and Rhee (1997): on the HOSE, the continuation after ceiling closes arrives at the next opening and ends after the first day, and the intraday giveback is a one-day analogue of the cross-period reversal in Lou et al. (2019). A pure attention reading must explain the contrast with stocks that moved almost as far, including those that also closed at their high, and a gap-only reading cannot explain the pre-change post-open drift after floor closes.</w:t>
       </w:r>
     </w:p>
     <w:p>
@@ -16353,6 +16353,26 @@
         </w:rPr>
         <w:t xml:space="preserve">(3), 263–288.</w:t>
       </w:r>
+      <w:r>
+        <w:rPr>
+          <w:rFonts w:asciiTheme="minorHAnsi" w:hAnsiTheme="minorHAnsi" w:cstheme="minorHAnsi"/>
+          <w:noProof/>
+          <w:sz w:val="20"/>
+          <w:szCs w:val="20"/>
+          <w:lang w:val="hr-HR"/>
+        </w:rPr>
+        <w:t xml:space="preserve"> </w:t>
+      </w:r>
+      <w:r>
+        <w:rPr>
+          <w:rFonts w:asciiTheme="minorHAnsi" w:hAnsiTheme="minorHAnsi" w:cstheme="minorHAnsi"/>
+          <w:noProof/>
+          <w:sz w:val="20"/>
+          <w:szCs w:val="20"/>
+          <w:lang w:val="hr-HR"/>
+        </w:rPr>
+        <w:t xml:space="preserve">https://doi.org/10.1016/S1059-0560(00)00082-4</w:t>
+      </w:r>
     </w:p>
     <w:p>
       <w:pPr>
@@ -16866,7 +16886,7 @@
           <w:szCs w:val="20"/>
           <w:lang w:val="hr-HR"/>
         </w:rPr>
-        <w:t xml:space="preserve">Le, D. N. (2018). Evaluating impacts of reduction in fluctuation limit on stock price risks in Vietnam.</w:t>
+        <w:t xml:space="preserve">Le, D. N. (2012). Evaluating impacts of reduction in fluctuation limit on stock price risks in Vietnam.</w:t>
       </w:r>
       <w:r>
         <w:rPr>
@@ -16899,7 +16919,17 @@
           <w:szCs w:val="20"/>
           <w:lang w:val="hr-HR"/>
         </w:rPr>
-        <w:t xml:space="preserve">.</w:t>
+        <w:t xml:space="preserve"> </w:t>
+      </w:r>
+      <w:r>
+        <w:rPr>
+          <w:rFonts w:asciiTheme="minorHAnsi" w:hAnsiTheme="minorHAnsi" w:cstheme="minorHAnsi"/>
+          <w:noProof/>
+          <w:sz w:val="20"/>
+          <w:szCs w:val="20"/>
+          <w:lang w:val="hr-HR"/>
+        </w:rPr>
+        <w:t xml:space="preserve">(University of Economics Ho Chi Minh City), (214), 116–128.</w:t>
       </w:r>
       <w:r>
         <w:rPr>
@@ -27598,7 +27628,7 @@
                 <w:sz w:val="16"/>
                 <w:szCs w:val="16"/>
               </w:rPr>
-              <w:t xml:space="preserve">Tokyo; limit hits</w:t>
+              <w:t xml:space="preserve">Tokyo, 1989–1992; limit hits</w:t>
             </w:r>
           </w:p>
         </w:tc>
@@ -27619,7 +27649,7 @@
                 <w:sz w:val="16"/>
                 <w:szCs w:val="16"/>
               </w:rPr>
-              <w:t xml:space="preserve">Volatility spillover, delayed price discovery, and trading interference</w:t>
+              <w:t xml:space="preserve">Overnight continuation after limit hits in 65% (upper) and 49% (lower) of cases, against 50% and 32% for stocks reaching 90% of the limit; volatility spillover and trading interference</w:t>
             </w:r>
           </w:p>
         </w:tc>
@@ -27640,7 +27670,7 @@
                 <w:sz w:val="16"/>
                 <w:szCs w:val="16"/>
               </w:rPr>
-              <w:t xml:space="preserve">Ceiling next-day return consistent with delayed price discovery; spillover and interference not tested</w:t>
+              <w:t xml:space="preserve">Same direction: the overnight move is larger at the limit than near it; we measure its size, not its frequency; spillover and interference not tested</w:t>
             </w:r>
           </w:p>
         </w:tc>
@@ -27776,7 +27806,7 @@
                 <w:sz w:val="16"/>
                 <w:szCs w:val="16"/>
               </w:rPr>
-              <w:t xml:space="preserve">Taiwan; limit hits</w:t>
+              <w:t xml:space="preserve">Taiwan, 1990–1996; 7% band</w:t>
             </w:r>
           </w:p>
         </w:tc>
@@ -27797,7 +27827,7 @@
                 <w:sz w:val="16"/>
                 <w:szCs w:val="16"/>
               </w:rPr>
-              <w:t xml:space="preserve">Overnight overreaction after limit hits corrected the next day</w:t>
+              <w:t xml:space="preserve">One-day up-limit closes: +1.18% overnight, −0.77% in the next session; near-limit rises: +0.23% and −0.72%; down-limit closes: −2.17% and +1.24%</w:t>
             </w:r>
           </w:p>
         </w:tc>
@@ -27818,7 +27848,7 @@
                 <w:sz w:val="16"/>
                 <w:szCs w:val="16"/>
               </w:rPr>
-              <w:t xml:space="preserve">Same timing: positive gap, partial intraday reversal</w:t>
+              <w:t xml:space="preserve">Same timing; our ceiling gap (2.24%) is larger, and the session reverses a smaller share (24% against about two thirds)</w:t>
             </w:r>
           </w:p>
         </w:tc>
@@ -28043,7 +28073,7 @@
                 <w:sz w:val="16"/>
                 <w:szCs w:val="16"/>
               </w:rPr>
-              <w:t xml:space="preserve">ChiNext; band 10% to 20%</w:t>
+              <w:t xml:space="preserve">ChiNext, 2020–2021; band 10% to 20%</w:t>
             </w:r>
           </w:p>
         </w:tc>
@@ -28064,7 +28094,7 @@
                 <w:sz w:val="16"/>
                 <w:szCs w:val="16"/>
               </w:rPr>
-              <w:t xml:space="preserve">Delayed price discovery, spillover, and interference, stronger at the lower limit; no magnet effect</w:t>
+              <w:t xml:space="preserve">Day-1 abnormal return +0.24% after upper-limit closes and −3.37% after lower-limit closes under the 10% band; spillover and interference, stronger at the lower limit; no magnet effect</w:t>
             </w:r>
           </w:p>
         </w:tc>
@@ -28085,7 +28115,25 @@
                 <w:sz w:val="16"/>
                 <w:szCs w:val="16"/>
               </w:rPr>
-              <w:t xml:space="preserve">Different outcome (market quality); here both limit closes carry a next-day return, the floor effect depending on the benchmark</w:t>
+              <w:t xml:space="preserve">Opposite asymmetry: our day-</w:t>
+            </w:r>
+            <w:r>
+              <w:rPr>
+                <w:rFonts w:asciiTheme="minorHAnsi" w:hAnsiTheme="minorHAnsi" w:cstheme="minorHAnsi"/>
+                <w:i/>
+                <w:iCs/>
+                <w:sz w:val="16"/>
+                <w:szCs w:val="16"/>
+              </w:rPr>
+              <w:t xml:space="preserve">d</w:t>
+            </w:r>
+            <w:r>
+              <w:rPr>
+                <w:rFonts w:asciiTheme="minorHAnsi" w:hAnsiTheme="minorHAnsi" w:cstheme="minorHAnsi"/>
+                <w:sz w:val="16"/>
+                <w:szCs w:val="16"/>
+              </w:rPr>
+              <w:t xml:space="preserve">+1 return is 1.66% after ceiling and −0.71% after floor closes</w:t>
             </w:r>
           </w:p>
         </w:tc>
@@ -28646,7 +28694,7 @@
           <w:bdr w:val="nil"/>
           <w:lang w:val="hr-HR" w:eastAsia="es-MX"/>
         </w:rPr>
-        <w:t xml:space="preserve">Main published finding of each study, compared with ours by sign, timing, and mechanism.</w:t>
+        <w:t xml:space="preserve">Entries for Kim and Rhee (1997), Huang et al. (2001), and Qi (2023) report results from the full texts; the other entries summarize each study’s abstract.</w:t>
       </w:r>
     </w:p>
     <w:sectPr>

</xml_diff>

<commit_message>
Paper C MSJ: F5 wording (Huang et al. split), abnormal-terms qualifier
Co-Authored-By: Claude Opus 5.5 <noreply@anthropic.com>
Claude-Session: https://claude.ai/code/session_011zPDaCYE4jmmpoRvPu4SUX
</commit_message>
<xml_diff>
--- a/paper2/final/MSJ/Manuscript_MSJ.docx
+++ b/paper2/final/MSJ/Manuscript_MSJ.docx
@@ -1241,7 +1241,7 @@
           <w:bdr w:val="nil"/>
           <w:lang w:val="hr-HR" w:eastAsia="es-MX"/>
         </w:rPr>
-        <w:t xml:space="preserve">Studies on band changes have documented effects on volatility, liquidity, and crash risk (Jia et al., 2024; Lien et al., 2019; Qi, 2023), and account-level data have shown that large investors buy on the limit day and sell on the next (Chen et al., 2019). For Vietnam, Le (2012) evaluated how narrower bands after 2008 affected stock price risk, and Farber et al. (2006) documented clusters and sequences of limit hits in the early years of the market. In Taiwan, which also had a 7% band, Huang et al. (2001) found that one-day up-limit closes gained 1.18% overnight and gave back 0.77% in the next session. Less is known about three questions. How large are the overnight gap and the intraday reversal after a limit close relative to a benchmark? Does the limit effect remain once the many other price-based signals that a researcher could test are taken into account? How does the pattern behave around the 2025 move of the HOSE to a new trading platform?</w:t>
+        <w:t xml:space="preserve">Studies on band changes have documented effects on volatility, liquidity, and crash risk (Jia et al., 2024; Lien et al., 2019; Qi, 2023), and account-level data have shown that large investors buy on the limit day and sell on the next (Chen et al., 2019). For Vietnam, Le (2012) evaluated how narrower bands after 2008 affected stock price risk, and Farber et al. (2006) documented clusters and sequences of limit hits in the early years of the market. In Taiwan, which also had a 7% band, Huang et al. (2001) found that one-day up-limit closes gained 1.18% overnight in abnormal terms and gave back 0.77% in the next session. Less is known about three questions. How large are the overnight gap and the intraday reversal after a limit close relative to a benchmark? Does the limit effect remain once the many other price-based signals that a researcher could test are taken into account? How does the pattern behave around the 2025 move of the HOSE to a new trading platform?</w:t>
       </w:r>
     </w:p>
     <w:p>
@@ -1303,7 +1303,7 @@
           <w:bdr w:val="nil"/>
           <w:lang w:val="hr-HR" w:eastAsia="es-MX"/>
         </w:rPr>
-        <w:t xml:space="preserve">This study makes three contributions. First, we measure the overnight gap and the intraday return after limit closes, a pattern that Huang et al. (2001) describe qualitatively for Taiwan, and show that the ceiling effect is a gap of 2.2%, of which the following session reverses 24%. Second, we show that the ceiling gap is 2.7 percentage points larger than after rises of 5% to 6.5% that stop short of the limit, and that the contrast survives when the comparison stocks also close at their daily high. Third, we show that all four limit tests survive a multiplicity-controlled family in which no characteristic survives and that a buyer at the next open loses 0.7% against the market by the fifth close. We also split the events at the 2025 platform change.</w:t>
+        <w:t xml:space="preserve">This study makes three contributions. First, we measure the overnight gap and the intraday return after limit closes, a split that Huang et al. (2001) applied to Taiwan, and show that the ceiling effect is a gap of 2.2%, of which the following session reverses 24%. Second, we show that the ceiling gap is 2.7 percentage points larger than after rises of 5% to 6.5% that stop short of the limit, and that the contrast survives when the comparison stocks also close at their daily high. Third, we show that all four limit tests survive a multiplicity-controlled family in which no characteristic survives and that a buyer at the next open loses 0.7% against the market by the fifth close. We also split the events at the 2025 platform change.</w:t>
       </w:r>
     </w:p>
     <w:p>

</xml_diff>